<commit_message>
feat: add pascal bootcamp exercises 1-7
</commit_message>
<xml_diff>
--- a/docs/Pascal_Docs/Module_00_Pascal.docx
+++ b/docs/Pascal_Docs/Module_00_Pascal.docx
@@ -1396,7 +1396,7 @@
         <w:rPr>
           <w:lang w:val="es-ES"/>
         </w:rPr>
-        <w:t xml:space="preserve"> estricta de 2 o 4 espacios, sin tabuladores; uso riguroso de punto y coma (;) para delimitar sentencias; omitir estrictamente el punto y coma antes de </w:t>
+        <w:t xml:space="preserve"> estricta de 2 o 4 espacios; uso riguroso de punto y coma (;) para delimitar sentencias; omitir estrictamente el punto y coma antes de </w:t>
       </w:r>
       <w:proofErr w:type="spellStart"/>
       <w:r>
@@ -3590,7 +3590,7 @@
         <w:rPr>
           <w:lang w:val="es-ES"/>
         </w:rPr>
-        <w:t xml:space="preserve">Escribir el programa fundacional que despliega en la terminal del </w:t>
+        <w:t xml:space="preserve">Escribir tu primer programa en Pascal. El príncipe Vegeta ha activado su </w:t>
       </w:r>
       <w:proofErr w:type="spellStart"/>
       <w:r>
@@ -3604,36 +3604,15 @@
         <w:rPr>
           <w:lang w:val="es-ES"/>
         </w:rPr>
-        <w:t xml:space="preserve"> el mensaje de inicio del entrenamiento.</w:t>
-      </w:r>
-    </w:p>
-    <w:p>
-      <w:pPr>
-        <w:pStyle w:val="Sinespaciado"/>
-        <w:rPr>
-          <w:lang w:val="es-ES"/>
-        </w:rPr>
-      </w:pPr>
-    </w:p>
-    <w:p>
-      <w:pPr>
-        <w:pStyle w:val="Sinespaciado"/>
-        <w:rPr>
-          <w:lang w:val="es-ES"/>
-        </w:rPr>
-      </w:pPr>
-      <w:r>
-        <w:rPr>
-          <w:b/>
-          <w:bCs/>
-          <w:lang w:val="es-ES"/>
-        </w:rPr>
-        <w:t>Misión</w:t>
-      </w:r>
-    </w:p>
-    <w:p>
-      <w:pPr>
-        <w:pStyle w:val="Sinespaciado"/>
+        <w:t xml:space="preserve"> y necesita mostrar el mensaje que anuncia el inicio de su entrenamiento. Tu misión es imprimir exactamente el texto solicitado en la terminal.</w:t>
+      </w:r>
+    </w:p>
+    <w:p>
+      <w:pPr>
+        <w:pStyle w:val="Sinespaciado"/>
+        <w:rPr>
+          <w:lang w:val="es-ES"/>
+        </w:rPr>
       </w:pPr>
     </w:p>
     <w:p>
@@ -3652,6 +3631,30 @@
           <w:lang w:val="es-ES"/>
         </w:rPr>
         <w:t>Salida Esperada</w:t>
+      </w:r>
+    </w:p>
+    <w:p>
+      <w:pPr>
+        <w:pStyle w:val="Sinespaciado"/>
+        <w:rPr>
+          <w:b/>
+          <w:bCs/>
+          <w:lang w:val="es-ES"/>
+        </w:rPr>
+      </w:pPr>
+    </w:p>
+    <w:p>
+      <w:pPr>
+        <w:pStyle w:val="Sinespaciado"/>
+        <w:rPr>
+          <w:lang w:val="es-ES"/>
+        </w:rPr>
+      </w:pPr>
+      <w:r>
+        <w:rPr>
+          <w:lang w:val="es-ES"/>
+        </w:rPr>
+        <w:t>El programa debe mostrar el siguiente mensaje:</w:t>
       </w:r>
     </w:p>
     <w:p>
@@ -3922,6 +3925,96 @@
           <w:lang w:val="es-ES"/>
         </w:rPr>
       </w:pPr>
+      <w:r>
+        <w:rPr>
+          <w:lang w:val="es-ES"/>
+        </w:rPr>
+        <w:t xml:space="preserve">No debes solicitar datos al usuario ni realizar cálculos. Solo necesitas utilizar la instrucción </w:t>
+      </w:r>
+      <w:proofErr w:type="spellStart"/>
+      <w:r>
+        <w:rPr>
+          <w:lang w:val="es-ES"/>
+        </w:rPr>
+        <w:t>writeln</w:t>
+      </w:r>
+      <w:proofErr w:type="spellEnd"/>
+      <w:r>
+        <w:rPr>
+          <w:lang w:val="es-ES"/>
+        </w:rPr>
+        <w:t>.</w:t>
+      </w:r>
+      <w:r>
+        <w:rPr>
+          <w:lang w:val="es-ES"/>
+        </w:rPr>
+        <w:t xml:space="preserve"> </w:t>
+      </w:r>
+      <w:r>
+        <w:t xml:space="preserve">El </w:t>
+      </w:r>
+      <w:proofErr w:type="spellStart"/>
+      <w:r>
+        <w:t>programa</w:t>
+      </w:r>
+      <w:proofErr w:type="spellEnd"/>
+      <w:r>
+        <w:t xml:space="preserve"> </w:t>
+      </w:r>
+      <w:proofErr w:type="spellStart"/>
+      <w:r>
+        <w:t>debe</w:t>
+      </w:r>
+      <w:proofErr w:type="spellEnd"/>
+      <w:r>
+        <w:t xml:space="preserve"> </w:t>
+      </w:r>
+      <w:proofErr w:type="spellStart"/>
+      <w:r>
+        <w:t>compilar</w:t>
+      </w:r>
+      <w:proofErr w:type="spellEnd"/>
+      <w:r>
+        <w:t xml:space="preserve"> </w:t>
+      </w:r>
+      <w:proofErr w:type="spellStart"/>
+      <w:r>
+        <w:t>correctamente</w:t>
+      </w:r>
+      <w:proofErr w:type="spellEnd"/>
+      <w:r>
+        <w:t xml:space="preserve"> </w:t>
+      </w:r>
+      <w:proofErr w:type="spellStart"/>
+      <w:r>
+        <w:t>como</w:t>
+      </w:r>
+      <w:proofErr w:type="spellEnd"/>
+      <w:r>
+        <w:t xml:space="preserve"> un </w:t>
+      </w:r>
+      <w:proofErr w:type="spellStart"/>
+      <w:proofErr w:type="gramStart"/>
+      <w:r>
+        <w:t>archivo</w:t>
+      </w:r>
+      <w:proofErr w:type="spellEnd"/>
+      <w:r>
+        <w:t xml:space="preserve"> .pas</w:t>
+      </w:r>
+      <w:proofErr w:type="gramEnd"/>
+      <w:r>
+        <w:t>.</w:t>
+      </w:r>
+    </w:p>
+    <w:p>
+      <w:pPr>
+        <w:pStyle w:val="Sinespaciado"/>
+        <w:rPr>
+          <w:lang w:val="es-ES"/>
+        </w:rPr>
+      </w:pPr>
     </w:p>
     <w:p>
       <w:pPr>
@@ -4161,31 +4254,89 @@
         <w:rPr>
           <w:lang w:val="es-ES"/>
         </w:rPr>
-        <w:t>La cámara de gravedad inicia al nivel introducido por el usuario (entero). La meta es alcanzar los 400G de entrenamiento. El programa debe leer el nivel actual y calcular cuántos G faltan para llegar a la meta.</w:t>
-      </w:r>
-    </w:p>
-    <w:p>
-      <w:pPr>
-        <w:pStyle w:val="Sinespaciado"/>
-        <w:rPr>
-          <w:lang w:val="es-ES"/>
-        </w:rPr>
-      </w:pPr>
-    </w:p>
-    <w:p>
-      <w:pPr>
-        <w:pStyle w:val="Sinespaciado"/>
-        <w:rPr>
-          <w:lang w:val="es-ES"/>
-        </w:rPr>
-      </w:pPr>
-      <w:r>
-        <w:rPr>
-          <w:b/>
-          <w:bCs/>
-          <w:lang w:val="es-ES"/>
-        </w:rPr>
-        <w:t>Misión</w:t>
+        <w:t xml:space="preserve">La cámara de gravedad comienza en un nivel introducido por el usuario, expresado en </w:t>
+      </w:r>
+      <w:r>
+        <w:rPr>
+          <w:b/>
+          <w:bCs/>
+          <w:lang w:val="es-ES"/>
+        </w:rPr>
+        <w:t>G</w:t>
+      </w:r>
+      <w:r>
+        <w:rPr>
+          <w:lang w:val="es-ES"/>
+        </w:rPr>
+        <w:t xml:space="preserve"> como un número entero.</w:t>
+      </w:r>
+    </w:p>
+    <w:p>
+      <w:pPr>
+        <w:pStyle w:val="Sinespaciado"/>
+        <w:rPr>
+          <w:lang w:val="es-ES"/>
+        </w:rPr>
+      </w:pPr>
+    </w:p>
+    <w:p>
+      <w:pPr>
+        <w:pStyle w:val="Sinespaciado"/>
+        <w:rPr>
+          <w:lang w:val="es-ES"/>
+        </w:rPr>
+      </w:pPr>
+      <w:r>
+        <w:rPr>
+          <w:lang w:val="es-ES"/>
+        </w:rPr>
+        <w:t xml:space="preserve">El nivel máximo de entrenamiento es de </w:t>
+      </w:r>
+      <w:r>
+        <w:rPr>
+          <w:b/>
+          <w:bCs/>
+          <w:lang w:val="es-ES"/>
+        </w:rPr>
+        <w:t>400G</w:t>
+      </w:r>
+      <w:r>
+        <w:rPr>
+          <w:lang w:val="es-ES"/>
+        </w:rPr>
+        <w:t xml:space="preserve">. </w:t>
+      </w:r>
+    </w:p>
+    <w:p>
+      <w:pPr>
+        <w:pStyle w:val="Sinespaciado"/>
+        <w:rPr>
+          <w:lang w:val="es-ES"/>
+        </w:rPr>
+      </w:pPr>
+    </w:p>
+    <w:p>
+      <w:pPr>
+        <w:pStyle w:val="Sinespaciado"/>
+      </w:pPr>
+      <w:r>
+        <w:t xml:space="preserve">El </w:t>
+      </w:r>
+      <w:proofErr w:type="spellStart"/>
+      <w:r>
+        <w:t>programa</w:t>
+      </w:r>
+      <w:proofErr w:type="spellEnd"/>
+      <w:r>
+        <w:t xml:space="preserve"> </w:t>
+      </w:r>
+      <w:proofErr w:type="spellStart"/>
+      <w:r>
+        <w:t>debe</w:t>
+      </w:r>
+      <w:proofErr w:type="spellEnd"/>
+      <w:r>
+        <w:t>:</w:t>
       </w:r>
     </w:p>
     <w:p>
@@ -4193,24 +4344,86 @@
         <w:pStyle w:val="Sinespaciado"/>
         <w:numPr>
           <w:ilvl w:val="0"/>
-          <w:numId w:val="10"/>
+          <w:numId w:val="17"/>
         </w:numPr>
         <w:rPr>
-          <w:i/>
-          <w:iCs/>
-          <w:lang w:val="es-ES"/>
-        </w:rPr>
-      </w:pPr>
-      <w:r>
-        <w:rPr>
-          <w:lang w:val="es-ES"/>
-        </w:rPr>
-        <w:t xml:space="preserve">Crea </w:t>
-      </w:r>
-    </w:p>
-    <w:p>
-      <w:pPr>
-        <w:pStyle w:val="Sinespaciado"/>
+          <w:lang w:val="es-ES"/>
+        </w:rPr>
+      </w:pPr>
+      <w:r>
+        <w:rPr>
+          <w:lang w:val="es-ES"/>
+        </w:rPr>
+        <w:t xml:space="preserve">Leer el nivel actual de gravedad. </w:t>
+      </w:r>
+    </w:p>
+    <w:p>
+      <w:pPr>
+        <w:pStyle w:val="Sinespaciado"/>
+        <w:numPr>
+          <w:ilvl w:val="0"/>
+          <w:numId w:val="17"/>
+        </w:numPr>
+        <w:rPr>
+          <w:lang w:val="es-ES"/>
+        </w:rPr>
+      </w:pPr>
+      <w:r>
+        <w:rPr>
+          <w:lang w:val="es-ES"/>
+        </w:rPr>
+        <w:t xml:space="preserve">Calcular cuántos G faltan para alcanzar los 400G. </w:t>
+      </w:r>
+    </w:p>
+    <w:p>
+      <w:pPr>
+        <w:pStyle w:val="Sinespaciado"/>
+        <w:numPr>
+          <w:ilvl w:val="0"/>
+          <w:numId w:val="17"/>
+        </w:numPr>
+      </w:pPr>
+      <w:proofErr w:type="spellStart"/>
+      <w:r>
+        <w:t>Mostrar</w:t>
+      </w:r>
+      <w:proofErr w:type="spellEnd"/>
+      <w:r>
+        <w:t xml:space="preserve"> el </w:t>
+      </w:r>
+      <w:proofErr w:type="spellStart"/>
+      <w:r>
+        <w:t>nivel</w:t>
+      </w:r>
+      <w:proofErr w:type="spellEnd"/>
+      <w:r>
+        <w:t xml:space="preserve"> actual. </w:t>
+      </w:r>
+    </w:p>
+    <w:p>
+      <w:pPr>
+        <w:pStyle w:val="Sinespaciado"/>
+        <w:numPr>
+          <w:ilvl w:val="0"/>
+          <w:numId w:val="17"/>
+        </w:numPr>
+        <w:rPr>
+          <w:lang w:val="es-ES"/>
+        </w:rPr>
+      </w:pPr>
+      <w:r>
+        <w:rPr>
+          <w:lang w:val="es-ES"/>
+        </w:rPr>
+        <w:t>Mostrar cuántos G faltan para alcanzar el nivel máximo.</w:t>
+      </w:r>
+    </w:p>
+    <w:p>
+      <w:pPr>
+        <w:pStyle w:val="Sinespaciado"/>
+        <w:rPr>
+          <w:lang w:val="es-ES"/>
+        </w:rPr>
       </w:pPr>
     </w:p>
     <w:p>
@@ -4246,7 +4459,7 @@
         <mc:AlternateContent>
           <mc:Choice Requires="wps">
             <w:drawing>
-              <wp:anchor distT="0" distB="0" distL="114300" distR="114300" simplePos="0" relativeHeight="251663360" behindDoc="0" locked="0" layoutInCell="1" allowOverlap="1" wp14:anchorId="08EDEE3F" wp14:editId="0118CE2B">
+              <wp:anchor distT="0" distB="0" distL="114300" distR="114300" simplePos="0" relativeHeight="251663360" behindDoc="0" locked="0" layoutInCell="1" allowOverlap="1" wp14:anchorId="08EDEE3F" wp14:editId="5E6AE413">
                 <wp:simplePos x="0" y="0"/>
                 <wp:positionH relativeFrom="margin">
                   <wp:align>left</wp:align>
@@ -4254,8 +4467,8 @@
                 <wp:positionV relativeFrom="paragraph">
                   <wp:posOffset>111125</wp:posOffset>
                 </wp:positionV>
-                <wp:extent cx="6124575" cy="501650"/>
-                <wp:effectExtent l="0" t="0" r="28575" b="12700"/>
+                <wp:extent cx="6124575" cy="1570008"/>
+                <wp:effectExtent l="0" t="0" r="28575" b="11430"/>
                 <wp:wrapNone/>
                 <wp:docPr id="1893361091" name="Rectángulo 2"/>
                 <wp:cNvGraphicFramePr/>
@@ -4266,7 +4479,7 @@
                       <wps:spPr>
                         <a:xfrm>
                           <a:off x="0" y="0"/>
-                          <a:ext cx="6124575" cy="501650"/>
+                          <a:ext cx="6124575" cy="1570008"/>
                         </a:xfrm>
                         <a:prstGeom prst="rect">
                           <a:avLst/>
@@ -4326,6 +4539,92 @@
                               <w:t>System: You need 250G more to reach maximum training level!</w:t>
                             </w:r>
                           </w:p>
+                          <w:p>
+                            <w:pPr>
+                              <w:pStyle w:val="Sinespaciado"/>
+                              <w:rPr>
+                                <w:rFonts w:ascii="Cascadia Mono SemiBold" w:hAnsi="Cascadia Mono SemiBold" w:cs="Cascadia Mono SemiBold"/>
+                              </w:rPr>
+                            </w:pPr>
+                          </w:p>
+                          <w:p>
+                            <w:pPr>
+                              <w:pStyle w:val="Sinespaciado"/>
+                              <w:rPr>
+                                <w:rFonts w:ascii="Cascadia Mono SemiBold" w:hAnsi="Cascadia Mono SemiBold" w:cs="Cascadia Mono SemiBold"/>
+                              </w:rPr>
+                            </w:pPr>
+                            <w:r>
+                              <w:rPr>
+                                <w:rFonts w:ascii="Cascadia Mono SemiBold" w:hAnsi="Cascadia Mono SemiBold" w:cs="Cascadia Mono SemiBold"/>
+                              </w:rPr>
+                              <w:t>Current gravity (G): 100</w:t>
+                            </w:r>
+                          </w:p>
+                          <w:p>
+                            <w:pPr>
+                              <w:pStyle w:val="Sinespaciado"/>
+                              <w:rPr>
+                                <w:rFonts w:ascii="Cascadia Mono SemiBold" w:hAnsi="Cascadia Mono SemiBold" w:cs="Cascadia Mono SemiBold"/>
+                              </w:rPr>
+                            </w:pPr>
+                            <w:r>
+                              <w:rPr>
+                                <w:rFonts w:ascii="Cascadia Mono SemiBold" w:hAnsi="Cascadia Mono SemiBold" w:cs="Cascadia Mono SemiBold"/>
+                              </w:rPr>
+                              <w:t>System: You need 300G more to reach maximum training level!</w:t>
+                            </w:r>
+                          </w:p>
+                          <w:p>
+                            <w:pPr>
+                              <w:pStyle w:val="Sinespaciado"/>
+                              <w:rPr>
+                                <w:rFonts w:ascii="Cascadia Mono SemiBold" w:hAnsi="Cascadia Mono SemiBold" w:cs="Cascadia Mono SemiBold"/>
+                              </w:rPr>
+                            </w:pPr>
+                          </w:p>
+                          <w:p>
+                            <w:pPr>
+                              <w:pStyle w:val="Sinespaciado"/>
+                              <w:rPr>
+                                <w:rFonts w:ascii="Cascadia Mono SemiBold" w:hAnsi="Cascadia Mono SemiBold" w:cs="Cascadia Mono SemiBold"/>
+                              </w:rPr>
+                            </w:pPr>
+                            <w:r>
+                              <w:rPr>
+                                <w:rFonts w:ascii="Cascadia Mono SemiBold" w:hAnsi="Cascadia Mono SemiBold" w:cs="Cascadia Mono SemiBold"/>
+                              </w:rPr>
+                              <w:t>Current gravity (G): 400</w:t>
+                            </w:r>
+                          </w:p>
+                          <w:p>
+                            <w:pPr>
+                              <w:pStyle w:val="Sinespaciado"/>
+                              <w:rPr>
+                                <w:rFonts w:ascii="Cascadia Mono SemiBold" w:hAnsi="Cascadia Mono SemiBold" w:cs="Cascadia Mono SemiBold"/>
+                              </w:rPr>
+                            </w:pPr>
+                            <w:r>
+                              <w:rPr>
+                                <w:rFonts w:ascii="Cascadia Mono SemiBold" w:hAnsi="Cascadia Mono SemiBold" w:cs="Cascadia Mono SemiBold"/>
+                              </w:rPr>
+                              <w:t xml:space="preserve">System: You need </w:t>
+                            </w:r>
+                            <w:proofErr w:type="gramStart"/>
+                            <w:r>
+                              <w:rPr>
+                                <w:rFonts w:ascii="Cascadia Mono SemiBold" w:hAnsi="Cascadia Mono SemiBold" w:cs="Cascadia Mono SemiBold"/>
+                              </w:rPr>
+                              <w:t>0G more</w:t>
+                            </w:r>
+                            <w:proofErr w:type="gramEnd"/>
+                            <w:r>
+                              <w:rPr>
+                                <w:rFonts w:ascii="Cascadia Mono SemiBold" w:hAnsi="Cascadia Mono SemiBold" w:cs="Cascadia Mono SemiBold"/>
+                              </w:rPr>
+                              <w:t xml:space="preserve"> to reach maximum training level!</w:t>
+                            </w:r>
+                          </w:p>
                         </w:txbxContent>
                       </wps:txbx>
                       <wps:bodyPr rot="0" spcFirstLastPara="0" vertOverflow="overflow" horzOverflow="overflow" vert="horz" wrap="square" lIns="91440" tIns="45720" rIns="91440" bIns="45720" numCol="1" spcCol="0" rtlCol="0" fromWordArt="0" anchor="ctr" anchorCtr="0" forceAA="0" compatLnSpc="1">
@@ -4348,7 +4647,7 @@
           </mc:Choice>
           <mc:Fallback>
             <w:pict>
-              <v:rect w14:anchorId="08EDEE3F" id="_x0000_s1027" style="position:absolute;margin-left:0;margin-top:8.75pt;width:482.25pt;height:39.5pt;z-index:251663360;visibility:visible;mso-wrap-style:square;mso-width-percent:0;mso-height-percent:0;mso-wrap-distance-left:9pt;mso-wrap-distance-top:0;mso-wrap-distance-right:9pt;mso-wrap-distance-bottom:0;mso-position-horizontal:left;mso-position-horizontal-relative:margin;mso-position-vertical:absolute;mso-position-vertical-relative:text;mso-width-percent:0;mso-height-percent:0;mso-width-relative:margin;mso-height-relative:margin;v-text-anchor:middle" o:gfxdata="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" fillcolor="black [3213]" strokecolor="black [3213]" strokeweight="1pt">
+              <v:rect w14:anchorId="08EDEE3F" id="_x0000_s1027" style="position:absolute;margin-left:0;margin-top:8.75pt;width:482.25pt;height:123.6pt;z-index:251663360;visibility:visible;mso-wrap-style:square;mso-width-percent:0;mso-height-percent:0;mso-wrap-distance-left:9pt;mso-wrap-distance-top:0;mso-wrap-distance-right:9pt;mso-wrap-distance-bottom:0;mso-position-horizontal:left;mso-position-horizontal-relative:margin;mso-position-vertical:absolute;mso-position-vertical-relative:text;mso-width-percent:0;mso-height-percent:0;mso-width-relative:margin;mso-height-relative:margin;v-text-anchor:middle" o:gfxdata="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" fillcolor="black [3213]" strokecolor="black [3213]" strokeweight="1pt">
                 <v:textbox>
                   <w:txbxContent>
                     <w:p>
@@ -4379,6 +4678,92 @@
                         <w:t>System: You need 250G more to reach maximum training level!</w:t>
                       </w:r>
                     </w:p>
+                    <w:p>
+                      <w:pPr>
+                        <w:pStyle w:val="Sinespaciado"/>
+                        <w:rPr>
+                          <w:rFonts w:ascii="Cascadia Mono SemiBold" w:hAnsi="Cascadia Mono SemiBold" w:cs="Cascadia Mono SemiBold"/>
+                        </w:rPr>
+                      </w:pPr>
+                    </w:p>
+                    <w:p>
+                      <w:pPr>
+                        <w:pStyle w:val="Sinespaciado"/>
+                        <w:rPr>
+                          <w:rFonts w:ascii="Cascadia Mono SemiBold" w:hAnsi="Cascadia Mono SemiBold" w:cs="Cascadia Mono SemiBold"/>
+                        </w:rPr>
+                      </w:pPr>
+                      <w:r>
+                        <w:rPr>
+                          <w:rFonts w:ascii="Cascadia Mono SemiBold" w:hAnsi="Cascadia Mono SemiBold" w:cs="Cascadia Mono SemiBold"/>
+                        </w:rPr>
+                        <w:t>Current gravity (G): 100</w:t>
+                      </w:r>
+                    </w:p>
+                    <w:p>
+                      <w:pPr>
+                        <w:pStyle w:val="Sinespaciado"/>
+                        <w:rPr>
+                          <w:rFonts w:ascii="Cascadia Mono SemiBold" w:hAnsi="Cascadia Mono SemiBold" w:cs="Cascadia Mono SemiBold"/>
+                        </w:rPr>
+                      </w:pPr>
+                      <w:r>
+                        <w:rPr>
+                          <w:rFonts w:ascii="Cascadia Mono SemiBold" w:hAnsi="Cascadia Mono SemiBold" w:cs="Cascadia Mono SemiBold"/>
+                        </w:rPr>
+                        <w:t>System: You need 300G more to reach maximum training level!</w:t>
+                      </w:r>
+                    </w:p>
+                    <w:p>
+                      <w:pPr>
+                        <w:pStyle w:val="Sinespaciado"/>
+                        <w:rPr>
+                          <w:rFonts w:ascii="Cascadia Mono SemiBold" w:hAnsi="Cascadia Mono SemiBold" w:cs="Cascadia Mono SemiBold"/>
+                        </w:rPr>
+                      </w:pPr>
+                    </w:p>
+                    <w:p>
+                      <w:pPr>
+                        <w:pStyle w:val="Sinespaciado"/>
+                        <w:rPr>
+                          <w:rFonts w:ascii="Cascadia Mono SemiBold" w:hAnsi="Cascadia Mono SemiBold" w:cs="Cascadia Mono SemiBold"/>
+                        </w:rPr>
+                      </w:pPr>
+                      <w:r>
+                        <w:rPr>
+                          <w:rFonts w:ascii="Cascadia Mono SemiBold" w:hAnsi="Cascadia Mono SemiBold" w:cs="Cascadia Mono SemiBold"/>
+                        </w:rPr>
+                        <w:t>Current gravity (G): 400</w:t>
+                      </w:r>
+                    </w:p>
+                    <w:p>
+                      <w:pPr>
+                        <w:pStyle w:val="Sinespaciado"/>
+                        <w:rPr>
+                          <w:rFonts w:ascii="Cascadia Mono SemiBold" w:hAnsi="Cascadia Mono SemiBold" w:cs="Cascadia Mono SemiBold"/>
+                        </w:rPr>
+                      </w:pPr>
+                      <w:r>
+                        <w:rPr>
+                          <w:rFonts w:ascii="Cascadia Mono SemiBold" w:hAnsi="Cascadia Mono SemiBold" w:cs="Cascadia Mono SemiBold"/>
+                        </w:rPr>
+                        <w:t xml:space="preserve">System: You need </w:t>
+                      </w:r>
+                      <w:proofErr w:type="gramStart"/>
+                      <w:r>
+                        <w:rPr>
+                          <w:rFonts w:ascii="Cascadia Mono SemiBold" w:hAnsi="Cascadia Mono SemiBold" w:cs="Cascadia Mono SemiBold"/>
+                        </w:rPr>
+                        <w:t>0G more</w:t>
+                      </w:r>
+                      <w:proofErr w:type="gramEnd"/>
+                      <w:r>
+                        <w:rPr>
+                          <w:rFonts w:ascii="Cascadia Mono SemiBold" w:hAnsi="Cascadia Mono SemiBold" w:cs="Cascadia Mono SemiBold"/>
+                        </w:rPr>
+                        <w:t xml:space="preserve"> to reach maximum training level!</w:t>
+                      </w:r>
+                    </w:p>
                   </w:txbxContent>
                 </v:textbox>
                 <w10:wrap anchorx="margin"/>
@@ -4596,9 +4981,6 @@
     <w:p>
       <w:pPr>
         <w:pStyle w:val="Sinespaciado"/>
-        <w:rPr>
-          <w:lang w:val="es-ES"/>
-        </w:rPr>
       </w:pPr>
       <w:r>
         <w:rPr>
@@ -4757,7 +5139,7 @@
         <w:pStyle w:val="Sinespaciado"/>
         <w:numPr>
           <w:ilvl w:val="0"/>
-          <w:numId w:val="7"/>
+          <w:numId w:val="18"/>
         </w:numPr>
         <w:rPr>
           <w:lang w:val="es-ES"/>
@@ -4767,35 +5149,21 @@
         <w:rPr>
           <w:lang w:val="es-ES"/>
         </w:rPr>
-        <w:t xml:space="preserve">Crea un objeto </w:t>
-      </w:r>
-      <w:proofErr w:type="spellStart"/>
-      <w:r>
-        <w:rPr>
-          <w:lang w:val="es-ES"/>
-        </w:rPr>
-        <w:t>garden</w:t>
-      </w:r>
-      <w:proofErr w:type="spellEnd"/>
-      <w:r>
-        <w:rPr>
-          <w:lang w:val="es-ES"/>
-        </w:rPr>
-        <w:t xml:space="preserve"> con </w:t>
-      </w:r>
-      <w:proofErr w:type="spellStart"/>
-      <w:r>
-        <w:rPr>
-          <w:lang w:val="es-ES"/>
-        </w:rPr>
-        <w:t>plants</w:t>
-      </w:r>
-      <w:proofErr w:type="spellEnd"/>
-      <w:r>
-        <w:rPr>
-          <w:lang w:val="es-ES"/>
-        </w:rPr>
-        <w:t xml:space="preserve">: 10 </w:t>
+        <w:t xml:space="preserve">Declara una variable de tipo Real para el </w:t>
+      </w:r>
+      <w:proofErr w:type="spellStart"/>
+      <w:r>
+        <w:rPr>
+          <w:lang w:val="es-ES"/>
+        </w:rPr>
+        <w:t>ki</w:t>
+      </w:r>
+      <w:proofErr w:type="spellEnd"/>
+      <w:r>
+        <w:rPr>
+          <w:lang w:val="es-ES"/>
+        </w:rPr>
+        <w:t xml:space="preserve"> base. </w:t>
       </w:r>
     </w:p>
     <w:p>
@@ -4803,7 +5171,7 @@
         <w:pStyle w:val="Sinespaciado"/>
         <w:numPr>
           <w:ilvl w:val="0"/>
-          <w:numId w:val="7"/>
+          <w:numId w:val="18"/>
         </w:numPr>
         <w:rPr>
           <w:lang w:val="es-ES"/>
@@ -4813,23 +5181,21 @@
         <w:rPr>
           <w:lang w:val="es-ES"/>
         </w:rPr>
-        <w:t xml:space="preserve">Añade un método tradicional que imprima </w:t>
-      </w:r>
-      <w:proofErr w:type="spellStart"/>
-      <w:proofErr w:type="gramStart"/>
-      <w:r>
-        <w:rPr>
-          <w:lang w:val="es-ES"/>
-        </w:rPr>
-        <w:t>this.plants</w:t>
-      </w:r>
-      <w:proofErr w:type="spellEnd"/>
-      <w:proofErr w:type="gramEnd"/>
-      <w:r>
-        <w:rPr>
-          <w:lang w:val="es-ES"/>
-        </w:rPr>
-        <w:t xml:space="preserve"> </w:t>
+        <w:t xml:space="preserve">Lee el valor introducido por el usuario con </w:t>
+      </w:r>
+      <w:proofErr w:type="spellStart"/>
+      <w:r>
+        <w:rPr>
+          <w:lang w:val="es-ES"/>
+        </w:rPr>
+        <w:t>ReadLn</w:t>
+      </w:r>
+      <w:proofErr w:type="spellEnd"/>
+      <w:r>
+        <w:rPr>
+          <w:lang w:val="es-ES"/>
+        </w:rPr>
+        <w:t xml:space="preserve">. </w:t>
       </w:r>
     </w:p>
     <w:p>
@@ -4837,7 +5203,7 @@
         <w:pStyle w:val="Sinespaciado"/>
         <w:numPr>
           <w:ilvl w:val="0"/>
-          <w:numId w:val="7"/>
+          <w:numId w:val="18"/>
         </w:numPr>
         <w:rPr>
           <w:lang w:val="es-ES"/>
@@ -4847,51 +5213,35 @@
         <w:rPr>
           <w:lang w:val="es-ES"/>
         </w:rPr>
-        <w:t xml:space="preserve">Añade una </w:t>
-      </w:r>
-      <w:proofErr w:type="spellStart"/>
-      <w:r>
-        <w:rPr>
-          <w:lang w:val="es-ES"/>
-        </w:rPr>
-        <w:t>arrow</w:t>
-      </w:r>
-      <w:proofErr w:type="spellEnd"/>
-      <w:r>
-        <w:rPr>
-          <w:lang w:val="es-ES"/>
-        </w:rPr>
-        <w:t xml:space="preserve"> </w:t>
-      </w:r>
-      <w:proofErr w:type="spellStart"/>
-      <w:r>
-        <w:rPr>
-          <w:lang w:val="es-ES"/>
-        </w:rPr>
-        <w:t>function</w:t>
-      </w:r>
-      <w:proofErr w:type="spellEnd"/>
-      <w:r>
-        <w:rPr>
-          <w:lang w:val="es-ES"/>
-        </w:rPr>
-        <w:t xml:space="preserve"> que intente imprimir </w:t>
-      </w:r>
-      <w:proofErr w:type="spellStart"/>
-      <w:proofErr w:type="gramStart"/>
-      <w:r>
-        <w:rPr>
-          <w:lang w:val="es-ES"/>
-        </w:rPr>
-        <w:t>this.plants</w:t>
-      </w:r>
-      <w:proofErr w:type="spellEnd"/>
-      <w:proofErr w:type="gramEnd"/>
-      <w:r>
-        <w:rPr>
-          <w:lang w:val="es-ES"/>
-        </w:rPr>
-        <w:t xml:space="preserve"> </w:t>
+        <w:t xml:space="preserve">Calcula el </w:t>
+      </w:r>
+      <w:proofErr w:type="spellStart"/>
+      <w:r>
+        <w:rPr>
+          <w:lang w:val="es-ES"/>
+        </w:rPr>
+        <w:t>ki</w:t>
+      </w:r>
+      <w:proofErr w:type="spellEnd"/>
+      <w:r>
+        <w:rPr>
+          <w:lang w:val="es-ES"/>
+        </w:rPr>
+        <w:t xml:space="preserve"> del </w:t>
+      </w:r>
+      <w:proofErr w:type="spellStart"/>
+      <w:r>
+        <w:rPr>
+          <w:lang w:val="es-ES"/>
+        </w:rPr>
+        <w:t>Ōzaru</w:t>
+      </w:r>
+      <w:proofErr w:type="spellEnd"/>
+      <w:r>
+        <w:rPr>
+          <w:lang w:val="es-ES"/>
+        </w:rPr>
+        <w:t xml:space="preserve"> multiplicando ese valor por 10.0. </w:t>
       </w:r>
     </w:p>
     <w:p>
@@ -4899,7 +5249,7 @@
         <w:pStyle w:val="Sinespaciado"/>
         <w:numPr>
           <w:ilvl w:val="0"/>
-          <w:numId w:val="7"/>
+          <w:numId w:val="18"/>
         </w:numPr>
         <w:rPr>
           <w:lang w:val="es-ES"/>
@@ -4909,7 +5259,19 @@
         <w:rPr>
           <w:lang w:val="es-ES"/>
         </w:rPr>
-        <w:t>Demuestra la diferencia</w:t>
+        <w:t xml:space="preserve">Imprime el resultado usando el </w:t>
+      </w:r>
+      <w:r>
+        <w:rPr>
+          <w:lang w:val="es-ES"/>
+        </w:rPr>
+        <w:t>formato: 0:2</w:t>
+      </w:r>
+      <w:r>
+        <w:rPr>
+          <w:lang w:val="es-ES"/>
+        </w:rPr>
+        <w:t xml:space="preserve"> para forzar exactamente 2 decimales.</w:t>
       </w:r>
     </w:p>
     <w:p>
@@ -5459,26 +5821,139 @@
         <w:pStyle w:val="Sinespaciado"/>
         <w:numPr>
           <w:ilvl w:val="0"/>
-          <w:numId w:val="8"/>
+          <w:numId w:val="21"/>
         </w:numPr>
         <w:rPr>
-          <w:b/>
-          <w:bCs/>
-          <w:lang w:val="es-ES"/>
-        </w:rPr>
-      </w:pPr>
-      <w:r>
-        <w:rPr>
-          <w:i/>
-          <w:iCs/>
-          <w:lang w:val="es-ES"/>
-        </w:rPr>
-        <w:t xml:space="preserve">Crea </w:t>
-      </w:r>
-    </w:p>
-    <w:p>
-      <w:pPr>
-        <w:pStyle w:val="Sinespaciado"/>
+          <w:lang w:val="es-ES"/>
+        </w:rPr>
+      </w:pPr>
+      <w:r>
+        <w:rPr>
+          <w:lang w:val="es-ES"/>
+        </w:rPr>
+        <w:t xml:space="preserve">Declara una variable </w:t>
+      </w:r>
+      <w:proofErr w:type="spellStart"/>
+      <w:r>
+        <w:rPr>
+          <w:lang w:val="es-ES"/>
+        </w:rPr>
+        <w:t>Integer</w:t>
+      </w:r>
+      <w:proofErr w:type="spellEnd"/>
+      <w:r>
+        <w:rPr>
+          <w:lang w:val="es-ES"/>
+        </w:rPr>
+        <w:t xml:space="preserve"> para el total de semillas (N). </w:t>
+      </w:r>
+    </w:p>
+    <w:p>
+      <w:pPr>
+        <w:pStyle w:val="Sinespaciado"/>
+        <w:numPr>
+          <w:ilvl w:val="0"/>
+          <w:numId w:val="21"/>
+        </w:numPr>
+        <w:rPr>
+          <w:lang w:val="es-ES"/>
+        </w:rPr>
+      </w:pPr>
+      <w:r>
+        <w:rPr>
+          <w:lang w:val="es-ES"/>
+        </w:rPr>
+        <w:t xml:space="preserve">Lee el valor introducido por el usuario con </w:t>
+      </w:r>
+      <w:proofErr w:type="spellStart"/>
+      <w:r>
+        <w:rPr>
+          <w:lang w:val="es-ES"/>
+        </w:rPr>
+        <w:t>ReadLn</w:t>
+      </w:r>
+      <w:proofErr w:type="spellEnd"/>
+      <w:r>
+        <w:rPr>
+          <w:lang w:val="es-ES"/>
+        </w:rPr>
+        <w:t xml:space="preserve">. </w:t>
+      </w:r>
+    </w:p>
+    <w:p>
+      <w:pPr>
+        <w:pStyle w:val="Sinespaciado"/>
+        <w:numPr>
+          <w:ilvl w:val="0"/>
+          <w:numId w:val="21"/>
+        </w:numPr>
+        <w:rPr>
+          <w:lang w:val="es-ES"/>
+        </w:rPr>
+      </w:pPr>
+      <w:r>
+        <w:rPr>
+          <w:lang w:val="es-ES"/>
+        </w:rPr>
+        <w:t xml:space="preserve">Usa </w:t>
+      </w:r>
+      <w:proofErr w:type="spellStart"/>
+      <w:r>
+        <w:rPr>
+          <w:lang w:val="es-ES"/>
+        </w:rPr>
+        <w:t>div</w:t>
+      </w:r>
+      <w:proofErr w:type="spellEnd"/>
+      <w:r>
+        <w:rPr>
+          <w:lang w:val="es-ES"/>
+        </w:rPr>
+        <w:t xml:space="preserve"> para calcular cuántos guerreros reciben ración completa (grupos de 6). </w:t>
+      </w:r>
+    </w:p>
+    <w:p>
+      <w:pPr>
+        <w:pStyle w:val="Sinespaciado"/>
+        <w:numPr>
+          <w:ilvl w:val="0"/>
+          <w:numId w:val="21"/>
+        </w:numPr>
+        <w:rPr>
+          <w:lang w:val="es-ES"/>
+        </w:rPr>
+      </w:pPr>
+      <w:r>
+        <w:rPr>
+          <w:lang w:val="es-ES"/>
+        </w:rPr>
+        <w:t xml:space="preserve">Usa mod para calcular cuántas semillas sobran (el resto de esa división). </w:t>
+      </w:r>
+    </w:p>
+    <w:p>
+      <w:pPr>
+        <w:pStyle w:val="Sinespaciado"/>
+        <w:numPr>
+          <w:ilvl w:val="0"/>
+          <w:numId w:val="21"/>
+        </w:numPr>
+        <w:rPr>
+          <w:lang w:val="es-ES"/>
+        </w:rPr>
+      </w:pPr>
+      <w:r>
+        <w:rPr>
+          <w:lang w:val="es-ES"/>
+        </w:rPr>
+        <w:t>Imprime ambos resultados por consola.</w:t>
+      </w:r>
+    </w:p>
+    <w:p>
+      <w:pPr>
+        <w:pStyle w:val="Sinespaciado"/>
+        <w:rPr>
+          <w:lang w:val="es-ES"/>
+        </w:rPr>
       </w:pPr>
     </w:p>
     <w:p>
@@ -6005,53 +6480,11 @@
         </w:rPr>
         <w:t xml:space="preserve"> debe tomar el valor TRUE, de lo contrario FALSE. </w:t>
       </w:r>
-      <w:proofErr w:type="spellStart"/>
-      <w:r>
-        <w:t>Imprimir</w:t>
-      </w:r>
-      <w:proofErr w:type="spellEnd"/>
-      <w:r>
-        <w:t xml:space="preserve"> el valor </w:t>
-      </w:r>
-      <w:proofErr w:type="spellStart"/>
-      <w:r>
-        <w:t>booleano</w:t>
-      </w:r>
-      <w:proofErr w:type="spellEnd"/>
-      <w:r>
-        <w:t xml:space="preserve"> </w:t>
-      </w:r>
-      <w:proofErr w:type="spellStart"/>
-      <w:r>
-        <w:t>resultante</w:t>
-      </w:r>
-      <w:proofErr w:type="spellEnd"/>
-      <w:r>
-        <w:t xml:space="preserve"> </w:t>
-      </w:r>
-      <w:proofErr w:type="spellStart"/>
-      <w:r>
-        <w:t>directamente</w:t>
-      </w:r>
-      <w:proofErr w:type="spellEnd"/>
-      <w:r>
-        <w:t xml:space="preserve"> </w:t>
-      </w:r>
-      <w:proofErr w:type="spellStart"/>
-      <w:r>
-        <w:t>por</w:t>
-      </w:r>
-      <w:proofErr w:type="spellEnd"/>
-      <w:r>
-        <w:t xml:space="preserve"> </w:t>
-      </w:r>
-      <w:proofErr w:type="spellStart"/>
-      <w:r>
-        <w:t>consola</w:t>
-      </w:r>
-      <w:proofErr w:type="spellEnd"/>
-      <w:r>
-        <w:t>.</w:t>
+      <w:r>
+        <w:rPr>
+          <w:lang w:val="es-ES"/>
+        </w:rPr>
+        <w:t>Imprimir el valor booleano resultante directamente por consola.</w:t>
       </w:r>
     </w:p>
     <w:p>
@@ -6085,26 +6518,163 @@
         <w:pStyle w:val="Sinespaciado"/>
         <w:numPr>
           <w:ilvl w:val="0"/>
-          <w:numId w:val="9"/>
+          <w:numId w:val="23"/>
         </w:numPr>
         <w:rPr>
-          <w:b/>
-          <w:bCs/>
-          <w:lang w:val="es-ES"/>
-        </w:rPr>
-      </w:pPr>
-      <w:r>
-        <w:rPr>
-          <w:i/>
-          <w:iCs/>
-          <w:lang w:val="es-ES"/>
-        </w:rPr>
-        <w:t xml:space="preserve">Crea </w:t>
-      </w:r>
-    </w:p>
-    <w:p>
-      <w:pPr>
-        <w:pStyle w:val="Sinespaciado"/>
+          <w:lang w:val="es-ES"/>
+        </w:rPr>
+      </w:pPr>
+      <w:r>
+        <w:rPr>
+          <w:lang w:val="es-ES"/>
+        </w:rPr>
+        <w:t xml:space="preserve">Declara una variable </w:t>
+      </w:r>
+      <w:proofErr w:type="spellStart"/>
+      <w:r>
+        <w:rPr>
+          <w:lang w:val="es-ES"/>
+        </w:rPr>
+        <w:t>Integer</w:t>
+      </w:r>
+      <w:proofErr w:type="spellEnd"/>
+      <w:r>
+        <w:rPr>
+          <w:lang w:val="es-ES"/>
+        </w:rPr>
+        <w:t xml:space="preserve"> para el </w:t>
+      </w:r>
+      <w:proofErr w:type="spellStart"/>
+      <w:r>
+        <w:rPr>
+          <w:lang w:val="es-ES"/>
+        </w:rPr>
+        <w:t>ki</w:t>
+      </w:r>
+      <w:proofErr w:type="spellEnd"/>
+      <w:r>
+        <w:rPr>
+          <w:lang w:val="es-ES"/>
+        </w:rPr>
+        <w:t xml:space="preserve"> del enemigo. </w:t>
+      </w:r>
+    </w:p>
+    <w:p>
+      <w:pPr>
+        <w:pStyle w:val="Sinespaciado"/>
+        <w:numPr>
+          <w:ilvl w:val="0"/>
+          <w:numId w:val="23"/>
+        </w:numPr>
+        <w:rPr>
+          <w:lang w:val="es-ES"/>
+        </w:rPr>
+      </w:pPr>
+      <w:r>
+        <w:rPr>
+          <w:lang w:val="es-ES"/>
+        </w:rPr>
+        <w:t xml:space="preserve">Lee el valor introducido por el usuario con </w:t>
+      </w:r>
+      <w:proofErr w:type="spellStart"/>
+      <w:r>
+        <w:rPr>
+          <w:lang w:val="es-ES"/>
+        </w:rPr>
+        <w:t>ReadLn</w:t>
+      </w:r>
+      <w:proofErr w:type="spellEnd"/>
+      <w:r>
+        <w:rPr>
+          <w:lang w:val="es-ES"/>
+        </w:rPr>
+        <w:t xml:space="preserve">. </w:t>
+      </w:r>
+    </w:p>
+    <w:p>
+      <w:pPr>
+        <w:pStyle w:val="Sinespaciado"/>
+        <w:numPr>
+          <w:ilvl w:val="0"/>
+          <w:numId w:val="23"/>
+        </w:numPr>
+        <w:rPr>
+          <w:lang w:val="es-ES"/>
+        </w:rPr>
+      </w:pPr>
+      <w:r>
+        <w:rPr>
+          <w:lang w:val="es-ES"/>
+        </w:rPr>
+        <w:t xml:space="preserve">Declara una variable </w:t>
+      </w:r>
+      <w:proofErr w:type="spellStart"/>
+      <w:r>
+        <w:rPr>
+          <w:lang w:val="es-ES"/>
+        </w:rPr>
+        <w:t>Boolean</w:t>
+      </w:r>
+      <w:proofErr w:type="spellEnd"/>
+      <w:r>
+        <w:rPr>
+          <w:lang w:val="es-ES"/>
+        </w:rPr>
+        <w:t xml:space="preserve"> y asígnale directamente el resultado de la comparación (</w:t>
+      </w:r>
+      <w:proofErr w:type="spellStart"/>
+      <w:r>
+        <w:rPr>
+          <w:lang w:val="es-ES"/>
+        </w:rPr>
+        <w:t>ki</w:t>
+      </w:r>
+      <w:proofErr w:type="spellEnd"/>
+      <w:r>
+        <w:rPr>
+          <w:lang w:val="es-ES"/>
+        </w:rPr>
+        <w:t xml:space="preserve"> &gt; 9000). </w:t>
+      </w:r>
+    </w:p>
+    <w:p>
+      <w:pPr>
+        <w:pStyle w:val="Sinespaciado"/>
+        <w:numPr>
+          <w:ilvl w:val="0"/>
+          <w:numId w:val="23"/>
+        </w:numPr>
+        <w:rPr>
+          <w:lang w:val="es-ES"/>
+        </w:rPr>
+      </w:pPr>
+      <w:r>
+        <w:rPr>
+          <w:lang w:val="es-ES"/>
+        </w:rPr>
+        <w:t xml:space="preserve">Imprime esa variable booleana con </w:t>
+      </w:r>
+      <w:proofErr w:type="spellStart"/>
+      <w:r>
+        <w:rPr>
+          <w:lang w:val="es-ES"/>
+        </w:rPr>
+        <w:t>WriteLn</w:t>
+      </w:r>
+      <w:proofErr w:type="spellEnd"/>
+      <w:r>
+        <w:rPr>
+          <w:lang w:val="es-ES"/>
+        </w:rPr>
+        <w:t>.</w:t>
+      </w:r>
+    </w:p>
+    <w:p>
+      <w:pPr>
+        <w:pStyle w:val="Sinespaciado"/>
+        <w:rPr>
+          <w:lang w:val="es-ES"/>
+        </w:rPr>
       </w:pPr>
     </w:p>
     <w:p>
@@ -6672,18 +7242,165 @@
           <w:bCs/>
           <w:lang w:val="es-ES"/>
         </w:rPr>
-        <w:t>Misión:</w:t>
-      </w:r>
-    </w:p>
-    <w:p>
-      <w:pPr>
-        <w:pStyle w:val="Sinespaciado"/>
-        <w:rPr>
-          <w:b/>
-          <w:bCs/>
-          <w:lang w:val="es-ES"/>
-        </w:rPr>
-      </w:pPr>
+        <w:t>Misión</w:t>
+      </w:r>
+    </w:p>
+    <w:p>
+      <w:pPr>
+        <w:pStyle w:val="Sinespaciado"/>
+        <w:numPr>
+          <w:ilvl w:val="0"/>
+          <w:numId w:val="24"/>
+        </w:numPr>
+        <w:rPr>
+          <w:lang w:val="es-ES"/>
+        </w:rPr>
+      </w:pPr>
+      <w:r>
+        <w:rPr>
+          <w:lang w:val="es-ES"/>
+        </w:rPr>
+        <w:t xml:space="preserve">Declara una variable de tipo </w:t>
+      </w:r>
+      <w:proofErr w:type="spellStart"/>
+      <w:r>
+        <w:rPr>
+          <w:b/>
+          <w:bCs/>
+          <w:lang w:val="es-ES"/>
+        </w:rPr>
+        <w:t>ShortInt</w:t>
+      </w:r>
+      <w:proofErr w:type="spellEnd"/>
+      <w:r>
+        <w:rPr>
+          <w:lang w:val="es-ES"/>
+        </w:rPr>
+        <w:t>.</w:t>
+      </w:r>
+    </w:p>
+    <w:p>
+      <w:pPr>
+        <w:pStyle w:val="Sinespaciado"/>
+        <w:numPr>
+          <w:ilvl w:val="0"/>
+          <w:numId w:val="24"/>
+        </w:numPr>
+        <w:rPr>
+          <w:lang w:val="es-ES"/>
+        </w:rPr>
+      </w:pPr>
+      <w:r>
+        <w:rPr>
+          <w:lang w:val="es-ES"/>
+        </w:rPr>
+        <w:t>Asígnale el valor límite superior del tipo (127).</w:t>
+      </w:r>
+    </w:p>
+    <w:p>
+      <w:pPr>
+        <w:pStyle w:val="Sinespaciado"/>
+        <w:numPr>
+          <w:ilvl w:val="0"/>
+          <w:numId w:val="24"/>
+        </w:numPr>
+        <w:rPr>
+          <w:lang w:val="es-ES"/>
+        </w:rPr>
+      </w:pPr>
+      <w:r>
+        <w:rPr>
+          <w:lang w:val="es-ES"/>
+        </w:rPr>
+        <w:t>Súmale 1 a esa misma variable.</w:t>
+      </w:r>
+    </w:p>
+    <w:p>
+      <w:pPr>
+        <w:pStyle w:val="Sinespaciado"/>
+        <w:numPr>
+          <w:ilvl w:val="0"/>
+          <w:numId w:val="24"/>
+        </w:numPr>
+        <w:rPr>
+          <w:lang w:val="es-ES"/>
+        </w:rPr>
+      </w:pPr>
+      <w:r>
+        <w:rPr>
+          <w:lang w:val="es-ES"/>
+        </w:rPr>
+        <w:t xml:space="preserve">Imprime el resultado con </w:t>
+      </w:r>
+      <w:proofErr w:type="spellStart"/>
+      <w:r>
+        <w:rPr>
+          <w:b/>
+          <w:bCs/>
+          <w:lang w:val="es-ES"/>
+        </w:rPr>
+        <w:t>WriteLn</w:t>
+      </w:r>
+      <w:proofErr w:type="spellEnd"/>
+      <w:r>
+        <w:rPr>
+          <w:lang w:val="es-ES"/>
+        </w:rPr>
+        <w:t>.</w:t>
+      </w:r>
+    </w:p>
+    <w:p>
+      <w:pPr>
+        <w:pStyle w:val="Sinespaciado"/>
+      </w:pPr>
+    </w:p>
+    <w:p>
+      <w:pPr>
+        <w:pStyle w:val="Sinespaciado"/>
+        <w:rPr>
+          <w:lang w:val="es-ES"/>
+        </w:rPr>
+      </w:pPr>
+      <w:r>
+        <w:rPr>
+          <w:b/>
+          <w:bCs/>
+          <w:lang w:val="es-ES"/>
+        </w:rPr>
+        <w:t>Nota:</w:t>
+      </w:r>
+      <w:r>
+        <w:rPr>
+          <w:lang w:val="es-ES"/>
+        </w:rPr>
+        <w:t xml:space="preserve"> este ejercicio no lee nada del usuario (</w:t>
+      </w:r>
+      <w:proofErr w:type="spellStart"/>
+      <w:r>
+        <w:rPr>
+          <w:b/>
+          <w:bCs/>
+          <w:sz w:val="22"/>
+          <w:szCs w:val="22"/>
+          <w:lang w:val="es-ES"/>
+        </w:rPr>
+        <w:t>readln</w:t>
+      </w:r>
+      <w:proofErr w:type="spellEnd"/>
+      <w:r>
+        <w:rPr>
+          <w:sz w:val="22"/>
+          <w:szCs w:val="22"/>
+          <w:lang w:val="es-ES"/>
+        </w:rPr>
+        <w:t xml:space="preserve"> </w:t>
+      </w:r>
+      <w:r>
+        <w:rPr>
+          <w:lang w:val="es-ES"/>
+        </w:rPr>
+        <w:t>no está entre las funciones autorizadas) — todos los valores están fijos en el código.</w:t>
+      </w:r>
     </w:p>
     <w:p>
       <w:pPr>
@@ -7018,24 +7735,75 @@
     <w:p>
       <w:pPr>
         <w:rPr>
-          <w:lang w:val="es-ES"/>
-        </w:rPr>
-      </w:pPr>
-      <w:r>
-        <w:rPr>
           <w:b/>
           <w:bCs/>
           <w:i/>
           <w:iCs/>
           <w:lang w:val="es-ES"/>
         </w:rPr>
-        <w:t>Problema Curioso:</w:t>
-      </w:r>
-      <w:r>
-        <w:rPr>
-          <w:lang w:val="es-ES"/>
-        </w:rPr>
-        <w:t xml:space="preserve"> El Escudo de los Dioses (Directivas {$Q+} y {$R+})</w:t>
+      </w:pPr>
+      <w:r>
+        <w:rPr>
+          <w:b/>
+          <w:bCs/>
+          <w:i/>
+          <w:iCs/>
+          <w:lang w:val="es-ES"/>
+        </w:rPr>
+        <w:t>Problema Curioso: El Escudo de los Dioses (Directivas {$Q+} y {$R+})</w:t>
+      </w:r>
+    </w:p>
+    <w:p>
+      <w:pPr>
+        <w:rPr>
+          <w:i/>
+          <w:iCs/>
+          <w:lang w:val="es-ES"/>
+        </w:rPr>
+      </w:pPr>
+      <w:r>
+        <w:rPr>
+          <w:i/>
+          <w:iCs/>
+          <w:lang w:val="es-ES"/>
+        </w:rPr>
+        <w:t xml:space="preserve">Este es el gancho hacia el ejercicio 06: una vez veas que </w:t>
+      </w:r>
+      <w:proofErr w:type="spellStart"/>
+      <w:r>
+        <w:rPr>
+          <w:i/>
+          <w:iCs/>
+          <w:lang w:val="es-ES"/>
+        </w:rPr>
+        <w:t>ki_overflow.pas</w:t>
+      </w:r>
+      <w:proofErr w:type="spellEnd"/>
+      <w:r>
+        <w:rPr>
+          <w:i/>
+          <w:iCs/>
+          <w:lang w:val="es-ES"/>
+        </w:rPr>
+        <w:t xml:space="preserve"> imprime un valor incorrecto sin avisar de nada, la pregunta que debes hacerte es ¿cómo le digo al compilador que no permita esto silenciosamente? — la respuesta son esas dos directivas que ya vimos en la teoría ({$Q+} para </w:t>
+      </w:r>
+      <w:proofErr w:type="spellStart"/>
+      <w:r>
+        <w:rPr>
+          <w:i/>
+          <w:iCs/>
+          <w:lang w:val="es-ES"/>
+        </w:rPr>
+        <w:t>overflow</w:t>
+      </w:r>
+      <w:proofErr w:type="spellEnd"/>
+      <w:r>
+        <w:rPr>
+          <w:i/>
+          <w:iCs/>
+          <w:lang w:val="es-ES"/>
+        </w:rPr>
+        <w:t xml:space="preserve"> aritmético, {$R+} para rango), que es justo lo que trabajarás en el ejercicio 06.</w:t>
       </w:r>
     </w:p>
     <w:p>
@@ -7272,11 +8040,115 @@
         <w:rPr>
           <w:lang w:val="es-ES"/>
         </w:rPr>
-        <w:t xml:space="preserve">Aprender reduce, el método más potente de los </w:t>
-      </w:r>
-      <w:proofErr w:type="spellStart"/>
-      <w:r>
-        <w:rPr>
+        <w:t>Toma el mismo código del ex05, pero añade en la primera línea del archivo las directivas de compilación {$Q+} (</w:t>
+      </w:r>
+      <w:proofErr w:type="spellStart"/>
+      <w:r>
+        <w:rPr>
+          <w:lang w:val="es-ES"/>
+        </w:rPr>
+        <w:t>Overflow</w:t>
+      </w:r>
+      <w:proofErr w:type="spellEnd"/>
+      <w:r>
+        <w:rPr>
+          <w:lang w:val="es-ES"/>
+        </w:rPr>
+        <w:t xml:space="preserve"> </w:t>
+      </w:r>
+      <w:proofErr w:type="spellStart"/>
+      <w:r>
+        <w:rPr>
+          <w:lang w:val="es-ES"/>
+        </w:rPr>
+        <w:t>Checking</w:t>
+      </w:r>
+      <w:proofErr w:type="spellEnd"/>
+      <w:r>
+        <w:rPr>
+          <w:lang w:val="es-ES"/>
+        </w:rPr>
+        <w:t xml:space="preserve">) y {$R+} (Range </w:t>
+      </w:r>
+      <w:proofErr w:type="spellStart"/>
+      <w:r>
+        <w:rPr>
+          <w:lang w:val="es-ES"/>
+        </w:rPr>
+        <w:t>Checking</w:t>
+      </w:r>
+      <w:proofErr w:type="spellEnd"/>
+      <w:r>
+        <w:rPr>
+          <w:lang w:val="es-ES"/>
+        </w:rPr>
+        <w:t>). Compila y ejecuta el programa.</w:t>
+      </w:r>
+    </w:p>
+    <w:p>
+      <w:pPr>
+        <w:pStyle w:val="Sinespaciado"/>
+        <w:rPr>
+          <w:lang w:val="es-ES"/>
+        </w:rPr>
+      </w:pPr>
+    </w:p>
+    <w:p>
+      <w:pPr>
+        <w:pStyle w:val="Sinespaciado"/>
+        <w:rPr>
+          <w:lang w:val="es-ES"/>
+        </w:rPr>
+      </w:pPr>
+      <w:r>
+        <w:rPr>
+          <w:i/>
+          <w:iCs/>
+          <w:lang w:val="es-ES"/>
+        </w:rPr>
+        <w:t xml:space="preserve">(Nota: la parte de "aprender reduce, </w:t>
+      </w:r>
+      <w:proofErr w:type="spellStart"/>
+      <w:r>
+        <w:rPr>
+          <w:i/>
+          <w:iCs/>
+          <w:lang w:val="es-ES"/>
+        </w:rPr>
+        <w:t>map</w:t>
+      </w:r>
+      <w:proofErr w:type="spellEnd"/>
+      <w:r>
+        <w:rPr>
+          <w:i/>
+          <w:iCs/>
+          <w:lang w:val="es-ES"/>
+        </w:rPr>
+        <w:t xml:space="preserve">, </w:t>
+      </w:r>
+      <w:proofErr w:type="spellStart"/>
+      <w:r>
+        <w:rPr>
+          <w:i/>
+          <w:iCs/>
+          <w:lang w:val="es-ES"/>
+        </w:rPr>
+        <w:t>filter</w:t>
+      </w:r>
+      <w:proofErr w:type="spellEnd"/>
+      <w:r>
+        <w:rPr>
+          <w:i/>
+          <w:iCs/>
+          <w:lang w:val="es-ES"/>
+        </w:rPr>
+        <w:t>" que aparece en el enunciado que pegaste es de JavaScript/</w:t>
+      </w:r>
+      <w:proofErr w:type="spellStart"/>
+      <w:r>
+        <w:rPr>
+          <w:i/>
+          <w:iCs/>
           <w:lang w:val="es-ES"/>
         </w:rPr>
         <w:t>arrays</w:t>
@@ -7284,69 +8156,45 @@
       <w:proofErr w:type="spellEnd"/>
       <w:r>
         <w:rPr>
-          <w:lang w:val="es-ES"/>
-        </w:rPr>
-        <w:t xml:space="preserve">. Mientras </w:t>
-      </w:r>
-      <w:proofErr w:type="spellStart"/>
-      <w:r>
-        <w:rPr>
-          <w:lang w:val="es-ES"/>
-        </w:rPr>
-        <w:t>map</w:t>
-      </w:r>
-      <w:proofErr w:type="spellEnd"/>
-      <w:r>
-        <w:rPr>
-          <w:lang w:val="es-ES"/>
-        </w:rPr>
-        <w:t xml:space="preserve"> transforma y </w:t>
-      </w:r>
-      <w:proofErr w:type="spellStart"/>
-      <w:r>
-        <w:rPr>
-          <w:lang w:val="es-ES"/>
-        </w:rPr>
-        <w:t>filter</w:t>
-      </w:r>
-      <w:proofErr w:type="spellEnd"/>
-      <w:r>
-        <w:rPr>
-          <w:lang w:val="es-ES"/>
-        </w:rPr>
-        <w:t xml:space="preserve"> selecciona, reduce </w:t>
-      </w:r>
-      <w:r>
-        <w:rPr>
-          <w:b/>
-          <w:bCs/>
-          <w:lang w:val="es-ES"/>
-        </w:rPr>
-        <w:t>acumula</w:t>
-      </w:r>
-      <w:r>
-        <w:rPr>
-          <w:lang w:val="es-ES"/>
-        </w:rPr>
-        <w:t xml:space="preserve"> todos los elementos en un único valor.</w:t>
-      </w:r>
-    </w:p>
-    <w:p>
-      <w:pPr>
-        <w:pStyle w:val="Sinespaciado"/>
-        <w:rPr>
-          <w:b/>
-          <w:bCs/>
-          <w:lang w:val="es-ES"/>
-        </w:rPr>
-      </w:pPr>
-    </w:p>
-    <w:p>
-      <w:pPr>
-        <w:pStyle w:val="Sinespaciado"/>
-        <w:rPr>
-          <w:b/>
-          <w:bCs/>
+          <w:i/>
+          <w:iCs/>
+          <w:lang w:val="es-ES"/>
+        </w:rPr>
+        <w:t xml:space="preserve"> funcionales — no tiene nada que ver con este ejercicio de Pascal, ignórala. Aquí no hay </w:t>
+      </w:r>
+      <w:proofErr w:type="spellStart"/>
+      <w:r>
+        <w:rPr>
+          <w:i/>
+          <w:iCs/>
+          <w:lang w:val="es-ES"/>
+        </w:rPr>
+        <w:t>arrays</w:t>
+      </w:r>
+      <w:proofErr w:type="spellEnd"/>
+      <w:r>
+        <w:rPr>
+          <w:i/>
+          <w:iCs/>
+          <w:lang w:val="es-ES"/>
+        </w:rPr>
+        <w:t xml:space="preserve"> ni reduce, es directamente sobre directivas de compilación.)</w:t>
+      </w:r>
+    </w:p>
+    <w:p>
+      <w:pPr>
+        <w:pStyle w:val="Sinespaciado"/>
+        <w:rPr>
+          <w:b/>
+          <w:bCs/>
+          <w:lang w:val="es-ES"/>
+        </w:rPr>
+      </w:pPr>
+    </w:p>
+    <w:p>
+      <w:pPr>
+        <w:pStyle w:val="Sinespaciado"/>
+        <w:rPr>
           <w:lang w:val="es-ES"/>
         </w:rPr>
       </w:pPr>
@@ -7362,95 +8210,179 @@
         <w:rPr>
           <w:lang w:val="es-ES"/>
         </w:rPr>
-        <w:t>En el ex05, Pascal permite silenciosamente que el valor salte de 127 a -128 debido a la aritmética modular en complemento a dos. Sin embargo, en sistemas críticos (como un simulador de vuelo o una base militar), esto provoca catástrofes.</w:t>
-      </w:r>
-    </w:p>
-    <w:p>
-      <w:pPr>
-        <w:pStyle w:val="Sinespaciado"/>
-        <w:rPr>
-          <w:lang w:val="es-ES"/>
-        </w:rPr>
-      </w:pPr>
-      <w:r>
-        <w:rPr>
-          <w:b/>
-          <w:bCs/>
-          <w:lang w:val="es-ES"/>
-        </w:rPr>
-        <w:t xml:space="preserve">Objetivo: </w:t>
-      </w:r>
-      <w:r>
-        <w:rPr>
-          <w:lang w:val="es-ES"/>
-        </w:rPr>
-        <w:t>Toma el mismo código del ex05, pero añade en la primera línea del archivo la directiva de compilación {$Q+} (</w:t>
-      </w:r>
-      <w:proofErr w:type="spellStart"/>
-      <w:r>
-        <w:rPr>
-          <w:lang w:val="es-ES"/>
-        </w:rPr>
-        <w:t>Overflow</w:t>
-      </w:r>
-      <w:proofErr w:type="spellEnd"/>
-      <w:r>
-        <w:rPr>
-          <w:lang w:val="es-ES"/>
-        </w:rPr>
-        <w:t xml:space="preserve"> </w:t>
-      </w:r>
-      <w:proofErr w:type="spellStart"/>
-      <w:r>
-        <w:rPr>
-          <w:lang w:val="es-ES"/>
-        </w:rPr>
-        <w:t>Checking</w:t>
-      </w:r>
-      <w:proofErr w:type="spellEnd"/>
-      <w:r>
-        <w:rPr>
-          <w:lang w:val="es-ES"/>
-        </w:rPr>
-        <w:t xml:space="preserve">) y {$R+} (Range </w:t>
-      </w:r>
-      <w:proofErr w:type="spellStart"/>
-      <w:r>
-        <w:rPr>
-          <w:lang w:val="es-ES"/>
-        </w:rPr>
-        <w:t>Checking</w:t>
-      </w:r>
-      <w:proofErr w:type="spellEnd"/>
-      <w:r>
-        <w:rPr>
-          <w:lang w:val="es-ES"/>
-        </w:rPr>
-        <w:t>). Compila y ejecuta el programa.</w:t>
-      </w:r>
-    </w:p>
-    <w:p>
-      <w:pPr>
-        <w:pStyle w:val="Sinespaciado"/>
-        <w:rPr>
-          <w:b/>
-          <w:bCs/>
-          <w:lang w:val="es-ES"/>
-        </w:rPr>
-      </w:pPr>
-      <w:r>
-        <w:rPr>
-          <w:b/>
-          <w:bCs/>
-          <w:lang w:val="es-ES"/>
-        </w:rPr>
-        <w:t xml:space="preserve">Resultado esperado: </w:t>
-      </w:r>
-      <w:r>
-        <w:rPr>
-          <w:lang w:val="es-ES"/>
-        </w:rPr>
-        <w:t>El programa ya no imprimirá -128. El compilador inyectará código de salvaguarda y el sistema operativo abortará la ejecución con un error en tiempo de ejecución:</w:t>
+        <w:t xml:space="preserve">En el ex05, Pascal permite silenciosamente que el valor salte de 127 a -128 debido a la aritmética modular en complemento a dos. En sistemas críticos (un simulador de vuelo, una base militar), ese tipo de fallo silencioso provoca catástrofes </w:t>
+      </w:r>
+      <w:proofErr w:type="spellStart"/>
+      <w:proofErr w:type="gramStart"/>
+      <w:r>
+        <w:rPr>
+          <w:lang w:val="es-ES"/>
+        </w:rPr>
+        <w:t>reales.</w:t>
+      </w:r>
+      <w:r>
+        <w:rPr>
+          <w:lang w:val="es-ES"/>
+        </w:rPr>
+        <w:t>un</w:t>
+      </w:r>
+      <w:proofErr w:type="spellEnd"/>
+      <w:proofErr w:type="gramEnd"/>
+      <w:r>
+        <w:rPr>
+          <w:lang w:val="es-ES"/>
+        </w:rPr>
+        <w:t xml:space="preserve"> simulador de vuelo o una base militar), esto provoca catástrofes.</w:t>
+      </w:r>
+    </w:p>
+    <w:p>
+      <w:pPr>
+        <w:pStyle w:val="Sinespaciado"/>
+        <w:rPr>
+          <w:lang w:val="es-ES"/>
+        </w:rPr>
+      </w:pPr>
+    </w:p>
+    <w:p>
+      <w:pPr>
+        <w:pStyle w:val="Sinespaciado"/>
+        <w:rPr>
+          <w:b/>
+          <w:bCs/>
+          <w:lang w:val="es-ES"/>
+        </w:rPr>
+      </w:pPr>
+      <w:r>
+        <w:rPr>
+          <w:b/>
+          <w:bCs/>
+          <w:lang w:val="es-ES"/>
+        </w:rPr>
+        <w:t>Misión</w:t>
+      </w:r>
+    </w:p>
+    <w:p>
+      <w:pPr>
+        <w:pStyle w:val="Sinespaciado"/>
+        <w:numPr>
+          <w:ilvl w:val="0"/>
+          <w:numId w:val="25"/>
+        </w:numPr>
+        <w:rPr>
+          <w:lang w:val="es-ES"/>
+        </w:rPr>
+      </w:pPr>
+      <w:r>
+        <w:rPr>
+          <w:lang w:val="es-ES"/>
+        </w:rPr>
+        <w:t xml:space="preserve">Copia el código de </w:t>
+      </w:r>
+      <w:proofErr w:type="spellStart"/>
+      <w:r>
+        <w:rPr>
+          <w:lang w:val="es-ES"/>
+        </w:rPr>
+        <w:t>ki_overflow.pas</w:t>
+      </w:r>
+      <w:proofErr w:type="spellEnd"/>
+      <w:r>
+        <w:rPr>
+          <w:lang w:val="es-ES"/>
+        </w:rPr>
+        <w:t xml:space="preserve"> (ex05). </w:t>
+      </w:r>
+    </w:p>
+    <w:p>
+      <w:pPr>
+        <w:pStyle w:val="Sinespaciado"/>
+        <w:numPr>
+          <w:ilvl w:val="0"/>
+          <w:numId w:val="25"/>
+        </w:numPr>
+        <w:rPr>
+          <w:lang w:val="es-ES"/>
+        </w:rPr>
+      </w:pPr>
+      <w:r>
+        <w:rPr>
+          <w:lang w:val="es-ES"/>
+        </w:rPr>
+        <w:t>Añade {$Q</w:t>
+      </w:r>
+      <w:proofErr w:type="gramStart"/>
+      <w:r>
+        <w:rPr>
+          <w:lang w:val="es-ES"/>
+        </w:rPr>
+        <w:t>+,R</w:t>
+      </w:r>
+      <w:proofErr w:type="gramEnd"/>
+      <w:r>
+        <w:rPr>
+          <w:lang w:val="es-ES"/>
+        </w:rPr>
+        <w:t xml:space="preserve">+} como primera línea del archivo, antes de </w:t>
+      </w:r>
+      <w:proofErr w:type="spellStart"/>
+      <w:r>
+        <w:rPr>
+          <w:lang w:val="es-ES"/>
+        </w:rPr>
+        <w:t>program</w:t>
+      </w:r>
+      <w:proofErr w:type="spellEnd"/>
+      <w:r>
+        <w:rPr>
+          <w:lang w:val="es-ES"/>
+        </w:rPr>
+        <w:t xml:space="preserve"> .... </w:t>
+      </w:r>
+    </w:p>
+    <w:p>
+      <w:pPr>
+        <w:pStyle w:val="Sinespaciado"/>
+        <w:numPr>
+          <w:ilvl w:val="0"/>
+          <w:numId w:val="25"/>
+        </w:numPr>
+        <w:rPr>
+          <w:lang w:val="es-ES"/>
+        </w:rPr>
+      </w:pPr>
+      <w:r>
+        <w:rPr>
+          <w:lang w:val="es-ES"/>
+        </w:rPr>
+        <w:t xml:space="preserve">El resto del código queda exactamente igual: </w:t>
+      </w:r>
+      <w:proofErr w:type="spellStart"/>
+      <w:r>
+        <w:rPr>
+          <w:lang w:val="es-ES"/>
+        </w:rPr>
+        <w:t>ShortInt</w:t>
+      </w:r>
+      <w:proofErr w:type="spellEnd"/>
+      <w:r>
+        <w:rPr>
+          <w:lang w:val="es-ES"/>
+        </w:rPr>
+        <w:t xml:space="preserve">, asignación de 127, suma de 1, </w:t>
+      </w:r>
+      <w:proofErr w:type="spellStart"/>
+      <w:r>
+        <w:rPr>
+          <w:lang w:val="es-ES"/>
+        </w:rPr>
+        <w:t>WriteLn</w:t>
+      </w:r>
+      <w:proofErr w:type="spellEnd"/>
+      <w:r>
+        <w:rPr>
+          <w:lang w:val="es-ES"/>
+        </w:rPr>
+        <w:t>.</w:t>
       </w:r>
     </w:p>
     <w:p>
@@ -7479,6 +8411,20 @@
           <w:lang w:val="es-ES"/>
         </w:rPr>
         <w:t>Salida Esperada</w:t>
+      </w:r>
+      <w:r>
+        <w:rPr>
+          <w:b/>
+          <w:bCs/>
+          <w:lang w:val="es-ES"/>
+        </w:rPr>
+        <w:t xml:space="preserve">: </w:t>
+      </w:r>
+      <w:r>
+        <w:rPr>
+          <w:lang w:val="es-ES"/>
+        </w:rPr>
+        <w:t>El programa ya no imprime -128. El compilador inyecta código de salvaguarda y, al ejecutar, el sistema aborta con un error en tiempo de ejecución.</w:t>
       </w:r>
     </w:p>
     <w:p>
@@ -7570,7 +8516,7 @@
                                 <w:rFonts w:ascii="Cascadia Mono SemiBold" w:hAnsi="Cascadia Mono SemiBold" w:cs="Cascadia Mono SemiBold"/>
                                 <w:lang w:val="es-ES"/>
                               </w:rPr>
-                              <w:t xml:space="preserve"> error 215 at $...</w:t>
+                              <w:t xml:space="preserve"> error 215 at $00401234</w:t>
                             </w:r>
                           </w:p>
                         </w:txbxContent>
@@ -7620,7 +8566,7 @@
                           <w:rFonts w:ascii="Cascadia Mono SemiBold" w:hAnsi="Cascadia Mono SemiBold" w:cs="Cascadia Mono SemiBold"/>
                           <w:lang w:val="es-ES"/>
                         </w:rPr>
-                        <w:t xml:space="preserve"> error 215 at $...</w:t>
+                        <w:t xml:space="preserve"> error 215 at $00401234</w:t>
                       </w:r>
                     </w:p>
                   </w:txbxContent>
@@ -7656,17 +8602,88 @@
       </w:pPr>
       <w:r>
         <w:rPr>
-          <w:lang w:val="es-ES"/>
-        </w:rPr>
-        <w:t>Has activado el chequeo formal en tiempo de ejecución. Esta directiva es la herramienta que te salvará de fallos silenciosos en las pruebas automáticas de la universidad.</w:t>
-      </w:r>
-    </w:p>
-    <w:p>
-      <w:pPr>
-        <w:rPr>
-          <w:lang w:val="es-ES"/>
-        </w:rPr>
-      </w:pPr>
+          <w:b/>
+          <w:bCs/>
+          <w:lang w:val="es-ES"/>
+        </w:rPr>
+        <w:t>Concepto clave:</w:t>
+      </w:r>
+      <w:r>
+        <w:rPr>
+          <w:lang w:val="es-ES"/>
+        </w:rPr>
+        <w:t xml:space="preserve"> con las directivas activas, el programa </w:t>
+      </w:r>
+      <w:r>
+        <w:rPr>
+          <w:b/>
+          <w:bCs/>
+          <w:lang w:val="es-ES"/>
+        </w:rPr>
+        <w:t>sigue compilando sin problema</w:t>
+      </w:r>
+      <w:r>
+        <w:rPr>
+          <w:lang w:val="es-ES"/>
+        </w:rPr>
+        <w:t xml:space="preserve"> — el error no aparece hasta que se </w:t>
+      </w:r>
+      <w:r>
+        <w:rPr>
+          <w:i/>
+          <w:iCs/>
+          <w:lang w:val="es-ES"/>
+        </w:rPr>
+        <w:t>ejecuta</w:t>
+      </w:r>
+      <w:r>
+        <w:rPr>
+          <w:lang w:val="es-ES"/>
+        </w:rPr>
+        <w:t xml:space="preserve"> la línea problemática (</w:t>
+      </w:r>
+      <w:proofErr w:type="gramStart"/>
+      <w:r>
+        <w:rPr>
+          <w:lang w:val="es-ES"/>
+        </w:rPr>
+        <w:t>x :</w:t>
+      </w:r>
+      <w:proofErr w:type="gramEnd"/>
+      <w:r>
+        <w:rPr>
+          <w:lang w:val="es-ES"/>
+        </w:rPr>
+        <w:t xml:space="preserve">= x + 1). Es un error de </w:t>
+      </w:r>
+      <w:proofErr w:type="spellStart"/>
+      <w:r>
+        <w:rPr>
+          <w:lang w:val="es-ES"/>
+        </w:rPr>
+        <w:t>runtime</w:t>
+      </w:r>
+      <w:proofErr w:type="spellEnd"/>
+      <w:r>
+        <w:rPr>
+          <w:lang w:val="es-ES"/>
+        </w:rPr>
+        <w:t xml:space="preserve">, no de compilación. Esa es la diferencia que debes poder explicar si te preguntan en la </w:t>
+      </w:r>
+      <w:proofErr w:type="spellStart"/>
+      <w:r>
+        <w:rPr>
+          <w:lang w:val="es-ES"/>
+        </w:rPr>
+        <w:t>uni</w:t>
+      </w:r>
+      <w:proofErr w:type="spellEnd"/>
+      <w:r>
+        <w:rPr>
+          <w:lang w:val="es-ES"/>
+        </w:rPr>
+        <w:t>.</w:t>
+      </w:r>
     </w:p>
     <w:p>
       <w:pPr>
@@ -8019,6 +9036,202 @@
         <w:rPr>
           <w:b/>
           <w:bCs/>
+        </w:rPr>
+      </w:pPr>
+      <w:r>
+        <w:rPr>
+          <w:b/>
+          <w:bCs/>
+        </w:rPr>
+        <w:t>Misión</w:t>
+      </w:r>
+    </w:p>
+    <w:p>
+      <w:pPr>
+        <w:pStyle w:val="Sinespaciado"/>
+        <w:numPr>
+          <w:ilvl w:val="0"/>
+          <w:numId w:val="27"/>
+        </w:numPr>
+        <w:rPr>
+          <w:lang w:val="es-ES"/>
+        </w:rPr>
+      </w:pPr>
+      <w:r>
+        <w:rPr>
+          <w:lang w:val="es-ES"/>
+        </w:rPr>
+        <w:t xml:space="preserve">Declara MIN_KI y MAX_KI en la sección </w:t>
+      </w:r>
+      <w:proofErr w:type="spellStart"/>
+      <w:r>
+        <w:rPr>
+          <w:lang w:val="es-ES"/>
+        </w:rPr>
+        <w:t>const</w:t>
+      </w:r>
+      <w:proofErr w:type="spellEnd"/>
+      <w:r>
+        <w:rPr>
+          <w:lang w:val="es-ES"/>
+        </w:rPr>
+        <w:t xml:space="preserve">, antes del </w:t>
+      </w:r>
+      <w:proofErr w:type="spellStart"/>
+      <w:r>
+        <w:rPr>
+          <w:lang w:val="es-ES"/>
+        </w:rPr>
+        <w:t>var</w:t>
+      </w:r>
+      <w:proofErr w:type="spellEnd"/>
+      <w:r>
+        <w:rPr>
+          <w:lang w:val="es-ES"/>
+        </w:rPr>
+        <w:t>.</w:t>
+      </w:r>
+    </w:p>
+    <w:p>
+      <w:pPr>
+        <w:pStyle w:val="Sinespaciado"/>
+        <w:numPr>
+          <w:ilvl w:val="0"/>
+          <w:numId w:val="27"/>
+        </w:numPr>
+        <w:rPr>
+          <w:lang w:val="es-ES"/>
+        </w:rPr>
+      </w:pPr>
+      <w:r>
+        <w:rPr>
+          <w:lang w:val="es-ES"/>
+        </w:rPr>
+        <w:t xml:space="preserve">Declara una variable </w:t>
+      </w:r>
+      <w:proofErr w:type="spellStart"/>
+      <w:r>
+        <w:rPr>
+          <w:lang w:val="es-ES"/>
+        </w:rPr>
+        <w:t>Integer</w:t>
+      </w:r>
+      <w:proofErr w:type="spellEnd"/>
+      <w:r>
+        <w:rPr>
+          <w:lang w:val="es-ES"/>
+        </w:rPr>
+        <w:t xml:space="preserve"> para el </w:t>
+      </w:r>
+      <w:proofErr w:type="spellStart"/>
+      <w:r>
+        <w:rPr>
+          <w:lang w:val="es-ES"/>
+        </w:rPr>
+        <w:t>ki</w:t>
+      </w:r>
+      <w:proofErr w:type="spellEnd"/>
+      <w:r>
+        <w:rPr>
+          <w:lang w:val="es-ES"/>
+        </w:rPr>
+        <w:t xml:space="preserve"> del guerrero.</w:t>
+      </w:r>
+    </w:p>
+    <w:p>
+      <w:pPr>
+        <w:pStyle w:val="Sinespaciado"/>
+        <w:numPr>
+          <w:ilvl w:val="0"/>
+          <w:numId w:val="27"/>
+        </w:numPr>
+        <w:rPr>
+          <w:lang w:val="es-ES"/>
+        </w:rPr>
+      </w:pPr>
+      <w:r>
+        <w:rPr>
+          <w:lang w:val="es-ES"/>
+        </w:rPr>
+        <w:t xml:space="preserve">Lee el valor con </w:t>
+      </w:r>
+      <w:proofErr w:type="spellStart"/>
+      <w:r>
+        <w:rPr>
+          <w:lang w:val="es-ES"/>
+        </w:rPr>
+        <w:t>ReadLn</w:t>
+      </w:r>
+      <w:proofErr w:type="spellEnd"/>
+      <w:r>
+        <w:rPr>
+          <w:lang w:val="es-ES"/>
+        </w:rPr>
+        <w:t>.</w:t>
+      </w:r>
+    </w:p>
+    <w:p>
+      <w:pPr>
+        <w:pStyle w:val="Sinespaciado"/>
+        <w:numPr>
+          <w:ilvl w:val="0"/>
+          <w:numId w:val="27"/>
+        </w:numPr>
+        <w:rPr>
+          <w:lang w:val="es-ES"/>
+        </w:rPr>
+      </w:pPr>
+      <w:r>
+        <w:rPr>
+          <w:lang w:val="es-ES"/>
+        </w:rPr>
+        <w:t xml:space="preserve">Declara una variable </w:t>
+      </w:r>
+      <w:proofErr w:type="spellStart"/>
+      <w:r>
+        <w:rPr>
+          <w:lang w:val="es-ES"/>
+        </w:rPr>
+        <w:t>Boolean</w:t>
+      </w:r>
+      <w:proofErr w:type="spellEnd"/>
+      <w:r>
+        <w:rPr>
+          <w:lang w:val="es-ES"/>
+        </w:rPr>
+        <w:t xml:space="preserve"> y asígnale el resultado de comprobar que el </w:t>
+      </w:r>
+      <w:proofErr w:type="spellStart"/>
+      <w:r>
+        <w:rPr>
+          <w:lang w:val="es-ES"/>
+        </w:rPr>
+        <w:t>ki</w:t>
+      </w:r>
+      <w:proofErr w:type="spellEnd"/>
+      <w:r>
+        <w:rPr>
+          <w:lang w:val="es-ES"/>
+        </w:rPr>
+        <w:t xml:space="preserve"> está entre MIN_KI y MAX_KI (ambos inclusive), combinando dos comparaciones con and.</w:t>
+      </w:r>
+    </w:p>
+    <w:p>
+      <w:pPr>
+        <w:pStyle w:val="Sinespaciado"/>
+        <w:rPr>
+          <w:b/>
+          <w:bCs/>
+          <w:lang w:val="es-ES"/>
+        </w:rPr>
+      </w:pPr>
+    </w:p>
+    <w:p>
+      <w:pPr>
+        <w:pStyle w:val="Sinespaciado"/>
+        <w:rPr>
+          <w:b/>
+          <w:bCs/>
           <w:lang w:val="es-ES"/>
         </w:rPr>
       </w:pPr>
@@ -8046,7 +9259,7 @@
         <mc:AlternateContent>
           <mc:Choice Requires="wps">
             <w:drawing>
-              <wp:anchor distT="0" distB="0" distL="114300" distR="114300" simplePos="0" relativeHeight="251684864" behindDoc="0" locked="0" layoutInCell="1" allowOverlap="1" wp14:anchorId="46A20074" wp14:editId="2AFFC7B8">
+              <wp:anchor distT="0" distB="0" distL="114300" distR="114300" simplePos="0" relativeHeight="251684864" behindDoc="0" locked="0" layoutInCell="1" allowOverlap="1" wp14:anchorId="46A20074" wp14:editId="0E9711C2">
                 <wp:simplePos x="0" y="0"/>
                 <wp:positionH relativeFrom="margin">
                   <wp:align>left</wp:align>
@@ -8054,8 +9267,8 @@
                 <wp:positionV relativeFrom="paragraph">
                   <wp:posOffset>111125</wp:posOffset>
                 </wp:positionV>
-                <wp:extent cx="6124575" cy="1138686"/>
-                <wp:effectExtent l="0" t="0" r="28575" b="23495"/>
+                <wp:extent cx="6124575" cy="1104181"/>
+                <wp:effectExtent l="0" t="0" r="28575" b="20320"/>
                 <wp:wrapNone/>
                 <wp:docPr id="1820171939" name="Rectángulo 2"/>
                 <wp:cNvGraphicFramePr/>
@@ -8066,7 +9279,7 @@
                       <wps:spPr>
                         <a:xfrm>
                           <a:off x="0" y="0"/>
-                          <a:ext cx="6124575" cy="1138686"/>
+                          <a:ext cx="6124575" cy="1104181"/>
                         </a:xfrm>
                         <a:prstGeom prst="rect">
                           <a:avLst/>
@@ -8184,7 +9397,7 @@
           </mc:Choice>
           <mc:Fallback>
             <w:pict>
-              <v:rect w14:anchorId="46A20074" id="_x0000_s1033" style="position:absolute;margin-left:0;margin-top:8.75pt;width:482.25pt;height:89.65pt;z-index:251684864;visibility:visible;mso-wrap-style:square;mso-width-percent:0;mso-height-percent:0;mso-wrap-distance-left:9pt;mso-wrap-distance-top:0;mso-wrap-distance-right:9pt;mso-wrap-distance-bottom:0;mso-position-horizontal:left;mso-position-horizontal-relative:margin;mso-position-vertical:absolute;mso-position-vertical-relative:text;mso-width-percent:0;mso-height-percent:0;mso-width-relative:margin;mso-height-relative:margin;v-text-anchor:middle" o:gfxdata="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" fillcolor="black [3213]" strokecolor="black [3213]" strokeweight="1pt">
+              <v:rect w14:anchorId="46A20074" id="_x0000_s1033" style="position:absolute;margin-left:0;margin-top:8.75pt;width:482.25pt;height:86.95pt;z-index:251684864;visibility:visible;mso-wrap-style:square;mso-width-percent:0;mso-height-percent:0;mso-wrap-distance-left:9pt;mso-wrap-distance-top:0;mso-wrap-distance-right:9pt;mso-wrap-distance-bottom:0;mso-position-horizontal:left;mso-position-horizontal-relative:margin;mso-position-vertical:absolute;mso-position-vertical-relative:text;mso-width-percent:0;mso-height-percent:0;mso-width-relative:margin;mso-height-relative:margin;v-text-anchor:middle" o:gfxdata="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" fillcolor="black [3213]" strokecolor="black [3213]" strokeweight="1pt">
                 <v:textbox>
                   <w:txbxContent>
                     <w:p>
@@ -8834,6 +10047,268 @@
 <file path=word/numbering.xml><?xml version="1.0" encoding="utf-8"?>
 <w:numbering xmlns:wpc="http://schemas.microsoft.com/office/word/2010/wordprocessingCanvas" xmlns:cx="http://schemas.microsoft.com/office/drawing/2014/chartex" xmlns:cx1="http://schemas.microsoft.com/office/drawing/2015/9/8/chartex" xmlns:cx2="http://schemas.microsoft.com/office/drawing/2015/10/21/chartex" xmlns:cx3="http://schemas.microsoft.com/office/drawing/2016/5/9/chartex" xmlns:cx4="http://schemas.microsoft.com/office/drawing/2016/5/10/chartex" xmlns:cx5="http://schemas.microsoft.com/office/drawing/2016/5/11/chartex" xmlns:cx6="http://schemas.microsoft.com/office/drawing/2016/5/12/chartex" xmlns:cx7="http://schemas.microsoft.com/office/drawing/2016/5/13/chartex" xmlns:cx8="http://schemas.microsoft.com/office/drawing/2016/5/14/chartex" xmlns:mc="http://schemas.openxmlformats.org/markup-compatibility/2006" xmlns:aink="http://schemas.microsoft.com/office/drawing/2016/ink" xmlns:am3d="http://schemas.microsoft.com/office/drawing/2017/model3d" xmlns:o="urn:schemas-microsoft-com:office:office" xmlns:oel="http://schemas.microsoft.com/office/2019/extlst" xmlns:r="http://schemas.openxmlformats.org/officeDocument/2006/relationships" xmlns:m="http://schemas.openxmlformats.org/officeDocument/2006/math" xmlns:v="urn:schemas-microsoft-com:vml" xmlns:wp14="http://schemas.microsoft.com/office/word/2010/wordprocessingDrawing" xmlns:wp="http://schemas.openxmlformats.org/drawingml/2006/wordprocessingDrawing" xmlns:w10="urn:schemas-microsoft-com:office:word" xmlns:w="http://schemas.openxmlformats.org/wordprocessingml/2006/main" xmlns:w14="http://schemas.microsoft.com/office/word/2010/wordml" xmlns:w15="http://schemas.microsoft.com/office/word/2012/wordml" xmlns:w16cex="http://schemas.microsoft.com/office/word/2018/wordml/cex" xmlns:w16cid="http://schemas.microsoft.com/office/word/2016/wordml/cid" xmlns:w16="http://schemas.microsoft.com/office/word/2018/wordml" xmlns:w16du="http://schemas.microsoft.com/office/word/2023/wordml/word16du" xmlns:w16sdtdh="http://schemas.microsoft.com/office/word/2020/wordml/sdtdatahash" xmlns:w16sdtfl="http://schemas.microsoft.com/office/word/2024/wordml/sdtformatlock" xmlns:w16se="http://schemas.microsoft.com/office/word/2015/wordml/symex" xmlns:wpg="http://schemas.microsoft.com/office/word/2010/wordprocessingGroup" xmlns:wpi="http://schemas.microsoft.com/office/word/2010/wordprocessingInk" xmlns:wne="http://schemas.microsoft.com/office/word/2006/wordml" xmlns:wps="http://schemas.microsoft.com/office/word/2010/wordprocessingShape" mc:Ignorable="w14 w15 w16se w16cid w16 w16cex w16sdtdh w16sdtfl w16du wp14">
   <w:abstractNum w:abstractNumId="0" w15:restartNumberingAfterBreak="0">
+    <w:nsid w:val="004E59FC"/>
+    <w:multiLevelType w:val="hybridMultilevel"/>
+    <w:tmpl w:val="C5FABF46"/>
+    <w:lvl w:ilvl="0" w:tplc="04090005">
+      <w:start w:val="1"/>
+      <w:numFmt w:val="bullet"/>
+      <w:lvlText w:val=""/>
+      <w:lvlJc w:val="left"/>
+      <w:pPr>
+        <w:ind w:left="1080" w:hanging="360"/>
+      </w:pPr>
+      <w:rPr>
+        <w:rFonts w:ascii="Wingdings" w:hAnsi="Wingdings" w:hint="default"/>
+      </w:rPr>
+    </w:lvl>
+    <w:lvl w:ilvl="1" w:tplc="04090003" w:tentative="1">
+      <w:start w:val="1"/>
+      <w:numFmt w:val="bullet"/>
+      <w:lvlText w:val="o"/>
+      <w:lvlJc w:val="left"/>
+      <w:pPr>
+        <w:ind w:left="1800" w:hanging="360"/>
+      </w:pPr>
+      <w:rPr>
+        <w:rFonts w:ascii="Courier New" w:hAnsi="Courier New" w:cs="Courier New" w:hint="default"/>
+      </w:rPr>
+    </w:lvl>
+    <w:lvl w:ilvl="2" w:tplc="04090005" w:tentative="1">
+      <w:start w:val="1"/>
+      <w:numFmt w:val="bullet"/>
+      <w:lvlText w:val=""/>
+      <w:lvlJc w:val="left"/>
+      <w:pPr>
+        <w:ind w:left="2520" w:hanging="360"/>
+      </w:pPr>
+      <w:rPr>
+        <w:rFonts w:ascii="Wingdings" w:hAnsi="Wingdings" w:hint="default"/>
+      </w:rPr>
+    </w:lvl>
+    <w:lvl w:ilvl="3" w:tplc="04090001" w:tentative="1">
+      <w:start w:val="1"/>
+      <w:numFmt w:val="bullet"/>
+      <w:lvlText w:val=""/>
+      <w:lvlJc w:val="left"/>
+      <w:pPr>
+        <w:ind w:left="3240" w:hanging="360"/>
+      </w:pPr>
+      <w:rPr>
+        <w:rFonts w:ascii="Symbol" w:hAnsi="Symbol" w:hint="default"/>
+      </w:rPr>
+    </w:lvl>
+    <w:lvl w:ilvl="4" w:tplc="04090003" w:tentative="1">
+      <w:start w:val="1"/>
+      <w:numFmt w:val="bullet"/>
+      <w:lvlText w:val="o"/>
+      <w:lvlJc w:val="left"/>
+      <w:pPr>
+        <w:ind w:left="3960" w:hanging="360"/>
+      </w:pPr>
+      <w:rPr>
+        <w:rFonts w:ascii="Courier New" w:hAnsi="Courier New" w:cs="Courier New" w:hint="default"/>
+      </w:rPr>
+    </w:lvl>
+    <w:lvl w:ilvl="5" w:tplc="04090005" w:tentative="1">
+      <w:start w:val="1"/>
+      <w:numFmt w:val="bullet"/>
+      <w:lvlText w:val=""/>
+      <w:lvlJc w:val="left"/>
+      <w:pPr>
+        <w:ind w:left="4680" w:hanging="360"/>
+      </w:pPr>
+      <w:rPr>
+        <w:rFonts w:ascii="Wingdings" w:hAnsi="Wingdings" w:hint="default"/>
+      </w:rPr>
+    </w:lvl>
+    <w:lvl w:ilvl="6" w:tplc="04090001" w:tentative="1">
+      <w:start w:val="1"/>
+      <w:numFmt w:val="bullet"/>
+      <w:lvlText w:val=""/>
+      <w:lvlJc w:val="left"/>
+      <w:pPr>
+        <w:ind w:left="5400" w:hanging="360"/>
+      </w:pPr>
+      <w:rPr>
+        <w:rFonts w:ascii="Symbol" w:hAnsi="Symbol" w:hint="default"/>
+      </w:rPr>
+    </w:lvl>
+    <w:lvl w:ilvl="7" w:tplc="04090003" w:tentative="1">
+      <w:start w:val="1"/>
+      <w:numFmt w:val="bullet"/>
+      <w:lvlText w:val="o"/>
+      <w:lvlJc w:val="left"/>
+      <w:pPr>
+        <w:ind w:left="6120" w:hanging="360"/>
+      </w:pPr>
+      <w:rPr>
+        <w:rFonts w:ascii="Courier New" w:hAnsi="Courier New" w:cs="Courier New" w:hint="default"/>
+      </w:rPr>
+    </w:lvl>
+    <w:lvl w:ilvl="8" w:tplc="04090005" w:tentative="1">
+      <w:start w:val="1"/>
+      <w:numFmt w:val="bullet"/>
+      <w:lvlText w:val=""/>
+      <w:lvlJc w:val="left"/>
+      <w:pPr>
+        <w:ind w:left="6840" w:hanging="360"/>
+      </w:pPr>
+      <w:rPr>
+        <w:rFonts w:ascii="Wingdings" w:hAnsi="Wingdings" w:hint="default"/>
+      </w:rPr>
+    </w:lvl>
+  </w:abstractNum>
+  <w:abstractNum w:abstractNumId="1" w15:restartNumberingAfterBreak="0">
+    <w:nsid w:val="00C127AC"/>
+    <w:multiLevelType w:val="multilevel"/>
+    <w:tmpl w:val="30CEB9C2"/>
+    <w:lvl w:ilvl="0">
+      <w:start w:val="1"/>
+      <w:numFmt w:val="bullet"/>
+      <w:lvlText w:val=""/>
+      <w:lvlJc w:val="left"/>
+      <w:pPr>
+        <w:tabs>
+          <w:tab w:val="num" w:pos="720"/>
+        </w:tabs>
+        <w:ind w:left="720" w:hanging="360"/>
+      </w:pPr>
+      <w:rPr>
+        <w:rFonts w:ascii="Wingdings" w:hAnsi="Wingdings" w:hint="default"/>
+        <w:sz w:val="20"/>
+      </w:rPr>
+    </w:lvl>
+    <w:lvl w:ilvl="1" w:tentative="1">
+      <w:start w:val="1"/>
+      <w:numFmt w:val="bullet"/>
+      <w:lvlText w:val="o"/>
+      <w:lvlJc w:val="left"/>
+      <w:pPr>
+        <w:tabs>
+          <w:tab w:val="num" w:pos="1440"/>
+        </w:tabs>
+        <w:ind w:left="1440" w:hanging="360"/>
+      </w:pPr>
+      <w:rPr>
+        <w:rFonts w:ascii="Courier New" w:hAnsi="Courier New" w:hint="default"/>
+        <w:sz w:val="20"/>
+      </w:rPr>
+    </w:lvl>
+    <w:lvl w:ilvl="2" w:tentative="1">
+      <w:start w:val="1"/>
+      <w:numFmt w:val="bullet"/>
+      <w:lvlText w:val=""/>
+      <w:lvlJc w:val="left"/>
+      <w:pPr>
+        <w:tabs>
+          <w:tab w:val="num" w:pos="2160"/>
+        </w:tabs>
+        <w:ind w:left="2160" w:hanging="360"/>
+      </w:pPr>
+      <w:rPr>
+        <w:rFonts w:ascii="Wingdings" w:hAnsi="Wingdings" w:hint="default"/>
+        <w:sz w:val="20"/>
+      </w:rPr>
+    </w:lvl>
+    <w:lvl w:ilvl="3" w:tentative="1">
+      <w:start w:val="1"/>
+      <w:numFmt w:val="bullet"/>
+      <w:lvlText w:val=""/>
+      <w:lvlJc w:val="left"/>
+      <w:pPr>
+        <w:tabs>
+          <w:tab w:val="num" w:pos="2880"/>
+        </w:tabs>
+        <w:ind w:left="2880" w:hanging="360"/>
+      </w:pPr>
+      <w:rPr>
+        <w:rFonts w:ascii="Wingdings" w:hAnsi="Wingdings" w:hint="default"/>
+        <w:sz w:val="20"/>
+      </w:rPr>
+    </w:lvl>
+    <w:lvl w:ilvl="4" w:tentative="1">
+      <w:start w:val="1"/>
+      <w:numFmt w:val="bullet"/>
+      <w:lvlText w:val=""/>
+      <w:lvlJc w:val="left"/>
+      <w:pPr>
+        <w:tabs>
+          <w:tab w:val="num" w:pos="3600"/>
+        </w:tabs>
+        <w:ind w:left="3600" w:hanging="360"/>
+      </w:pPr>
+      <w:rPr>
+        <w:rFonts w:ascii="Wingdings" w:hAnsi="Wingdings" w:hint="default"/>
+        <w:sz w:val="20"/>
+      </w:rPr>
+    </w:lvl>
+    <w:lvl w:ilvl="5" w:tentative="1">
+      <w:start w:val="1"/>
+      <w:numFmt w:val="bullet"/>
+      <w:lvlText w:val=""/>
+      <w:lvlJc w:val="left"/>
+      <w:pPr>
+        <w:tabs>
+          <w:tab w:val="num" w:pos="4320"/>
+        </w:tabs>
+        <w:ind w:left="4320" w:hanging="360"/>
+      </w:pPr>
+      <w:rPr>
+        <w:rFonts w:ascii="Wingdings" w:hAnsi="Wingdings" w:hint="default"/>
+        <w:sz w:val="20"/>
+      </w:rPr>
+    </w:lvl>
+    <w:lvl w:ilvl="6" w:tentative="1">
+      <w:start w:val="1"/>
+      <w:numFmt w:val="bullet"/>
+      <w:lvlText w:val=""/>
+      <w:lvlJc w:val="left"/>
+      <w:pPr>
+        <w:tabs>
+          <w:tab w:val="num" w:pos="5040"/>
+        </w:tabs>
+        <w:ind w:left="5040" w:hanging="360"/>
+      </w:pPr>
+      <w:rPr>
+        <w:rFonts w:ascii="Wingdings" w:hAnsi="Wingdings" w:hint="default"/>
+        <w:sz w:val="20"/>
+      </w:rPr>
+    </w:lvl>
+    <w:lvl w:ilvl="7" w:tentative="1">
+      <w:start w:val="1"/>
+      <w:numFmt w:val="bullet"/>
+      <w:lvlText w:val=""/>
+      <w:lvlJc w:val="left"/>
+      <w:pPr>
+        <w:tabs>
+          <w:tab w:val="num" w:pos="5760"/>
+        </w:tabs>
+        <w:ind w:left="5760" w:hanging="360"/>
+      </w:pPr>
+      <w:rPr>
+        <w:rFonts w:ascii="Wingdings" w:hAnsi="Wingdings" w:hint="default"/>
+        <w:sz w:val="20"/>
+      </w:rPr>
+    </w:lvl>
+    <w:lvl w:ilvl="8" w:tentative="1">
+      <w:start w:val="1"/>
+      <w:numFmt w:val="bullet"/>
+      <w:lvlText w:val=""/>
+      <w:lvlJc w:val="left"/>
+      <w:pPr>
+        <w:tabs>
+          <w:tab w:val="num" w:pos="6480"/>
+        </w:tabs>
+        <w:ind w:left="6480" w:hanging="360"/>
+      </w:pPr>
+      <w:rPr>
+        <w:rFonts w:ascii="Wingdings" w:hAnsi="Wingdings" w:hint="default"/>
+        <w:sz w:val="20"/>
+      </w:rPr>
+    </w:lvl>
+  </w:abstractNum>
+  <w:abstractNum w:abstractNumId="2" w15:restartNumberingAfterBreak="0">
     <w:nsid w:val="053A3E4B"/>
     <w:multiLevelType w:val="multilevel"/>
     <w:tmpl w:val="28D844E2"/>
@@ -8982,7 +10457,269 @@
       </w:rPr>
     </w:lvl>
   </w:abstractNum>
-  <w:abstractNum w:abstractNumId="1" w15:restartNumberingAfterBreak="0">
+  <w:abstractNum w:abstractNumId="3" w15:restartNumberingAfterBreak="0">
+    <w:nsid w:val="059E3B78"/>
+    <w:multiLevelType w:val="multilevel"/>
+    <w:tmpl w:val="44329952"/>
+    <w:lvl w:ilvl="0">
+      <w:start w:val="1"/>
+      <w:numFmt w:val="bullet"/>
+      <w:lvlText w:val=""/>
+      <w:lvlJc w:val="left"/>
+      <w:pPr>
+        <w:tabs>
+          <w:tab w:val="num" w:pos="720"/>
+        </w:tabs>
+        <w:ind w:left="720" w:hanging="360"/>
+      </w:pPr>
+      <w:rPr>
+        <w:rFonts w:ascii="Symbol" w:hAnsi="Symbol" w:hint="default"/>
+        <w:sz w:val="20"/>
+      </w:rPr>
+    </w:lvl>
+    <w:lvl w:ilvl="1" w:tentative="1">
+      <w:start w:val="1"/>
+      <w:numFmt w:val="bullet"/>
+      <w:lvlText w:val="o"/>
+      <w:lvlJc w:val="left"/>
+      <w:pPr>
+        <w:tabs>
+          <w:tab w:val="num" w:pos="1440"/>
+        </w:tabs>
+        <w:ind w:left="1440" w:hanging="360"/>
+      </w:pPr>
+      <w:rPr>
+        <w:rFonts w:ascii="Courier New" w:hAnsi="Courier New" w:hint="default"/>
+        <w:sz w:val="20"/>
+      </w:rPr>
+    </w:lvl>
+    <w:lvl w:ilvl="2" w:tentative="1">
+      <w:start w:val="1"/>
+      <w:numFmt w:val="bullet"/>
+      <w:lvlText w:val=""/>
+      <w:lvlJc w:val="left"/>
+      <w:pPr>
+        <w:tabs>
+          <w:tab w:val="num" w:pos="2160"/>
+        </w:tabs>
+        <w:ind w:left="2160" w:hanging="360"/>
+      </w:pPr>
+      <w:rPr>
+        <w:rFonts w:ascii="Wingdings" w:hAnsi="Wingdings" w:hint="default"/>
+        <w:sz w:val="20"/>
+      </w:rPr>
+    </w:lvl>
+    <w:lvl w:ilvl="3" w:tentative="1">
+      <w:start w:val="1"/>
+      <w:numFmt w:val="bullet"/>
+      <w:lvlText w:val=""/>
+      <w:lvlJc w:val="left"/>
+      <w:pPr>
+        <w:tabs>
+          <w:tab w:val="num" w:pos="2880"/>
+        </w:tabs>
+        <w:ind w:left="2880" w:hanging="360"/>
+      </w:pPr>
+      <w:rPr>
+        <w:rFonts w:ascii="Wingdings" w:hAnsi="Wingdings" w:hint="default"/>
+        <w:sz w:val="20"/>
+      </w:rPr>
+    </w:lvl>
+    <w:lvl w:ilvl="4" w:tentative="1">
+      <w:start w:val="1"/>
+      <w:numFmt w:val="bullet"/>
+      <w:lvlText w:val=""/>
+      <w:lvlJc w:val="left"/>
+      <w:pPr>
+        <w:tabs>
+          <w:tab w:val="num" w:pos="3600"/>
+        </w:tabs>
+        <w:ind w:left="3600" w:hanging="360"/>
+      </w:pPr>
+      <w:rPr>
+        <w:rFonts w:ascii="Wingdings" w:hAnsi="Wingdings" w:hint="default"/>
+        <w:sz w:val="20"/>
+      </w:rPr>
+    </w:lvl>
+    <w:lvl w:ilvl="5" w:tentative="1">
+      <w:start w:val="1"/>
+      <w:numFmt w:val="bullet"/>
+      <w:lvlText w:val=""/>
+      <w:lvlJc w:val="left"/>
+      <w:pPr>
+        <w:tabs>
+          <w:tab w:val="num" w:pos="4320"/>
+        </w:tabs>
+        <w:ind w:left="4320" w:hanging="360"/>
+      </w:pPr>
+      <w:rPr>
+        <w:rFonts w:ascii="Wingdings" w:hAnsi="Wingdings" w:hint="default"/>
+        <w:sz w:val="20"/>
+      </w:rPr>
+    </w:lvl>
+    <w:lvl w:ilvl="6" w:tentative="1">
+      <w:start w:val="1"/>
+      <w:numFmt w:val="bullet"/>
+      <w:lvlText w:val=""/>
+      <w:lvlJc w:val="left"/>
+      <w:pPr>
+        <w:tabs>
+          <w:tab w:val="num" w:pos="5040"/>
+        </w:tabs>
+        <w:ind w:left="5040" w:hanging="360"/>
+      </w:pPr>
+      <w:rPr>
+        <w:rFonts w:ascii="Wingdings" w:hAnsi="Wingdings" w:hint="default"/>
+        <w:sz w:val="20"/>
+      </w:rPr>
+    </w:lvl>
+    <w:lvl w:ilvl="7" w:tentative="1">
+      <w:start w:val="1"/>
+      <w:numFmt w:val="bullet"/>
+      <w:lvlText w:val=""/>
+      <w:lvlJc w:val="left"/>
+      <w:pPr>
+        <w:tabs>
+          <w:tab w:val="num" w:pos="5760"/>
+        </w:tabs>
+        <w:ind w:left="5760" w:hanging="360"/>
+      </w:pPr>
+      <w:rPr>
+        <w:rFonts w:ascii="Wingdings" w:hAnsi="Wingdings" w:hint="default"/>
+        <w:sz w:val="20"/>
+      </w:rPr>
+    </w:lvl>
+    <w:lvl w:ilvl="8" w:tentative="1">
+      <w:start w:val="1"/>
+      <w:numFmt w:val="bullet"/>
+      <w:lvlText w:val=""/>
+      <w:lvlJc w:val="left"/>
+      <w:pPr>
+        <w:tabs>
+          <w:tab w:val="num" w:pos="6480"/>
+        </w:tabs>
+        <w:ind w:left="6480" w:hanging="360"/>
+      </w:pPr>
+      <w:rPr>
+        <w:rFonts w:ascii="Wingdings" w:hAnsi="Wingdings" w:hint="default"/>
+        <w:sz w:val="20"/>
+      </w:rPr>
+    </w:lvl>
+  </w:abstractNum>
+  <w:abstractNum w:abstractNumId="4" w15:restartNumberingAfterBreak="0">
+    <w:nsid w:val="06C60726"/>
+    <w:multiLevelType w:val="hybridMultilevel"/>
+    <w:tmpl w:val="BCF0DFC8"/>
+    <w:lvl w:ilvl="0" w:tplc="04090005">
+      <w:start w:val="1"/>
+      <w:numFmt w:val="bullet"/>
+      <w:lvlText w:val=""/>
+      <w:lvlJc w:val="left"/>
+      <w:pPr>
+        <w:ind w:left="720" w:hanging="360"/>
+      </w:pPr>
+      <w:rPr>
+        <w:rFonts w:ascii="Wingdings" w:hAnsi="Wingdings" w:hint="default"/>
+      </w:rPr>
+    </w:lvl>
+    <w:lvl w:ilvl="1" w:tplc="04090003" w:tentative="1">
+      <w:start w:val="1"/>
+      <w:numFmt w:val="bullet"/>
+      <w:lvlText w:val="o"/>
+      <w:lvlJc w:val="left"/>
+      <w:pPr>
+        <w:ind w:left="1440" w:hanging="360"/>
+      </w:pPr>
+      <w:rPr>
+        <w:rFonts w:ascii="Courier New" w:hAnsi="Courier New" w:cs="Courier New" w:hint="default"/>
+      </w:rPr>
+    </w:lvl>
+    <w:lvl w:ilvl="2" w:tplc="04090005" w:tentative="1">
+      <w:start w:val="1"/>
+      <w:numFmt w:val="bullet"/>
+      <w:lvlText w:val=""/>
+      <w:lvlJc w:val="left"/>
+      <w:pPr>
+        <w:ind w:left="2160" w:hanging="360"/>
+      </w:pPr>
+      <w:rPr>
+        <w:rFonts w:ascii="Wingdings" w:hAnsi="Wingdings" w:hint="default"/>
+      </w:rPr>
+    </w:lvl>
+    <w:lvl w:ilvl="3" w:tplc="04090001" w:tentative="1">
+      <w:start w:val="1"/>
+      <w:numFmt w:val="bullet"/>
+      <w:lvlText w:val=""/>
+      <w:lvlJc w:val="left"/>
+      <w:pPr>
+        <w:ind w:left="2880" w:hanging="360"/>
+      </w:pPr>
+      <w:rPr>
+        <w:rFonts w:ascii="Symbol" w:hAnsi="Symbol" w:hint="default"/>
+      </w:rPr>
+    </w:lvl>
+    <w:lvl w:ilvl="4" w:tplc="04090003" w:tentative="1">
+      <w:start w:val="1"/>
+      <w:numFmt w:val="bullet"/>
+      <w:lvlText w:val="o"/>
+      <w:lvlJc w:val="left"/>
+      <w:pPr>
+        <w:ind w:left="3600" w:hanging="360"/>
+      </w:pPr>
+      <w:rPr>
+        <w:rFonts w:ascii="Courier New" w:hAnsi="Courier New" w:cs="Courier New" w:hint="default"/>
+      </w:rPr>
+    </w:lvl>
+    <w:lvl w:ilvl="5" w:tplc="04090005" w:tentative="1">
+      <w:start w:val="1"/>
+      <w:numFmt w:val="bullet"/>
+      <w:lvlText w:val=""/>
+      <w:lvlJc w:val="left"/>
+      <w:pPr>
+        <w:ind w:left="4320" w:hanging="360"/>
+      </w:pPr>
+      <w:rPr>
+        <w:rFonts w:ascii="Wingdings" w:hAnsi="Wingdings" w:hint="default"/>
+      </w:rPr>
+    </w:lvl>
+    <w:lvl w:ilvl="6" w:tplc="04090001" w:tentative="1">
+      <w:start w:val="1"/>
+      <w:numFmt w:val="bullet"/>
+      <w:lvlText w:val=""/>
+      <w:lvlJc w:val="left"/>
+      <w:pPr>
+        <w:ind w:left="5040" w:hanging="360"/>
+      </w:pPr>
+      <w:rPr>
+        <w:rFonts w:ascii="Symbol" w:hAnsi="Symbol" w:hint="default"/>
+      </w:rPr>
+    </w:lvl>
+    <w:lvl w:ilvl="7" w:tplc="04090003" w:tentative="1">
+      <w:start w:val="1"/>
+      <w:numFmt w:val="bullet"/>
+      <w:lvlText w:val="o"/>
+      <w:lvlJc w:val="left"/>
+      <w:pPr>
+        <w:ind w:left="5760" w:hanging="360"/>
+      </w:pPr>
+      <w:rPr>
+        <w:rFonts w:ascii="Courier New" w:hAnsi="Courier New" w:cs="Courier New" w:hint="default"/>
+      </w:rPr>
+    </w:lvl>
+    <w:lvl w:ilvl="8" w:tplc="04090005" w:tentative="1">
+      <w:start w:val="1"/>
+      <w:numFmt w:val="bullet"/>
+      <w:lvlText w:val=""/>
+      <w:lvlJc w:val="left"/>
+      <w:pPr>
+        <w:ind w:left="6480" w:hanging="360"/>
+      </w:pPr>
+      <w:rPr>
+        <w:rFonts w:ascii="Wingdings" w:hAnsi="Wingdings" w:hint="default"/>
+      </w:rPr>
+    </w:lvl>
+  </w:abstractNum>
+  <w:abstractNum w:abstractNumId="5" w15:restartNumberingAfterBreak="0">
     <w:nsid w:val="0A312AF2"/>
     <w:multiLevelType w:val="hybridMultilevel"/>
     <w:tmpl w:val="DFAECFBA"/>
@@ -9068,7 +10805,120 @@
       </w:pPr>
     </w:lvl>
   </w:abstractNum>
-  <w:abstractNum w:abstractNumId="2" w15:restartNumberingAfterBreak="0">
+  <w:abstractNum w:abstractNumId="6" w15:restartNumberingAfterBreak="0">
+    <w:nsid w:val="0D4C52C9"/>
+    <w:multiLevelType w:val="hybridMultilevel"/>
+    <w:tmpl w:val="45D8D874"/>
+    <w:lvl w:ilvl="0" w:tplc="04090005">
+      <w:start w:val="1"/>
+      <w:numFmt w:val="bullet"/>
+      <w:lvlText w:val=""/>
+      <w:lvlJc w:val="left"/>
+      <w:pPr>
+        <w:ind w:left="720" w:hanging="360"/>
+      </w:pPr>
+      <w:rPr>
+        <w:rFonts w:ascii="Wingdings" w:hAnsi="Wingdings" w:hint="default"/>
+      </w:rPr>
+    </w:lvl>
+    <w:lvl w:ilvl="1" w:tplc="04090003" w:tentative="1">
+      <w:start w:val="1"/>
+      <w:numFmt w:val="bullet"/>
+      <w:lvlText w:val="o"/>
+      <w:lvlJc w:val="left"/>
+      <w:pPr>
+        <w:ind w:left="1440" w:hanging="360"/>
+      </w:pPr>
+      <w:rPr>
+        <w:rFonts w:ascii="Courier New" w:hAnsi="Courier New" w:cs="Courier New" w:hint="default"/>
+      </w:rPr>
+    </w:lvl>
+    <w:lvl w:ilvl="2" w:tplc="04090005" w:tentative="1">
+      <w:start w:val="1"/>
+      <w:numFmt w:val="bullet"/>
+      <w:lvlText w:val=""/>
+      <w:lvlJc w:val="left"/>
+      <w:pPr>
+        <w:ind w:left="2160" w:hanging="360"/>
+      </w:pPr>
+      <w:rPr>
+        <w:rFonts w:ascii="Wingdings" w:hAnsi="Wingdings" w:hint="default"/>
+      </w:rPr>
+    </w:lvl>
+    <w:lvl w:ilvl="3" w:tplc="04090001" w:tentative="1">
+      <w:start w:val="1"/>
+      <w:numFmt w:val="bullet"/>
+      <w:lvlText w:val=""/>
+      <w:lvlJc w:val="left"/>
+      <w:pPr>
+        <w:ind w:left="2880" w:hanging="360"/>
+      </w:pPr>
+      <w:rPr>
+        <w:rFonts w:ascii="Symbol" w:hAnsi="Symbol" w:hint="default"/>
+      </w:rPr>
+    </w:lvl>
+    <w:lvl w:ilvl="4" w:tplc="04090003" w:tentative="1">
+      <w:start w:val="1"/>
+      <w:numFmt w:val="bullet"/>
+      <w:lvlText w:val="o"/>
+      <w:lvlJc w:val="left"/>
+      <w:pPr>
+        <w:ind w:left="3600" w:hanging="360"/>
+      </w:pPr>
+      <w:rPr>
+        <w:rFonts w:ascii="Courier New" w:hAnsi="Courier New" w:cs="Courier New" w:hint="default"/>
+      </w:rPr>
+    </w:lvl>
+    <w:lvl w:ilvl="5" w:tplc="04090005" w:tentative="1">
+      <w:start w:val="1"/>
+      <w:numFmt w:val="bullet"/>
+      <w:lvlText w:val=""/>
+      <w:lvlJc w:val="left"/>
+      <w:pPr>
+        <w:ind w:left="4320" w:hanging="360"/>
+      </w:pPr>
+      <w:rPr>
+        <w:rFonts w:ascii="Wingdings" w:hAnsi="Wingdings" w:hint="default"/>
+      </w:rPr>
+    </w:lvl>
+    <w:lvl w:ilvl="6" w:tplc="04090001" w:tentative="1">
+      <w:start w:val="1"/>
+      <w:numFmt w:val="bullet"/>
+      <w:lvlText w:val=""/>
+      <w:lvlJc w:val="left"/>
+      <w:pPr>
+        <w:ind w:left="5040" w:hanging="360"/>
+      </w:pPr>
+      <w:rPr>
+        <w:rFonts w:ascii="Symbol" w:hAnsi="Symbol" w:hint="default"/>
+      </w:rPr>
+    </w:lvl>
+    <w:lvl w:ilvl="7" w:tplc="04090003" w:tentative="1">
+      <w:start w:val="1"/>
+      <w:numFmt w:val="bullet"/>
+      <w:lvlText w:val="o"/>
+      <w:lvlJc w:val="left"/>
+      <w:pPr>
+        <w:ind w:left="5760" w:hanging="360"/>
+      </w:pPr>
+      <w:rPr>
+        <w:rFonts w:ascii="Courier New" w:hAnsi="Courier New" w:cs="Courier New" w:hint="default"/>
+      </w:rPr>
+    </w:lvl>
+    <w:lvl w:ilvl="8" w:tplc="04090005" w:tentative="1">
+      <w:start w:val="1"/>
+      <w:numFmt w:val="bullet"/>
+      <w:lvlText w:val=""/>
+      <w:lvlJc w:val="left"/>
+      <w:pPr>
+        <w:ind w:left="6480" w:hanging="360"/>
+      </w:pPr>
+      <w:rPr>
+        <w:rFonts w:ascii="Wingdings" w:hAnsi="Wingdings" w:hint="default"/>
+      </w:rPr>
+    </w:lvl>
+  </w:abstractNum>
+  <w:abstractNum w:abstractNumId="7" w15:restartNumberingAfterBreak="0">
     <w:nsid w:val="14286BA4"/>
     <w:multiLevelType w:val="multilevel"/>
     <w:tmpl w:val="98EE7514"/>
@@ -9217,7 +11067,7 @@
       </w:rPr>
     </w:lvl>
   </w:abstractNum>
-  <w:abstractNum w:abstractNumId="3" w15:restartNumberingAfterBreak="0">
+  <w:abstractNum w:abstractNumId="8" w15:restartNumberingAfterBreak="0">
     <w:nsid w:val="16A90F50"/>
     <w:multiLevelType w:val="hybridMultilevel"/>
     <w:tmpl w:val="7458BF88"/>
@@ -9330,7 +11180,156 @@
       </w:rPr>
     </w:lvl>
   </w:abstractNum>
-  <w:abstractNum w:abstractNumId="4" w15:restartNumberingAfterBreak="0">
+  <w:abstractNum w:abstractNumId="9" w15:restartNumberingAfterBreak="0">
+    <w:nsid w:val="181E5F3A"/>
+    <w:multiLevelType w:val="multilevel"/>
+    <w:tmpl w:val="BC2EE6C8"/>
+    <w:lvl w:ilvl="0">
+      <w:start w:val="1"/>
+      <w:numFmt w:val="bullet"/>
+      <w:lvlText w:val=""/>
+      <w:lvlJc w:val="left"/>
+      <w:pPr>
+        <w:tabs>
+          <w:tab w:val="num" w:pos="720"/>
+        </w:tabs>
+        <w:ind w:left="720" w:hanging="360"/>
+      </w:pPr>
+      <w:rPr>
+        <w:rFonts w:ascii="Wingdings" w:hAnsi="Wingdings" w:hint="default"/>
+        <w:sz w:val="20"/>
+      </w:rPr>
+    </w:lvl>
+    <w:lvl w:ilvl="1">
+      <w:start w:val="1"/>
+      <w:numFmt w:val="bullet"/>
+      <w:lvlText w:val="o"/>
+      <w:lvlJc w:val="left"/>
+      <w:pPr>
+        <w:tabs>
+          <w:tab w:val="num" w:pos="1440"/>
+        </w:tabs>
+        <w:ind w:left="1440" w:hanging="360"/>
+      </w:pPr>
+      <w:rPr>
+        <w:rFonts w:ascii="Courier New" w:hAnsi="Courier New" w:hint="default"/>
+        <w:sz w:val="20"/>
+      </w:rPr>
+    </w:lvl>
+    <w:lvl w:ilvl="2" w:tentative="1">
+      <w:start w:val="1"/>
+      <w:numFmt w:val="bullet"/>
+      <w:lvlText w:val=""/>
+      <w:lvlJc w:val="left"/>
+      <w:pPr>
+        <w:tabs>
+          <w:tab w:val="num" w:pos="2160"/>
+        </w:tabs>
+        <w:ind w:left="2160" w:hanging="360"/>
+      </w:pPr>
+      <w:rPr>
+        <w:rFonts w:ascii="Wingdings" w:hAnsi="Wingdings" w:hint="default"/>
+        <w:sz w:val="20"/>
+      </w:rPr>
+    </w:lvl>
+    <w:lvl w:ilvl="3" w:tentative="1">
+      <w:start w:val="1"/>
+      <w:numFmt w:val="bullet"/>
+      <w:lvlText w:val=""/>
+      <w:lvlJc w:val="left"/>
+      <w:pPr>
+        <w:tabs>
+          <w:tab w:val="num" w:pos="2880"/>
+        </w:tabs>
+        <w:ind w:left="2880" w:hanging="360"/>
+      </w:pPr>
+      <w:rPr>
+        <w:rFonts w:ascii="Wingdings" w:hAnsi="Wingdings" w:hint="default"/>
+        <w:sz w:val="20"/>
+      </w:rPr>
+    </w:lvl>
+    <w:lvl w:ilvl="4" w:tentative="1">
+      <w:start w:val="1"/>
+      <w:numFmt w:val="bullet"/>
+      <w:lvlText w:val=""/>
+      <w:lvlJc w:val="left"/>
+      <w:pPr>
+        <w:tabs>
+          <w:tab w:val="num" w:pos="3600"/>
+        </w:tabs>
+        <w:ind w:left="3600" w:hanging="360"/>
+      </w:pPr>
+      <w:rPr>
+        <w:rFonts w:ascii="Wingdings" w:hAnsi="Wingdings" w:hint="default"/>
+        <w:sz w:val="20"/>
+      </w:rPr>
+    </w:lvl>
+    <w:lvl w:ilvl="5" w:tentative="1">
+      <w:start w:val="1"/>
+      <w:numFmt w:val="bullet"/>
+      <w:lvlText w:val=""/>
+      <w:lvlJc w:val="left"/>
+      <w:pPr>
+        <w:tabs>
+          <w:tab w:val="num" w:pos="4320"/>
+        </w:tabs>
+        <w:ind w:left="4320" w:hanging="360"/>
+      </w:pPr>
+      <w:rPr>
+        <w:rFonts w:ascii="Wingdings" w:hAnsi="Wingdings" w:hint="default"/>
+        <w:sz w:val="20"/>
+      </w:rPr>
+    </w:lvl>
+    <w:lvl w:ilvl="6" w:tentative="1">
+      <w:start w:val="1"/>
+      <w:numFmt w:val="bullet"/>
+      <w:lvlText w:val=""/>
+      <w:lvlJc w:val="left"/>
+      <w:pPr>
+        <w:tabs>
+          <w:tab w:val="num" w:pos="5040"/>
+        </w:tabs>
+        <w:ind w:left="5040" w:hanging="360"/>
+      </w:pPr>
+      <w:rPr>
+        <w:rFonts w:ascii="Wingdings" w:hAnsi="Wingdings" w:hint="default"/>
+        <w:sz w:val="20"/>
+      </w:rPr>
+    </w:lvl>
+    <w:lvl w:ilvl="7" w:tentative="1">
+      <w:start w:val="1"/>
+      <w:numFmt w:val="bullet"/>
+      <w:lvlText w:val=""/>
+      <w:lvlJc w:val="left"/>
+      <w:pPr>
+        <w:tabs>
+          <w:tab w:val="num" w:pos="5760"/>
+        </w:tabs>
+        <w:ind w:left="5760" w:hanging="360"/>
+      </w:pPr>
+      <w:rPr>
+        <w:rFonts w:ascii="Wingdings" w:hAnsi="Wingdings" w:hint="default"/>
+        <w:sz w:val="20"/>
+      </w:rPr>
+    </w:lvl>
+    <w:lvl w:ilvl="8" w:tentative="1">
+      <w:start w:val="1"/>
+      <w:numFmt w:val="bullet"/>
+      <w:lvlText w:val=""/>
+      <w:lvlJc w:val="left"/>
+      <w:pPr>
+        <w:tabs>
+          <w:tab w:val="num" w:pos="6480"/>
+        </w:tabs>
+        <w:ind w:left="6480" w:hanging="360"/>
+      </w:pPr>
+      <w:rPr>
+        <w:rFonts w:ascii="Wingdings" w:hAnsi="Wingdings" w:hint="default"/>
+        <w:sz w:val="20"/>
+      </w:rPr>
+    </w:lvl>
+  </w:abstractNum>
+  <w:abstractNum w:abstractNumId="10" w15:restartNumberingAfterBreak="0">
     <w:nsid w:val="22304952"/>
     <w:multiLevelType w:val="hybridMultilevel"/>
     <w:tmpl w:val="0680E0CC"/>
@@ -9416,7 +11415,7 @@
       </w:pPr>
     </w:lvl>
   </w:abstractNum>
-  <w:abstractNum w:abstractNumId="5" w15:restartNumberingAfterBreak="0">
+  <w:abstractNum w:abstractNumId="11" w15:restartNumberingAfterBreak="0">
     <w:nsid w:val="23F0778E"/>
     <w:multiLevelType w:val="multilevel"/>
     <w:tmpl w:val="19CADF64"/>
@@ -9565,7 +11564,7 @@
       </w:rPr>
     </w:lvl>
   </w:abstractNum>
-  <w:abstractNum w:abstractNumId="6" w15:restartNumberingAfterBreak="0">
+  <w:abstractNum w:abstractNumId="12" w15:restartNumberingAfterBreak="0">
     <w:nsid w:val="28C308FF"/>
     <w:multiLevelType w:val="hybridMultilevel"/>
     <w:tmpl w:val="EBF81DE8"/>
@@ -9651,7 +11650,120 @@
       </w:pPr>
     </w:lvl>
   </w:abstractNum>
-  <w:abstractNum w:abstractNumId="7" w15:restartNumberingAfterBreak="0">
+  <w:abstractNum w:abstractNumId="13" w15:restartNumberingAfterBreak="0">
+    <w:nsid w:val="34961E86"/>
+    <w:multiLevelType w:val="multilevel"/>
+    <w:tmpl w:val="8486774A"/>
+    <w:lvl w:ilvl="0">
+      <w:start w:val="1"/>
+      <w:numFmt w:val="decimal"/>
+      <w:lvlText w:val="%1."/>
+      <w:lvlJc w:val="left"/>
+      <w:pPr>
+        <w:tabs>
+          <w:tab w:val="num" w:pos="720"/>
+        </w:tabs>
+        <w:ind w:left="720" w:hanging="360"/>
+      </w:pPr>
+    </w:lvl>
+    <w:lvl w:ilvl="1" w:tentative="1">
+      <w:start w:val="1"/>
+      <w:numFmt w:val="decimal"/>
+      <w:lvlText w:val="%2."/>
+      <w:lvlJc w:val="left"/>
+      <w:pPr>
+        <w:tabs>
+          <w:tab w:val="num" w:pos="1440"/>
+        </w:tabs>
+        <w:ind w:left="1440" w:hanging="360"/>
+      </w:pPr>
+    </w:lvl>
+    <w:lvl w:ilvl="2" w:tentative="1">
+      <w:start w:val="1"/>
+      <w:numFmt w:val="decimal"/>
+      <w:lvlText w:val="%3."/>
+      <w:lvlJc w:val="left"/>
+      <w:pPr>
+        <w:tabs>
+          <w:tab w:val="num" w:pos="2160"/>
+        </w:tabs>
+        <w:ind w:left="2160" w:hanging="360"/>
+      </w:pPr>
+    </w:lvl>
+    <w:lvl w:ilvl="3" w:tentative="1">
+      <w:start w:val="1"/>
+      <w:numFmt w:val="decimal"/>
+      <w:lvlText w:val="%4."/>
+      <w:lvlJc w:val="left"/>
+      <w:pPr>
+        <w:tabs>
+          <w:tab w:val="num" w:pos="2880"/>
+        </w:tabs>
+        <w:ind w:left="2880" w:hanging="360"/>
+      </w:pPr>
+    </w:lvl>
+    <w:lvl w:ilvl="4" w:tentative="1">
+      <w:start w:val="1"/>
+      <w:numFmt w:val="decimal"/>
+      <w:lvlText w:val="%5."/>
+      <w:lvlJc w:val="left"/>
+      <w:pPr>
+        <w:tabs>
+          <w:tab w:val="num" w:pos="3600"/>
+        </w:tabs>
+        <w:ind w:left="3600" w:hanging="360"/>
+      </w:pPr>
+    </w:lvl>
+    <w:lvl w:ilvl="5" w:tentative="1">
+      <w:start w:val="1"/>
+      <w:numFmt w:val="decimal"/>
+      <w:lvlText w:val="%6."/>
+      <w:lvlJc w:val="left"/>
+      <w:pPr>
+        <w:tabs>
+          <w:tab w:val="num" w:pos="4320"/>
+        </w:tabs>
+        <w:ind w:left="4320" w:hanging="360"/>
+      </w:pPr>
+    </w:lvl>
+    <w:lvl w:ilvl="6" w:tentative="1">
+      <w:start w:val="1"/>
+      <w:numFmt w:val="decimal"/>
+      <w:lvlText w:val="%7."/>
+      <w:lvlJc w:val="left"/>
+      <w:pPr>
+        <w:tabs>
+          <w:tab w:val="num" w:pos="5040"/>
+        </w:tabs>
+        <w:ind w:left="5040" w:hanging="360"/>
+      </w:pPr>
+    </w:lvl>
+    <w:lvl w:ilvl="7" w:tentative="1">
+      <w:start w:val="1"/>
+      <w:numFmt w:val="decimal"/>
+      <w:lvlText w:val="%8."/>
+      <w:lvlJc w:val="left"/>
+      <w:pPr>
+        <w:tabs>
+          <w:tab w:val="num" w:pos="5760"/>
+        </w:tabs>
+        <w:ind w:left="5760" w:hanging="360"/>
+      </w:pPr>
+    </w:lvl>
+    <w:lvl w:ilvl="8" w:tentative="1">
+      <w:start w:val="1"/>
+      <w:numFmt w:val="decimal"/>
+      <w:lvlText w:val="%9."/>
+      <w:lvlJc w:val="left"/>
+      <w:pPr>
+        <w:tabs>
+          <w:tab w:val="num" w:pos="6480"/>
+        </w:tabs>
+        <w:ind w:left="6480" w:hanging="360"/>
+      </w:pPr>
+    </w:lvl>
+  </w:abstractNum>
+  <w:abstractNum w:abstractNumId="14" w15:restartNumberingAfterBreak="0">
     <w:nsid w:val="359965C8"/>
     <w:multiLevelType w:val="hybridMultilevel"/>
     <w:tmpl w:val="E9108B74"/>
@@ -9764,7 +11876,7 @@
       </w:rPr>
     </w:lvl>
   </w:abstractNum>
-  <w:abstractNum w:abstractNumId="8" w15:restartNumberingAfterBreak="0">
+  <w:abstractNum w:abstractNumId="15" w15:restartNumberingAfterBreak="0">
     <w:nsid w:val="370753F0"/>
     <w:multiLevelType w:val="hybridMultilevel"/>
     <w:tmpl w:val="C09E134A"/>
@@ -9850,7 +11962,7 @@
       </w:pPr>
     </w:lvl>
   </w:abstractNum>
-  <w:abstractNum w:abstractNumId="9" w15:restartNumberingAfterBreak="0">
+  <w:abstractNum w:abstractNumId="16" w15:restartNumberingAfterBreak="0">
     <w:nsid w:val="447C1A70"/>
     <w:multiLevelType w:val="hybridMultilevel"/>
     <w:tmpl w:val="F0E8A584"/>
@@ -9936,7 +12048,382 @@
       </w:pPr>
     </w:lvl>
   </w:abstractNum>
-  <w:abstractNum w:abstractNumId="10" w15:restartNumberingAfterBreak="0">
+  <w:abstractNum w:abstractNumId="17" w15:restartNumberingAfterBreak="0">
+    <w:nsid w:val="4D3F2457"/>
+    <w:multiLevelType w:val="multilevel"/>
+    <w:tmpl w:val="C6E00E98"/>
+    <w:lvl w:ilvl="0">
+      <w:start w:val="1"/>
+      <w:numFmt w:val="bullet"/>
+      <w:lvlText w:val=""/>
+      <w:lvlJc w:val="left"/>
+      <w:pPr>
+        <w:tabs>
+          <w:tab w:val="num" w:pos="720"/>
+        </w:tabs>
+        <w:ind w:left="720" w:hanging="360"/>
+      </w:pPr>
+      <w:rPr>
+        <w:rFonts w:ascii="Symbol" w:hAnsi="Symbol" w:hint="default"/>
+        <w:sz w:val="20"/>
+      </w:rPr>
+    </w:lvl>
+    <w:lvl w:ilvl="1" w:tentative="1">
+      <w:start w:val="1"/>
+      <w:numFmt w:val="bullet"/>
+      <w:lvlText w:val="o"/>
+      <w:lvlJc w:val="left"/>
+      <w:pPr>
+        <w:tabs>
+          <w:tab w:val="num" w:pos="1440"/>
+        </w:tabs>
+        <w:ind w:left="1440" w:hanging="360"/>
+      </w:pPr>
+      <w:rPr>
+        <w:rFonts w:ascii="Courier New" w:hAnsi="Courier New" w:hint="default"/>
+        <w:sz w:val="20"/>
+      </w:rPr>
+    </w:lvl>
+    <w:lvl w:ilvl="2" w:tentative="1">
+      <w:start w:val="1"/>
+      <w:numFmt w:val="bullet"/>
+      <w:lvlText w:val=""/>
+      <w:lvlJc w:val="left"/>
+      <w:pPr>
+        <w:tabs>
+          <w:tab w:val="num" w:pos="2160"/>
+        </w:tabs>
+        <w:ind w:left="2160" w:hanging="360"/>
+      </w:pPr>
+      <w:rPr>
+        <w:rFonts w:ascii="Wingdings" w:hAnsi="Wingdings" w:hint="default"/>
+        <w:sz w:val="20"/>
+      </w:rPr>
+    </w:lvl>
+    <w:lvl w:ilvl="3" w:tentative="1">
+      <w:start w:val="1"/>
+      <w:numFmt w:val="bullet"/>
+      <w:lvlText w:val=""/>
+      <w:lvlJc w:val="left"/>
+      <w:pPr>
+        <w:tabs>
+          <w:tab w:val="num" w:pos="2880"/>
+        </w:tabs>
+        <w:ind w:left="2880" w:hanging="360"/>
+      </w:pPr>
+      <w:rPr>
+        <w:rFonts w:ascii="Wingdings" w:hAnsi="Wingdings" w:hint="default"/>
+        <w:sz w:val="20"/>
+      </w:rPr>
+    </w:lvl>
+    <w:lvl w:ilvl="4" w:tentative="1">
+      <w:start w:val="1"/>
+      <w:numFmt w:val="bullet"/>
+      <w:lvlText w:val=""/>
+      <w:lvlJc w:val="left"/>
+      <w:pPr>
+        <w:tabs>
+          <w:tab w:val="num" w:pos="3600"/>
+        </w:tabs>
+        <w:ind w:left="3600" w:hanging="360"/>
+      </w:pPr>
+      <w:rPr>
+        <w:rFonts w:ascii="Wingdings" w:hAnsi="Wingdings" w:hint="default"/>
+        <w:sz w:val="20"/>
+      </w:rPr>
+    </w:lvl>
+    <w:lvl w:ilvl="5" w:tentative="1">
+      <w:start w:val="1"/>
+      <w:numFmt w:val="bullet"/>
+      <w:lvlText w:val=""/>
+      <w:lvlJc w:val="left"/>
+      <w:pPr>
+        <w:tabs>
+          <w:tab w:val="num" w:pos="4320"/>
+        </w:tabs>
+        <w:ind w:left="4320" w:hanging="360"/>
+      </w:pPr>
+      <w:rPr>
+        <w:rFonts w:ascii="Wingdings" w:hAnsi="Wingdings" w:hint="default"/>
+        <w:sz w:val="20"/>
+      </w:rPr>
+    </w:lvl>
+    <w:lvl w:ilvl="6" w:tentative="1">
+      <w:start w:val="1"/>
+      <w:numFmt w:val="bullet"/>
+      <w:lvlText w:val=""/>
+      <w:lvlJc w:val="left"/>
+      <w:pPr>
+        <w:tabs>
+          <w:tab w:val="num" w:pos="5040"/>
+        </w:tabs>
+        <w:ind w:left="5040" w:hanging="360"/>
+      </w:pPr>
+      <w:rPr>
+        <w:rFonts w:ascii="Wingdings" w:hAnsi="Wingdings" w:hint="default"/>
+        <w:sz w:val="20"/>
+      </w:rPr>
+    </w:lvl>
+    <w:lvl w:ilvl="7" w:tentative="1">
+      <w:start w:val="1"/>
+      <w:numFmt w:val="bullet"/>
+      <w:lvlText w:val=""/>
+      <w:lvlJc w:val="left"/>
+      <w:pPr>
+        <w:tabs>
+          <w:tab w:val="num" w:pos="5760"/>
+        </w:tabs>
+        <w:ind w:left="5760" w:hanging="360"/>
+      </w:pPr>
+      <w:rPr>
+        <w:rFonts w:ascii="Wingdings" w:hAnsi="Wingdings" w:hint="default"/>
+        <w:sz w:val="20"/>
+      </w:rPr>
+    </w:lvl>
+    <w:lvl w:ilvl="8" w:tentative="1">
+      <w:start w:val="1"/>
+      <w:numFmt w:val="bullet"/>
+      <w:lvlText w:val=""/>
+      <w:lvlJc w:val="left"/>
+      <w:pPr>
+        <w:tabs>
+          <w:tab w:val="num" w:pos="6480"/>
+        </w:tabs>
+        <w:ind w:left="6480" w:hanging="360"/>
+      </w:pPr>
+      <w:rPr>
+        <w:rFonts w:ascii="Wingdings" w:hAnsi="Wingdings" w:hint="default"/>
+        <w:sz w:val="20"/>
+      </w:rPr>
+    </w:lvl>
+  </w:abstractNum>
+  <w:abstractNum w:abstractNumId="18" w15:restartNumberingAfterBreak="0">
+    <w:nsid w:val="4ED62948"/>
+    <w:multiLevelType w:val="hybridMultilevel"/>
+    <w:tmpl w:val="C7709ECC"/>
+    <w:lvl w:ilvl="0" w:tplc="04090005">
+      <w:start w:val="1"/>
+      <w:numFmt w:val="bullet"/>
+      <w:lvlText w:val=""/>
+      <w:lvlJc w:val="left"/>
+      <w:pPr>
+        <w:ind w:left="720" w:hanging="360"/>
+      </w:pPr>
+      <w:rPr>
+        <w:rFonts w:ascii="Wingdings" w:hAnsi="Wingdings" w:hint="default"/>
+      </w:rPr>
+    </w:lvl>
+    <w:lvl w:ilvl="1" w:tplc="04090003" w:tentative="1">
+      <w:start w:val="1"/>
+      <w:numFmt w:val="bullet"/>
+      <w:lvlText w:val="o"/>
+      <w:lvlJc w:val="left"/>
+      <w:pPr>
+        <w:ind w:left="1440" w:hanging="360"/>
+      </w:pPr>
+      <w:rPr>
+        <w:rFonts w:ascii="Courier New" w:hAnsi="Courier New" w:cs="Courier New" w:hint="default"/>
+      </w:rPr>
+    </w:lvl>
+    <w:lvl w:ilvl="2" w:tplc="04090005" w:tentative="1">
+      <w:start w:val="1"/>
+      <w:numFmt w:val="bullet"/>
+      <w:lvlText w:val=""/>
+      <w:lvlJc w:val="left"/>
+      <w:pPr>
+        <w:ind w:left="2160" w:hanging="360"/>
+      </w:pPr>
+      <w:rPr>
+        <w:rFonts w:ascii="Wingdings" w:hAnsi="Wingdings" w:hint="default"/>
+      </w:rPr>
+    </w:lvl>
+    <w:lvl w:ilvl="3" w:tplc="04090001" w:tentative="1">
+      <w:start w:val="1"/>
+      <w:numFmt w:val="bullet"/>
+      <w:lvlText w:val=""/>
+      <w:lvlJc w:val="left"/>
+      <w:pPr>
+        <w:ind w:left="2880" w:hanging="360"/>
+      </w:pPr>
+      <w:rPr>
+        <w:rFonts w:ascii="Symbol" w:hAnsi="Symbol" w:hint="default"/>
+      </w:rPr>
+    </w:lvl>
+    <w:lvl w:ilvl="4" w:tplc="04090003" w:tentative="1">
+      <w:start w:val="1"/>
+      <w:numFmt w:val="bullet"/>
+      <w:lvlText w:val="o"/>
+      <w:lvlJc w:val="left"/>
+      <w:pPr>
+        <w:ind w:left="3600" w:hanging="360"/>
+      </w:pPr>
+      <w:rPr>
+        <w:rFonts w:ascii="Courier New" w:hAnsi="Courier New" w:cs="Courier New" w:hint="default"/>
+      </w:rPr>
+    </w:lvl>
+    <w:lvl w:ilvl="5" w:tplc="04090005" w:tentative="1">
+      <w:start w:val="1"/>
+      <w:numFmt w:val="bullet"/>
+      <w:lvlText w:val=""/>
+      <w:lvlJc w:val="left"/>
+      <w:pPr>
+        <w:ind w:left="4320" w:hanging="360"/>
+      </w:pPr>
+      <w:rPr>
+        <w:rFonts w:ascii="Wingdings" w:hAnsi="Wingdings" w:hint="default"/>
+      </w:rPr>
+    </w:lvl>
+    <w:lvl w:ilvl="6" w:tplc="04090001" w:tentative="1">
+      <w:start w:val="1"/>
+      <w:numFmt w:val="bullet"/>
+      <w:lvlText w:val=""/>
+      <w:lvlJc w:val="left"/>
+      <w:pPr>
+        <w:ind w:left="5040" w:hanging="360"/>
+      </w:pPr>
+      <w:rPr>
+        <w:rFonts w:ascii="Symbol" w:hAnsi="Symbol" w:hint="default"/>
+      </w:rPr>
+    </w:lvl>
+    <w:lvl w:ilvl="7" w:tplc="04090003" w:tentative="1">
+      <w:start w:val="1"/>
+      <w:numFmt w:val="bullet"/>
+      <w:lvlText w:val="o"/>
+      <w:lvlJc w:val="left"/>
+      <w:pPr>
+        <w:ind w:left="5760" w:hanging="360"/>
+      </w:pPr>
+      <w:rPr>
+        <w:rFonts w:ascii="Courier New" w:hAnsi="Courier New" w:cs="Courier New" w:hint="default"/>
+      </w:rPr>
+    </w:lvl>
+    <w:lvl w:ilvl="8" w:tplc="04090005" w:tentative="1">
+      <w:start w:val="1"/>
+      <w:numFmt w:val="bullet"/>
+      <w:lvlText w:val=""/>
+      <w:lvlJc w:val="left"/>
+      <w:pPr>
+        <w:ind w:left="6480" w:hanging="360"/>
+      </w:pPr>
+      <w:rPr>
+        <w:rFonts w:ascii="Wingdings" w:hAnsi="Wingdings" w:hint="default"/>
+      </w:rPr>
+    </w:lvl>
+  </w:abstractNum>
+  <w:abstractNum w:abstractNumId="19" w15:restartNumberingAfterBreak="0">
+    <w:nsid w:val="4F665299"/>
+    <w:multiLevelType w:val="hybridMultilevel"/>
+    <w:tmpl w:val="1CFC7334"/>
+    <w:lvl w:ilvl="0" w:tplc="04090005">
+      <w:start w:val="1"/>
+      <w:numFmt w:val="bullet"/>
+      <w:lvlText w:val=""/>
+      <w:lvlJc w:val="left"/>
+      <w:pPr>
+        <w:ind w:left="720" w:hanging="360"/>
+      </w:pPr>
+      <w:rPr>
+        <w:rFonts w:ascii="Wingdings" w:hAnsi="Wingdings" w:hint="default"/>
+      </w:rPr>
+    </w:lvl>
+    <w:lvl w:ilvl="1" w:tplc="04090003" w:tentative="1">
+      <w:start w:val="1"/>
+      <w:numFmt w:val="bullet"/>
+      <w:lvlText w:val="o"/>
+      <w:lvlJc w:val="left"/>
+      <w:pPr>
+        <w:ind w:left="1440" w:hanging="360"/>
+      </w:pPr>
+      <w:rPr>
+        <w:rFonts w:ascii="Courier New" w:hAnsi="Courier New" w:cs="Courier New" w:hint="default"/>
+      </w:rPr>
+    </w:lvl>
+    <w:lvl w:ilvl="2" w:tplc="04090005" w:tentative="1">
+      <w:start w:val="1"/>
+      <w:numFmt w:val="bullet"/>
+      <w:lvlText w:val=""/>
+      <w:lvlJc w:val="left"/>
+      <w:pPr>
+        <w:ind w:left="2160" w:hanging="360"/>
+      </w:pPr>
+      <w:rPr>
+        <w:rFonts w:ascii="Wingdings" w:hAnsi="Wingdings" w:hint="default"/>
+      </w:rPr>
+    </w:lvl>
+    <w:lvl w:ilvl="3" w:tplc="04090001" w:tentative="1">
+      <w:start w:val="1"/>
+      <w:numFmt w:val="bullet"/>
+      <w:lvlText w:val=""/>
+      <w:lvlJc w:val="left"/>
+      <w:pPr>
+        <w:ind w:left="2880" w:hanging="360"/>
+      </w:pPr>
+      <w:rPr>
+        <w:rFonts w:ascii="Symbol" w:hAnsi="Symbol" w:hint="default"/>
+      </w:rPr>
+    </w:lvl>
+    <w:lvl w:ilvl="4" w:tplc="04090003" w:tentative="1">
+      <w:start w:val="1"/>
+      <w:numFmt w:val="bullet"/>
+      <w:lvlText w:val="o"/>
+      <w:lvlJc w:val="left"/>
+      <w:pPr>
+        <w:ind w:left="3600" w:hanging="360"/>
+      </w:pPr>
+      <w:rPr>
+        <w:rFonts w:ascii="Courier New" w:hAnsi="Courier New" w:cs="Courier New" w:hint="default"/>
+      </w:rPr>
+    </w:lvl>
+    <w:lvl w:ilvl="5" w:tplc="04090005" w:tentative="1">
+      <w:start w:val="1"/>
+      <w:numFmt w:val="bullet"/>
+      <w:lvlText w:val=""/>
+      <w:lvlJc w:val="left"/>
+      <w:pPr>
+        <w:ind w:left="4320" w:hanging="360"/>
+      </w:pPr>
+      <w:rPr>
+        <w:rFonts w:ascii="Wingdings" w:hAnsi="Wingdings" w:hint="default"/>
+      </w:rPr>
+    </w:lvl>
+    <w:lvl w:ilvl="6" w:tplc="04090001" w:tentative="1">
+      <w:start w:val="1"/>
+      <w:numFmt w:val="bullet"/>
+      <w:lvlText w:val=""/>
+      <w:lvlJc w:val="left"/>
+      <w:pPr>
+        <w:ind w:left="5040" w:hanging="360"/>
+      </w:pPr>
+      <w:rPr>
+        <w:rFonts w:ascii="Symbol" w:hAnsi="Symbol" w:hint="default"/>
+      </w:rPr>
+    </w:lvl>
+    <w:lvl w:ilvl="7" w:tplc="04090003" w:tentative="1">
+      <w:start w:val="1"/>
+      <w:numFmt w:val="bullet"/>
+      <w:lvlText w:val="o"/>
+      <w:lvlJc w:val="left"/>
+      <w:pPr>
+        <w:ind w:left="5760" w:hanging="360"/>
+      </w:pPr>
+      <w:rPr>
+        <w:rFonts w:ascii="Courier New" w:hAnsi="Courier New" w:cs="Courier New" w:hint="default"/>
+      </w:rPr>
+    </w:lvl>
+    <w:lvl w:ilvl="8" w:tplc="04090005" w:tentative="1">
+      <w:start w:val="1"/>
+      <w:numFmt w:val="bullet"/>
+      <w:lvlText w:val=""/>
+      <w:lvlJc w:val="left"/>
+      <w:pPr>
+        <w:ind w:left="6480" w:hanging="360"/>
+      </w:pPr>
+      <w:rPr>
+        <w:rFonts w:ascii="Wingdings" w:hAnsi="Wingdings" w:hint="default"/>
+      </w:rPr>
+    </w:lvl>
+  </w:abstractNum>
+  <w:abstractNum w:abstractNumId="20" w15:restartNumberingAfterBreak="0">
     <w:nsid w:val="69FD568B"/>
     <w:multiLevelType w:val="hybridMultilevel"/>
     <w:tmpl w:val="CD1410EA"/>
@@ -10049,7 +12536,7 @@
       </w:rPr>
     </w:lvl>
   </w:abstractNum>
-  <w:abstractNum w:abstractNumId="11" w15:restartNumberingAfterBreak="0">
+  <w:abstractNum w:abstractNumId="21" w15:restartNumberingAfterBreak="0">
     <w:nsid w:val="6C8B5973"/>
     <w:multiLevelType w:val="multilevel"/>
     <w:tmpl w:val="BBD44002"/>
@@ -10198,7 +12685,7 @@
       </w:rPr>
     </w:lvl>
   </w:abstractNum>
-  <w:abstractNum w:abstractNumId="12" w15:restartNumberingAfterBreak="0">
+  <w:abstractNum w:abstractNumId="22" w15:restartNumberingAfterBreak="0">
     <w:nsid w:val="6F3D4AD0"/>
     <w:multiLevelType w:val="hybridMultilevel"/>
     <w:tmpl w:val="6EEE05E2"/>
@@ -10311,7 +12798,7 @@
       </w:rPr>
     </w:lvl>
   </w:abstractNum>
-  <w:abstractNum w:abstractNumId="13" w15:restartNumberingAfterBreak="0">
+  <w:abstractNum w:abstractNumId="23" w15:restartNumberingAfterBreak="0">
     <w:nsid w:val="709E1E3A"/>
     <w:multiLevelType w:val="hybridMultilevel"/>
     <w:tmpl w:val="BE3C8F4C"/>
@@ -10397,7 +12884,7 @@
       </w:pPr>
     </w:lvl>
   </w:abstractNum>
-  <w:abstractNum w:abstractNumId="14" w15:restartNumberingAfterBreak="0">
+  <w:abstractNum w:abstractNumId="24" w15:restartNumberingAfterBreak="0">
     <w:nsid w:val="73BA04DC"/>
     <w:multiLevelType w:val="multilevel"/>
     <w:tmpl w:val="38CEC0AC"/>
@@ -10546,7 +13033,7 @@
       </w:rPr>
     </w:lvl>
   </w:abstractNum>
-  <w:abstractNum w:abstractNumId="15" w15:restartNumberingAfterBreak="0">
+  <w:abstractNum w:abstractNumId="25" w15:restartNumberingAfterBreak="0">
     <w:nsid w:val="7947716D"/>
     <w:multiLevelType w:val="multilevel"/>
     <w:tmpl w:val="3BBC0382"/>
@@ -10695,53 +13182,199 @@
       </w:rPr>
     </w:lvl>
   </w:abstractNum>
+  <w:abstractNum w:abstractNumId="26" w15:restartNumberingAfterBreak="0">
+    <w:nsid w:val="7F3F608A"/>
+    <w:multiLevelType w:val="hybridMultilevel"/>
+    <w:tmpl w:val="996679EE"/>
+    <w:lvl w:ilvl="0" w:tplc="04090005">
+      <w:start w:val="1"/>
+      <w:numFmt w:val="bullet"/>
+      <w:lvlText w:val=""/>
+      <w:lvlJc w:val="left"/>
+      <w:pPr>
+        <w:ind w:left="720" w:hanging="360"/>
+      </w:pPr>
+      <w:rPr>
+        <w:rFonts w:ascii="Wingdings" w:hAnsi="Wingdings" w:hint="default"/>
+      </w:rPr>
+    </w:lvl>
+    <w:lvl w:ilvl="1" w:tplc="04090003" w:tentative="1">
+      <w:start w:val="1"/>
+      <w:numFmt w:val="bullet"/>
+      <w:lvlText w:val="o"/>
+      <w:lvlJc w:val="left"/>
+      <w:pPr>
+        <w:ind w:left="1440" w:hanging="360"/>
+      </w:pPr>
+      <w:rPr>
+        <w:rFonts w:ascii="Courier New" w:hAnsi="Courier New" w:cs="Courier New" w:hint="default"/>
+      </w:rPr>
+    </w:lvl>
+    <w:lvl w:ilvl="2" w:tplc="04090005" w:tentative="1">
+      <w:start w:val="1"/>
+      <w:numFmt w:val="bullet"/>
+      <w:lvlText w:val=""/>
+      <w:lvlJc w:val="left"/>
+      <w:pPr>
+        <w:ind w:left="2160" w:hanging="360"/>
+      </w:pPr>
+      <w:rPr>
+        <w:rFonts w:ascii="Wingdings" w:hAnsi="Wingdings" w:hint="default"/>
+      </w:rPr>
+    </w:lvl>
+    <w:lvl w:ilvl="3" w:tplc="04090001" w:tentative="1">
+      <w:start w:val="1"/>
+      <w:numFmt w:val="bullet"/>
+      <w:lvlText w:val=""/>
+      <w:lvlJc w:val="left"/>
+      <w:pPr>
+        <w:ind w:left="2880" w:hanging="360"/>
+      </w:pPr>
+      <w:rPr>
+        <w:rFonts w:ascii="Symbol" w:hAnsi="Symbol" w:hint="default"/>
+      </w:rPr>
+    </w:lvl>
+    <w:lvl w:ilvl="4" w:tplc="04090003" w:tentative="1">
+      <w:start w:val="1"/>
+      <w:numFmt w:val="bullet"/>
+      <w:lvlText w:val="o"/>
+      <w:lvlJc w:val="left"/>
+      <w:pPr>
+        <w:ind w:left="3600" w:hanging="360"/>
+      </w:pPr>
+      <w:rPr>
+        <w:rFonts w:ascii="Courier New" w:hAnsi="Courier New" w:cs="Courier New" w:hint="default"/>
+      </w:rPr>
+    </w:lvl>
+    <w:lvl w:ilvl="5" w:tplc="04090005" w:tentative="1">
+      <w:start w:val="1"/>
+      <w:numFmt w:val="bullet"/>
+      <w:lvlText w:val=""/>
+      <w:lvlJc w:val="left"/>
+      <w:pPr>
+        <w:ind w:left="4320" w:hanging="360"/>
+      </w:pPr>
+      <w:rPr>
+        <w:rFonts w:ascii="Wingdings" w:hAnsi="Wingdings" w:hint="default"/>
+      </w:rPr>
+    </w:lvl>
+    <w:lvl w:ilvl="6" w:tplc="04090001" w:tentative="1">
+      <w:start w:val="1"/>
+      <w:numFmt w:val="bullet"/>
+      <w:lvlText w:val=""/>
+      <w:lvlJc w:val="left"/>
+      <w:pPr>
+        <w:ind w:left="5040" w:hanging="360"/>
+      </w:pPr>
+      <w:rPr>
+        <w:rFonts w:ascii="Symbol" w:hAnsi="Symbol" w:hint="default"/>
+      </w:rPr>
+    </w:lvl>
+    <w:lvl w:ilvl="7" w:tplc="04090003" w:tentative="1">
+      <w:start w:val="1"/>
+      <w:numFmt w:val="bullet"/>
+      <w:lvlText w:val="o"/>
+      <w:lvlJc w:val="left"/>
+      <w:pPr>
+        <w:ind w:left="5760" w:hanging="360"/>
+      </w:pPr>
+      <w:rPr>
+        <w:rFonts w:ascii="Courier New" w:hAnsi="Courier New" w:cs="Courier New" w:hint="default"/>
+      </w:rPr>
+    </w:lvl>
+    <w:lvl w:ilvl="8" w:tplc="04090005" w:tentative="1">
+      <w:start w:val="1"/>
+      <w:numFmt w:val="bullet"/>
+      <w:lvlText w:val=""/>
+      <w:lvlJc w:val="left"/>
+      <w:pPr>
+        <w:ind w:left="6480" w:hanging="360"/>
+      </w:pPr>
+      <w:rPr>
+        <w:rFonts w:ascii="Wingdings" w:hAnsi="Wingdings" w:hint="default"/>
+      </w:rPr>
+    </w:lvl>
+  </w:abstractNum>
   <w:num w:numId="1" w16cid:durableId="368380834">
+    <w:abstractNumId w:val="8"/>
+  </w:num>
+  <w:num w:numId="2" w16cid:durableId="1962488994">
+    <w:abstractNumId w:val="2"/>
+  </w:num>
+  <w:num w:numId="3" w16cid:durableId="1080641741">
+    <w:abstractNumId w:val="25"/>
+  </w:num>
+  <w:num w:numId="4" w16cid:durableId="347567265">
+    <w:abstractNumId w:val="24"/>
+  </w:num>
+  <w:num w:numId="5" w16cid:durableId="1743871485">
+    <w:abstractNumId w:val="5"/>
+  </w:num>
+  <w:num w:numId="6" w16cid:durableId="1758552921">
+    <w:abstractNumId w:val="12"/>
+  </w:num>
+  <w:num w:numId="7" w16cid:durableId="1455906008">
+    <w:abstractNumId w:val="11"/>
+  </w:num>
+  <w:num w:numId="8" w16cid:durableId="103766057">
+    <w:abstractNumId w:val="23"/>
+  </w:num>
+  <w:num w:numId="9" w16cid:durableId="1317880967">
+    <w:abstractNumId w:val="15"/>
+  </w:num>
+  <w:num w:numId="10" w16cid:durableId="1348559843">
+    <w:abstractNumId w:val="16"/>
+  </w:num>
+  <w:num w:numId="11" w16cid:durableId="110251887">
+    <w:abstractNumId w:val="21"/>
+  </w:num>
+  <w:num w:numId="12" w16cid:durableId="1596550397">
+    <w:abstractNumId w:val="20"/>
+  </w:num>
+  <w:num w:numId="13" w16cid:durableId="1519735741">
+    <w:abstractNumId w:val="22"/>
+  </w:num>
+  <w:num w:numId="14" w16cid:durableId="48769365">
+    <w:abstractNumId w:val="14"/>
+  </w:num>
+  <w:num w:numId="15" w16cid:durableId="339115787">
+    <w:abstractNumId w:val="10"/>
+  </w:num>
+  <w:num w:numId="16" w16cid:durableId="2082293827">
+    <w:abstractNumId w:val="7"/>
+  </w:num>
+  <w:num w:numId="17" w16cid:durableId="1941909516">
+    <w:abstractNumId w:val="13"/>
+  </w:num>
+  <w:num w:numId="18" w16cid:durableId="671418057">
+    <w:abstractNumId w:val="26"/>
+  </w:num>
+  <w:num w:numId="19" w16cid:durableId="9913673">
+    <w:abstractNumId w:val="19"/>
+  </w:num>
+  <w:num w:numId="20" w16cid:durableId="534661101">
+    <w:abstractNumId w:val="0"/>
+  </w:num>
+  <w:num w:numId="21" w16cid:durableId="1772898498">
+    <w:abstractNumId w:val="4"/>
+  </w:num>
+  <w:num w:numId="22" w16cid:durableId="805508112">
+    <w:abstractNumId w:val="18"/>
+  </w:num>
+  <w:num w:numId="23" w16cid:durableId="2133280728">
+    <w:abstractNumId w:val="9"/>
+  </w:num>
+  <w:num w:numId="24" w16cid:durableId="808714662">
     <w:abstractNumId w:val="3"/>
   </w:num>
-  <w:num w:numId="2" w16cid:durableId="1962488994">
-    <w:abstractNumId w:val="0"/>
-  </w:num>
-  <w:num w:numId="3" w16cid:durableId="1080641741">
-    <w:abstractNumId w:val="15"/>
-  </w:num>
-  <w:num w:numId="4" w16cid:durableId="347567265">
-    <w:abstractNumId w:val="14"/>
-  </w:num>
-  <w:num w:numId="5" w16cid:durableId="1743871485">
-    <w:abstractNumId w:val="1"/>
-  </w:num>
-  <w:num w:numId="6" w16cid:durableId="1758552921">
+  <w:num w:numId="25" w16cid:durableId="502087574">
     <w:abstractNumId w:val="6"/>
   </w:num>
-  <w:num w:numId="7" w16cid:durableId="1455906008">
-    <w:abstractNumId w:val="5"/>
+  <w:num w:numId="26" w16cid:durableId="729889656">
+    <w:abstractNumId w:val="17"/>
   </w:num>
-  <w:num w:numId="8" w16cid:durableId="103766057">
-    <w:abstractNumId w:val="13"/>
-  </w:num>
-  <w:num w:numId="9" w16cid:durableId="1317880967">
-    <w:abstractNumId w:val="8"/>
-  </w:num>
-  <w:num w:numId="10" w16cid:durableId="1348559843">
-    <w:abstractNumId w:val="9"/>
-  </w:num>
-  <w:num w:numId="11" w16cid:durableId="110251887">
-    <w:abstractNumId w:val="11"/>
-  </w:num>
-  <w:num w:numId="12" w16cid:durableId="1596550397">
-    <w:abstractNumId w:val="10"/>
-  </w:num>
-  <w:num w:numId="13" w16cid:durableId="1519735741">
-    <w:abstractNumId w:val="12"/>
-  </w:num>
-  <w:num w:numId="14" w16cid:durableId="48769365">
-    <w:abstractNumId w:val="7"/>
-  </w:num>
-  <w:num w:numId="15" w16cid:durableId="339115787">
-    <w:abstractNumId w:val="4"/>
-  </w:num>
-  <w:num w:numId="16" w16cid:durableId="2082293827">
-    <w:abstractNumId w:val="2"/>
+  <w:num w:numId="27" w16cid:durableId="976688192">
+    <w:abstractNumId w:val="1"/>
   </w:num>
   <w:numIdMacAtCleanup w:val="16"/>
 </w:numbering>

</xml_diff>

<commit_message>
feat: add exercises 02 through 05
</commit_message>
<xml_diff>
--- a/docs/Pascal_Docs/Module_00_Pascal.docx
+++ b/docs/Pascal_Docs/Module_00_Pascal.docx
@@ -4981,6 +4981,9 @@
     <w:p>
       <w:pPr>
         <w:pStyle w:val="Sinespaciado"/>
+        <w:rPr>
+          <w:lang w:val="es-ES"/>
+        </w:rPr>
       </w:pPr>
       <w:r>
         <w:rPr>
@@ -5058,55 +5061,32 @@
         </w:rPr>
         <w:t xml:space="preserve"> base. </w:t>
       </w:r>
-      <w:r>
-        <w:t xml:space="preserve">La salida </w:t>
-      </w:r>
-      <w:proofErr w:type="spellStart"/>
-      <w:r>
-        <w:t>debe</w:t>
-      </w:r>
-      <w:proofErr w:type="spellEnd"/>
-      <w:r>
-        <w:t xml:space="preserve"> </w:t>
-      </w:r>
-      <w:proofErr w:type="spellStart"/>
-      <w:r>
-        <w:t>mostrarse</w:t>
-      </w:r>
-      <w:proofErr w:type="spellEnd"/>
-      <w:r>
-        <w:t xml:space="preserve"> </w:t>
-      </w:r>
-      <w:proofErr w:type="spellStart"/>
-      <w:r>
-        <w:t>estrictamente</w:t>
-      </w:r>
-      <w:proofErr w:type="spellEnd"/>
-      <w:r>
-        <w:t xml:space="preserve"> </w:t>
-      </w:r>
-      <w:proofErr w:type="spellStart"/>
-      <w:r>
-        <w:t>formateada</w:t>
-      </w:r>
-      <w:proofErr w:type="spellEnd"/>
-      <w:r>
-        <w:t xml:space="preserve"> con 2 </w:t>
-      </w:r>
-      <w:proofErr w:type="spellStart"/>
-      <w:r>
-        <w:t>decimales</w:t>
-      </w:r>
-      <w:proofErr w:type="spellEnd"/>
-      <w:r>
-        <w:t xml:space="preserve"> </w:t>
+    </w:p>
+    <w:p>
+      <w:pPr>
+        <w:pStyle w:val="Sinespaciado"/>
+        <w:rPr>
+          <w:lang w:val="es-ES"/>
+        </w:rPr>
+      </w:pPr>
+      <w:r>
+        <w:rPr>
+          <w:lang w:val="es-ES"/>
+        </w:rPr>
+        <w:t xml:space="preserve">La salida debe mostrarse estrictamente formateada con 2 decimales </w:t>
       </w:r>
       <w:proofErr w:type="gramStart"/>
       <w:r>
+        <w:rPr>
+          <w:lang w:val="es-ES"/>
+        </w:rPr>
         <w:t>(:0:2</w:t>
       </w:r>
       <w:proofErr w:type="gramEnd"/>
       <w:r>
+        <w:rPr>
+          <w:lang w:val="es-ES"/>
+        </w:rPr>
         <w:t>).</w:t>
       </w:r>
     </w:p>
@@ -5259,19 +5239,7 @@
         <w:rPr>
           <w:lang w:val="es-ES"/>
         </w:rPr>
-        <w:t xml:space="preserve">Imprime el resultado usando el </w:t>
-      </w:r>
-      <w:r>
-        <w:rPr>
-          <w:lang w:val="es-ES"/>
-        </w:rPr>
-        <w:t>formato: 0:2</w:t>
-      </w:r>
-      <w:r>
-        <w:rPr>
-          <w:lang w:val="es-ES"/>
-        </w:rPr>
-        <w:t xml:space="preserve"> para forzar exactamente 2 decimales.</w:t>
+        <w:t>Imprime el resultado usando el formato: 0:2 para forzar exactamente 2 decimales.</w:t>
       </w:r>
     </w:p>
     <w:p>
@@ -5393,21 +5361,12 @@
                                 <w:lang w:val="es-ES"/>
                               </w:rPr>
                             </w:pPr>
-                            <w:proofErr w:type="spellStart"/>
                             <w:r>
                               <w:rPr>
                                 <w:rFonts w:ascii="Cascadia Mono SemiBold" w:hAnsi="Cascadia Mono SemiBold" w:cs="Cascadia Mono SemiBold"/>
                                 <w:lang w:val="es-ES"/>
                               </w:rPr>
-                              <w:t>Oozaru</w:t>
-                            </w:r>
-                            <w:proofErr w:type="spellEnd"/>
-                            <w:r>
-                              <w:rPr>
-                                <w:rFonts w:ascii="Cascadia Mono SemiBold" w:hAnsi="Cascadia Mono SemiBold" w:cs="Cascadia Mono SemiBold"/>
-                                <w:lang w:val="es-ES"/>
-                              </w:rPr>
-                              <w:t xml:space="preserve"> Ki </w:t>
+                              <w:t xml:space="preserve">Ozaru Ki </w:t>
                             </w:r>
                             <w:proofErr w:type="spellStart"/>
                             <w:r>
@@ -5475,21 +5434,12 @@
                           <w:lang w:val="es-ES"/>
                         </w:rPr>
                       </w:pPr>
-                      <w:proofErr w:type="spellStart"/>
                       <w:r>
                         <w:rPr>
                           <w:rFonts w:ascii="Cascadia Mono SemiBold" w:hAnsi="Cascadia Mono SemiBold" w:cs="Cascadia Mono SemiBold"/>
                           <w:lang w:val="es-ES"/>
                         </w:rPr>
-                        <w:t>Oozaru</w:t>
-                      </w:r>
-                      <w:proofErr w:type="spellEnd"/>
-                      <w:r>
-                        <w:rPr>
-                          <w:rFonts w:ascii="Cascadia Mono SemiBold" w:hAnsi="Cascadia Mono SemiBold" w:cs="Cascadia Mono SemiBold"/>
-                          <w:lang w:val="es-ES"/>
-                        </w:rPr>
-                        <w:t xml:space="preserve"> Ki </w:t>
+                        <w:t xml:space="preserve">Ozaru Ki </w:t>
                       </w:r>
                       <w:proofErr w:type="spellStart"/>
                       <w:r>
@@ -5545,6 +5495,15 @@
       <w:pPr>
         <w:pStyle w:val="Sinespaciado"/>
         <w:rPr>
+          <w:lang w:val="es-ES"/>
+        </w:rPr>
+      </w:pPr>
+    </w:p>
+    <w:p>
+      <w:pPr>
+        <w:rPr>
+          <w:b/>
+          <w:bCs/>
           <w:lang w:val="es-ES"/>
         </w:rPr>
       </w:pPr>
@@ -6710,16 +6669,16 @@
         <mc:AlternateContent>
           <mc:Choice Requires="wps">
             <w:drawing>
-              <wp:anchor distT="0" distB="0" distL="114300" distR="114300" simplePos="0" relativeHeight="251669504" behindDoc="0" locked="0" layoutInCell="1" allowOverlap="1" wp14:anchorId="4C96FB70" wp14:editId="6F711A2A">
+              <wp:anchor distT="0" distB="0" distL="114300" distR="114300" simplePos="0" relativeHeight="251669504" behindDoc="0" locked="0" layoutInCell="1" allowOverlap="1" wp14:anchorId="4C96FB70" wp14:editId="1E9C32BF">
                 <wp:simplePos x="0" y="0"/>
                 <wp:positionH relativeFrom="margin">
-                  <wp:posOffset>-19685</wp:posOffset>
+                  <wp:posOffset>-19086</wp:posOffset>
                 </wp:positionH>
                 <wp:positionV relativeFrom="paragraph">
-                  <wp:posOffset>97790</wp:posOffset>
+                  <wp:posOffset>100402</wp:posOffset>
                 </wp:positionV>
-                <wp:extent cx="6378575" cy="1022350"/>
-                <wp:effectExtent l="0" t="0" r="22225" b="25400"/>
+                <wp:extent cx="5796951" cy="1022350"/>
+                <wp:effectExtent l="0" t="0" r="13335" b="25400"/>
                 <wp:wrapNone/>
                 <wp:docPr id="1147415086" name="Rectángulo 2"/>
                 <wp:cNvGraphicFramePr/>
@@ -6730,7 +6689,7 @@
                       <wps:spPr>
                         <a:xfrm>
                           <a:off x="0" y="0"/>
-                          <a:ext cx="6378575" cy="1022350"/>
+                          <a:ext cx="5796951" cy="1022350"/>
                         </a:xfrm>
                         <a:prstGeom prst="rect">
                           <a:avLst/>
@@ -6864,7 +6823,7 @@
           </mc:Choice>
           <mc:Fallback>
             <w:pict>
-              <v:rect w14:anchorId="4C96FB70" id="_x0000_s1030" style="position:absolute;margin-left:-1.55pt;margin-top:7.7pt;width:502.25pt;height:80.5pt;z-index:251669504;visibility:visible;mso-wrap-style:square;mso-width-percent:0;mso-height-percent:0;mso-wrap-distance-left:9pt;mso-wrap-distance-top:0;mso-wrap-distance-right:9pt;mso-wrap-distance-bottom:0;mso-position-horizontal:absolute;mso-position-horizontal-relative:margin;mso-position-vertical:absolute;mso-position-vertical-relative:text;mso-width-percent:0;mso-height-percent:0;mso-width-relative:margin;mso-height-relative:margin;v-text-anchor:middle" o:gfxdata="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" fillcolor="black [3213]" strokecolor="black [3213]" strokeweight="1pt">
+              <v:rect w14:anchorId="4C96FB70" id="_x0000_s1030" style="position:absolute;margin-left:-1.5pt;margin-top:7.9pt;width:456.45pt;height:80.5pt;z-index:251669504;visibility:visible;mso-wrap-style:square;mso-width-percent:0;mso-height-percent:0;mso-wrap-distance-left:9pt;mso-wrap-distance-top:0;mso-wrap-distance-right:9pt;mso-wrap-distance-bottom:0;mso-position-horizontal:absolute;mso-position-horizontal-relative:margin;mso-position-vertical:absolute;mso-position-vertical-relative:text;mso-width-percent:0;mso-height-percent:0;mso-width-relative:margin;mso-height-relative:margin;v-text-anchor:middle" o:gfxdata="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" fillcolor="black [3213]" strokecolor="black [3213]" strokeweight="1pt">
                 <v:textbox>
                   <w:txbxContent>
                     <w:p>
@@ -7352,6 +7311,9 @@
     <w:p>
       <w:pPr>
         <w:pStyle w:val="Sinespaciado"/>
+        <w:rPr>
+          <w:lang w:val="es-ES"/>
+        </w:rPr>
       </w:pPr>
     </w:p>
     <w:p>
@@ -13985,6 +13947,7 @@
   <w:style w:type="character" w:default="1" w:styleId="Fuentedeprrafopredeter">
     <w:name w:val="Default Paragraph Font"/>
     <w:uiPriority w:val="1"/>
+    <w:semiHidden/>
     <w:unhideWhenUsed/>
   </w:style>
   <w:style w:type="table" w:default="1" w:styleId="Tablanormal">

</xml_diff>

<commit_message>
feat: complete module 0 exercises
</commit_message>
<xml_diff>
--- a/docs/Pascal_Docs/Module_00_Pascal.docx
+++ b/docs/Pascal_Docs/Module_00_Pascal.docx
@@ -106,14 +106,12 @@
               <w:lang w:val="es-ES"/>
             </w:rPr>
           </w:pPr>
-          <w:proofErr w:type="spellStart"/>
           <w:r>
             <w:rPr>
               <w:lang w:val="es-ES"/>
             </w:rPr>
             <w:t>Contents</w:t>
           </w:r>
-          <w:proofErr w:type="spellEnd"/>
         </w:p>
         <w:p>
           <w:pPr>
@@ -1173,21 +1171,7 @@
         <w:rPr>
           <w:lang w:val="es-ES"/>
         </w:rPr>
-        <w:t xml:space="preserve">orja </w:t>
-      </w:r>
-      <w:proofErr w:type="spellStart"/>
-      <w:r>
-        <w:rPr>
-          <w:lang w:val="es-ES"/>
-        </w:rPr>
-        <w:t>saiyajin</w:t>
-      </w:r>
-      <w:proofErr w:type="spellEnd"/>
-      <w:r>
-        <w:rPr>
-          <w:lang w:val="es-ES"/>
-        </w:rPr>
-        <w:t xml:space="preserve"> </w:t>
+        <w:t xml:space="preserve">orja saiyajin </w:t>
       </w:r>
     </w:p>
     <w:p>
@@ -1238,21 +1222,7 @@
         <w:rPr>
           <w:lang w:val="es-ES"/>
         </w:rPr>
-        <w:t xml:space="preserve">Free Pascal </w:t>
-      </w:r>
-      <w:proofErr w:type="spellStart"/>
-      <w:r>
-        <w:rPr>
-          <w:lang w:val="es-ES"/>
-        </w:rPr>
-        <w:t>Compiler</w:t>
-      </w:r>
-      <w:proofErr w:type="spellEnd"/>
-      <w:r>
-        <w:rPr>
-          <w:lang w:val="es-ES"/>
-        </w:rPr>
-        <w:t xml:space="preserve"> (FPC) 3.2.x o</w:t>
+        <w:t>Free Pascal Compiler (FPC) 3.2.x o</w:t>
       </w:r>
       <w:r>
         <w:rPr>
@@ -1260,7 +1230,6 @@
         </w:rPr>
         <w:t xml:space="preserve"> superior (se recomienda 3.2.2). El código debe compilar de forma nativa desde terminal mediante el comando </w:t>
       </w:r>
-      <w:proofErr w:type="spellStart"/>
       <w:r>
         <w:rPr>
           <w:i/>
@@ -1269,7 +1238,6 @@
         </w:rPr>
         <w:t>fpc</w:t>
       </w:r>
-      <w:proofErr w:type="spellEnd"/>
       <w:r>
         <w:rPr>
           <w:lang w:val="es-ES"/>
@@ -1314,35 +1282,7 @@
         <w:rPr>
           <w:lang w:val="es-ES"/>
         </w:rPr>
-        <w:t xml:space="preserve">un directorio independiente por cada ejercicio (ex00/, ex01/, etc.); cada programa debe ser autosuficiente, con su propio bloque </w:t>
-      </w:r>
-      <w:proofErr w:type="spellStart"/>
-      <w:r>
-        <w:rPr>
-          <w:lang w:val="es-ES"/>
-        </w:rPr>
-        <w:t>program</w:t>
-      </w:r>
-      <w:proofErr w:type="spellEnd"/>
-      <w:r>
-        <w:rPr>
-          <w:lang w:val="es-ES"/>
-        </w:rPr>
-        <w:t xml:space="preserve">, o ser una </w:t>
-      </w:r>
-      <w:proofErr w:type="spellStart"/>
-      <w:r>
-        <w:rPr>
-          <w:lang w:val="es-ES"/>
-        </w:rPr>
-        <w:t>unit</w:t>
-      </w:r>
-      <w:proofErr w:type="spellEnd"/>
-      <w:r>
-        <w:rPr>
-          <w:lang w:val="es-ES"/>
-        </w:rPr>
-        <w:t xml:space="preserve"> si así lo exige el enunciado.</w:t>
+        <w:t>un directorio independiente por cada ejercicio (ex00/, ex01/, etc.); cada programa debe ser autosuficiente, con su propio bloque program, o ser una unit si así lo exige el enunciado.</w:t>
       </w:r>
     </w:p>
     <w:p>
@@ -1356,7 +1296,6 @@
           <w:lang w:val="es-ES"/>
         </w:rPr>
       </w:pPr>
-      <w:proofErr w:type="spellStart"/>
       <w:r>
         <w:rPr>
           <w:b/>
@@ -1365,18 +1304,7 @@
           <w:iCs/>
           <w:lang w:val="es-ES"/>
         </w:rPr>
-        <w:t>Linter</w:t>
-      </w:r>
-      <w:proofErr w:type="spellEnd"/>
-      <w:r>
-        <w:rPr>
-          <w:b/>
-          <w:bCs/>
-          <w:i/>
-          <w:iCs/>
-          <w:lang w:val="es-ES"/>
-        </w:rPr>
-        <w:t xml:space="preserve"> Obligatorio:</w:t>
+        <w:t>Linter Obligatorio:</w:t>
       </w:r>
       <w:r>
         <w:rPr>
@@ -1384,75 +1312,11 @@
         </w:rPr>
         <w:t xml:space="preserve"> </w:t>
       </w:r>
-      <w:proofErr w:type="spellStart"/>
-      <w:r>
-        <w:rPr>
-          <w:lang w:val="es-ES"/>
-        </w:rPr>
-        <w:t>indentación</w:t>
-      </w:r>
-      <w:proofErr w:type="spellEnd"/>
-      <w:r>
-        <w:rPr>
-          <w:lang w:val="es-ES"/>
-        </w:rPr>
-        <w:t xml:space="preserve"> estricta de 2 o 4 espacios; uso riguroso de punto y coma (;) para delimitar sentencias; omitir estrictamente el punto y coma antes de </w:t>
-      </w:r>
-      <w:proofErr w:type="spellStart"/>
-      <w:r>
-        <w:rPr>
-          <w:lang w:val="es-ES"/>
-        </w:rPr>
-        <w:t>else</w:t>
-      </w:r>
-      <w:proofErr w:type="spellEnd"/>
-      <w:r>
-        <w:rPr>
-          <w:lang w:val="es-ES"/>
-        </w:rPr>
-        <w:t xml:space="preserve">; delimitar explícitamente los bloques lógicos mediante </w:t>
-      </w:r>
-      <w:proofErr w:type="spellStart"/>
-      <w:r>
-        <w:rPr>
-          <w:lang w:val="es-ES"/>
-        </w:rPr>
-        <w:t>begin</w:t>
-      </w:r>
-      <w:proofErr w:type="spellEnd"/>
-      <w:r>
-        <w:rPr>
-          <w:lang w:val="es-ES"/>
-        </w:rPr>
-        <w:t>/</w:t>
-      </w:r>
-      <w:proofErr w:type="spellStart"/>
-      <w:r>
-        <w:rPr>
-          <w:lang w:val="es-ES"/>
-        </w:rPr>
-        <w:t>end</w:t>
-      </w:r>
-      <w:proofErr w:type="spellEnd"/>
-      <w:r>
-        <w:rPr>
-          <w:lang w:val="es-ES"/>
-        </w:rPr>
-        <w:t>; y garantizar que todos los archivos compilen sin advertencias (</w:t>
-      </w:r>
-      <w:proofErr w:type="spellStart"/>
-      <w:r>
-        <w:rPr>
-          <w:lang w:val="es-ES"/>
-        </w:rPr>
-        <w:t>warnings</w:t>
-      </w:r>
-      <w:proofErr w:type="spellEnd"/>
-      <w:r>
-        <w:rPr>
-          <w:lang w:val="es-ES"/>
-        </w:rPr>
-        <w:t>) ni errores.</w:t>
+      <w:r>
+        <w:rPr>
+          <w:lang w:val="es-ES"/>
+        </w:rPr>
+        <w:t>indentación estricta de 2 o 4 espacios; uso riguroso de punto y coma (;) para delimitar sentencias; omitir estrictamente el punto y coma antes de else; delimitar explícitamente los bloques lógicos mediante begin/end; y garantizar que todos los archivos compilen sin advertencias (warnings) ni errores.</w:t>
       </w:r>
     </w:p>
     <w:p>
@@ -1532,21 +1396,7 @@
         <w:rPr>
           <w:lang w:val="es-ES"/>
         </w:rPr>
-        <w:t xml:space="preserve">: </w:t>
-      </w:r>
-      <w:proofErr w:type="spellStart"/>
-      <w:r>
-        <w:rPr>
-          <w:lang w:val="es-ES"/>
-        </w:rPr>
-        <w:t>snake_case</w:t>
-      </w:r>
-      <w:proofErr w:type="spellEnd"/>
-      <w:r>
-        <w:rPr>
-          <w:lang w:val="es-ES"/>
-        </w:rPr>
-        <w:t>, extensión en minúsculas</w:t>
+        <w:t>: snake_case, extensión en minúsculas</w:t>
       </w:r>
       <w:r>
         <w:rPr>
@@ -1578,16 +1428,8 @@
         <w:rPr>
           <w:lang w:val="es-ES"/>
         </w:rPr>
-        <w:t xml:space="preserve">: prefijo t + </w:t>
-      </w:r>
-      <w:proofErr w:type="spellStart"/>
-      <w:r>
-        <w:rPr>
-          <w:lang w:val="es-ES"/>
-        </w:rPr>
-        <w:t>PascalCas</w:t>
-      </w:r>
-      <w:proofErr w:type="spellEnd"/>
+        <w:t>: prefijo t + PascalCas</w:t>
+      </w:r>
       <w:r>
         <w:rPr>
           <w:lang w:val="es-ES"/>
@@ -1618,35 +1460,7 @@
         <w:rPr>
           <w:lang w:val="es-ES"/>
         </w:rPr>
-        <w:t xml:space="preserve">: prefijo p (o ^t) (ej. </w:t>
-      </w:r>
-      <w:proofErr w:type="spellStart"/>
-      <w:r>
-        <w:rPr>
-          <w:lang w:val="es-ES"/>
-        </w:rPr>
-        <w:t>pNodo</w:t>
-      </w:r>
-      <w:proofErr w:type="spellEnd"/>
-      <w:r>
-        <w:rPr>
-          <w:lang w:val="es-ES"/>
-        </w:rPr>
-        <w:t xml:space="preserve"> = ^</w:t>
-      </w:r>
-      <w:proofErr w:type="spellStart"/>
-      <w:r>
-        <w:rPr>
-          <w:lang w:val="es-ES"/>
-        </w:rPr>
-        <w:t>tNodo</w:t>
-      </w:r>
-      <w:proofErr w:type="spellEnd"/>
-      <w:r>
-        <w:rPr>
-          <w:lang w:val="es-ES"/>
-        </w:rPr>
-        <w:t xml:space="preserve">). </w:t>
+        <w:t xml:space="preserve">: prefijo p (o ^t) (ej. pNodo = ^tNodo). </w:t>
       </w:r>
     </w:p>
     <w:p>
@@ -1694,40 +1508,11 @@
           <w:b/>
           <w:bCs/>
         </w:rPr>
-        <w:t xml:space="preserve">Variables y </w:t>
-      </w:r>
-      <w:proofErr w:type="spellStart"/>
-      <w:r>
-        <w:rPr>
-          <w:b/>
-          <w:bCs/>
-        </w:rPr>
-        <w:t>subprogramas</w:t>
-      </w:r>
-      <w:proofErr w:type="spellEnd"/>
-      <w:r>
-        <w:rPr>
-          <w:b/>
-          <w:bCs/>
-        </w:rPr>
-        <w:t>:</w:t>
-      </w:r>
-      <w:r>
-        <w:t xml:space="preserve"> </w:t>
-      </w:r>
-      <w:proofErr w:type="spellStart"/>
-      <w:r>
-        <w:t>snake_case</w:t>
-      </w:r>
-      <w:proofErr w:type="spellEnd"/>
-      <w:r>
-        <w:t xml:space="preserve"> </w:t>
-      </w:r>
-      <w:proofErr w:type="spellStart"/>
-      <w:r>
-        <w:t>consistente</w:t>
-      </w:r>
-      <w:proofErr w:type="spellEnd"/>
+        <w:t>Variables y subprogramas:</w:t>
+      </w:r>
+      <w:r>
+        <w:t xml:space="preserve"> snake_case consistente</w:t>
+      </w:r>
       <w:r>
         <w:t>.</w:t>
       </w:r>
@@ -1835,7 +1620,6 @@
         </w:rPr>
         <w:t xml:space="preserve"> </w:t>
       </w:r>
-      <w:proofErr w:type="spellStart"/>
       <w:r>
         <w:rPr>
           <w:b/>
@@ -1844,9 +1628,8 @@
           <w:iCs/>
           <w:lang w:val="es-ES"/>
         </w:rPr>
-        <w:t>fpc</w:t>
-      </w:r>
-      <w:proofErr w:type="spellEnd"/>
+        <w:t>fpc -iV</w:t>
+      </w:r>
       <w:r>
         <w:rPr>
           <w:b/>
@@ -1855,9 +1638,22 @@
           <w:iCs/>
           <w:lang w:val="es-ES"/>
         </w:rPr>
-        <w:t xml:space="preserve"> -</w:t>
-      </w:r>
-      <w:proofErr w:type="spellStart"/>
+        <w:t xml:space="preserve"> </w:t>
+      </w:r>
+      <w:r>
+        <w:rPr>
+          <w:lang w:val="es-ES"/>
+        </w:rPr>
+        <w:t>(debe devolver 3.2.x o superior).</w:t>
+      </w:r>
+    </w:p>
+    <w:p>
+      <w:pPr>
+        <w:pStyle w:val="Sinespaciado"/>
+        <w:rPr>
+          <w:lang w:val="es-ES"/>
+        </w:rPr>
+      </w:pPr>
       <w:r>
         <w:rPr>
           <w:b/>
@@ -1866,15 +1662,10 @@
           <w:iCs/>
           <w:lang w:val="es-ES"/>
         </w:rPr>
-        <w:t>iV</w:t>
-      </w:r>
-      <w:proofErr w:type="spellEnd"/>
-      <w:r>
-        <w:rPr>
-          <w:b/>
-          <w:bCs/>
-          <w:i/>
-          <w:iCs/>
+        <w:t>Compilación estándar:</w:t>
+      </w:r>
+      <w:r>
+        <w:rPr>
           <w:lang w:val="es-ES"/>
         </w:rPr>
         <w:t xml:space="preserve"> </w:t>
@@ -1883,68 +1674,8 @@
         <w:rPr>
           <w:lang w:val="es-ES"/>
         </w:rPr>
-        <w:t>(debe devolver 3.2.x o superior).</w:t>
-      </w:r>
-    </w:p>
-    <w:p>
-      <w:pPr>
-        <w:pStyle w:val="Sinespaciado"/>
-        <w:rPr>
-          <w:lang w:val="es-ES"/>
-        </w:rPr>
-      </w:pPr>
-      <w:r>
-        <w:rPr>
-          <w:b/>
-          <w:bCs/>
-          <w:i/>
-          <w:iCs/>
-          <w:lang w:val="es-ES"/>
-        </w:rPr>
-        <w:t>Compilación estándar:</w:t>
-      </w:r>
-      <w:r>
-        <w:rPr>
-          <w:lang w:val="es-ES"/>
-        </w:rPr>
-        <w:t xml:space="preserve"> </w:t>
-      </w:r>
-      <w:proofErr w:type="spellStart"/>
-      <w:r>
-        <w:rPr>
-          <w:lang w:val="es-ES"/>
-        </w:rPr>
-        <w:t>fpc</w:t>
-      </w:r>
-      <w:proofErr w:type="spellEnd"/>
-      <w:r>
-        <w:rPr>
-          <w:lang w:val="es-ES"/>
-        </w:rPr>
-        <w:t xml:space="preserve"> -Co -Cr -</w:t>
-      </w:r>
-      <w:proofErr w:type="spellStart"/>
-      <w:r>
-        <w:rPr>
-          <w:lang w:val="es-ES"/>
-        </w:rPr>
-        <w:t>Mobjfpc</w:t>
-      </w:r>
-      <w:proofErr w:type="spellEnd"/>
-      <w:r>
-        <w:rPr>
-          <w:lang w:val="es-ES"/>
-        </w:rPr>
-        <w:t xml:space="preserve"> </w:t>
-      </w:r>
-      <w:proofErr w:type="spellStart"/>
-      <w:r>
-        <w:rPr>
-          <w:lang w:val="es-ES"/>
-        </w:rPr>
-        <w:t>nombre_archivo.pas</w:t>
-      </w:r>
-      <w:proofErr w:type="spellEnd"/>
+        <w:t>fpc -Co -Cr -Mobjfpc nombre_archivo.pas</w:t>
+      </w:r>
     </w:p>
     <w:p>
       <w:pPr>
@@ -1995,21 +1726,7 @@
         <w:rPr>
           <w:lang w:val="es-ES"/>
         </w:rPr>
-        <w:t xml:space="preserve"> comprobación de límites de </w:t>
-      </w:r>
-      <w:proofErr w:type="spellStart"/>
-      <w:r>
-        <w:rPr>
-          <w:lang w:val="es-ES"/>
-        </w:rPr>
-        <w:t>arrays</w:t>
-      </w:r>
-      <w:proofErr w:type="spellEnd"/>
-      <w:r>
-        <w:rPr>
-          <w:lang w:val="es-ES"/>
-        </w:rPr>
-        <w:t xml:space="preserve"> y rangos.</w:t>
+        <w:t xml:space="preserve"> comprobación de límites de arrays y rangos.</w:t>
       </w:r>
     </w:p>
     <w:p>
@@ -2029,25 +1746,7 @@
           <w:bCs/>
           <w:lang w:val="es-ES"/>
         </w:rPr>
-        <w:t>-</w:t>
-      </w:r>
-      <w:proofErr w:type="spellStart"/>
-      <w:r>
-        <w:rPr>
-          <w:b/>
-          <w:bCs/>
-          <w:lang w:val="es-ES"/>
-        </w:rPr>
-        <w:t>Mobjfpc</w:t>
-      </w:r>
-      <w:proofErr w:type="spellEnd"/>
-      <w:r>
-        <w:rPr>
-          <w:b/>
-          <w:bCs/>
-          <w:lang w:val="es-ES"/>
-        </w:rPr>
-        <w:t>:</w:t>
+        <w:t>-Mobjfpc:</w:t>
       </w:r>
       <w:r>
         <w:rPr>
@@ -2125,21 +1824,7 @@
         <w:rPr>
           <w:lang w:val="es-ES"/>
         </w:rPr>
-        <w:t xml:space="preserve"> — comprobación de límites de rangos y </w:t>
-      </w:r>
-      <w:proofErr w:type="spellStart"/>
-      <w:r>
-        <w:rPr>
-          <w:lang w:val="es-ES"/>
-        </w:rPr>
-        <w:t>arrays</w:t>
-      </w:r>
-      <w:proofErr w:type="spellEnd"/>
-      <w:r>
-        <w:rPr>
-          <w:lang w:val="es-ES"/>
-        </w:rPr>
-        <w:t>.</w:t>
+        <w:t xml:space="preserve"> — comprobación de límites de rangos y arrays.</w:t>
       </w:r>
     </w:p>
     <w:p>
@@ -2207,7 +1892,6 @@
         </w:rPr>
         <w:t xml:space="preserve"> </w:t>
       </w:r>
-      <w:proofErr w:type="spellStart"/>
       <w:r>
         <w:rPr>
           <w:b/>
@@ -2216,94 +1900,21 @@
           <w:iCs/>
           <w:lang w:val="es-ES"/>
         </w:rPr>
-        <w:t>fpc</w:t>
-      </w:r>
-      <w:proofErr w:type="spellEnd"/>
-      <w:r>
-        <w:rPr>
-          <w:b/>
-          <w:bCs/>
-          <w:i/>
-          <w:iCs/>
-          <w:lang w:val="es-ES"/>
-        </w:rPr>
-        <w:t xml:space="preserve"> -</w:t>
-      </w:r>
-      <w:proofErr w:type="spellStart"/>
-      <w:r>
-        <w:rPr>
-          <w:b/>
-          <w:bCs/>
-          <w:i/>
-          <w:iCs/>
-          <w:lang w:val="es-ES"/>
-        </w:rPr>
-        <w:t>gh</w:t>
-      </w:r>
-      <w:proofErr w:type="spellEnd"/>
-      <w:r>
-        <w:rPr>
-          <w:b/>
-          <w:bCs/>
-          <w:i/>
-          <w:iCs/>
-          <w:lang w:val="es-ES"/>
-        </w:rPr>
-        <w:t xml:space="preserve"> </w:t>
-      </w:r>
-      <w:proofErr w:type="spellStart"/>
-      <w:r>
-        <w:rPr>
-          <w:b/>
-          <w:bCs/>
-          <w:i/>
-          <w:iCs/>
-          <w:lang w:val="es-ES"/>
-        </w:rPr>
-        <w:t>nombre_archivo.pas</w:t>
-      </w:r>
-      <w:proofErr w:type="spellEnd"/>
-    </w:p>
-    <w:p>
-      <w:pPr>
-        <w:pStyle w:val="Sinespaciado"/>
-        <w:rPr>
-          <w:lang w:val="es-ES"/>
-        </w:rPr>
-      </w:pPr>
-      <w:r>
-        <w:rPr>
-          <w:lang w:val="es-ES"/>
-        </w:rPr>
-        <w:t>(-</w:t>
-      </w:r>
-      <w:proofErr w:type="spellStart"/>
-      <w:r>
-        <w:rPr>
-          <w:lang w:val="es-ES"/>
-        </w:rPr>
-        <w:t>gh</w:t>
-      </w:r>
-      <w:proofErr w:type="spellEnd"/>
-      <w:r>
-        <w:rPr>
-          <w:lang w:val="es-ES"/>
-        </w:rPr>
-        <w:t xml:space="preserve"> vincula la unidad </w:t>
-      </w:r>
-      <w:proofErr w:type="spellStart"/>
-      <w:r>
-        <w:rPr>
-          <w:lang w:val="es-ES"/>
-        </w:rPr>
-        <w:t>heaptrc</w:t>
-      </w:r>
-      <w:proofErr w:type="spellEnd"/>
-      <w:r>
-        <w:rPr>
-          <w:lang w:val="es-ES"/>
-        </w:rPr>
-        <w:t>, que reporta en consola cualquier bloque de memoria no liberado al finalizar la ejecución).</w:t>
+        <w:t>fpc -gh nombre_archivo.pas</w:t>
+      </w:r>
+    </w:p>
+    <w:p>
+      <w:pPr>
+        <w:pStyle w:val="Sinespaciado"/>
+        <w:rPr>
+          <w:lang w:val="es-ES"/>
+        </w:rPr>
+      </w:pPr>
+      <w:r>
+        <w:rPr>
+          <w:lang w:val="es-ES"/>
+        </w:rPr>
+        <w:t>(-gh vincula la unidad heaptrc, que reporta en consola cualquier bloque de memoria no liberado al finalizar la ejecución).</w:t>
       </w:r>
     </w:p>
     <w:p>
@@ -2349,41 +1960,13 @@
         </w:rPr>
         <w:t xml:space="preserve">Verificar la versión del compilador con </w:t>
       </w:r>
-      <w:proofErr w:type="spellStart"/>
-      <w:r>
-        <w:rPr>
-          <w:b/>
-          <w:bCs/>
-          <w:lang w:val="es-ES"/>
-        </w:rPr>
-        <w:t>fpc</w:t>
-      </w:r>
-      <w:proofErr w:type="spellEnd"/>
-      <w:r>
-        <w:rPr>
-          <w:b/>
-          <w:bCs/>
-          <w:lang w:val="es-ES"/>
-        </w:rPr>
-        <w:t xml:space="preserve"> -</w:t>
-      </w:r>
-      <w:proofErr w:type="spellStart"/>
-      <w:r>
-        <w:rPr>
-          <w:b/>
-          <w:bCs/>
-          <w:lang w:val="es-ES"/>
-        </w:rPr>
-        <w:t>iV</w:t>
-      </w:r>
-      <w:proofErr w:type="spellEnd"/>
-      <w:r>
-        <w:rPr>
-          <w:b/>
-          <w:bCs/>
-          <w:lang w:val="es-ES"/>
-        </w:rPr>
-        <w:t>.</w:t>
+      <w:r>
+        <w:rPr>
+          <w:b/>
+          <w:bCs/>
+          <w:lang w:val="es-ES"/>
+        </w:rPr>
+        <w:t>fpc -iV.</w:t>
       </w:r>
       <w:r>
         <w:rPr>
@@ -2415,25 +1998,7 @@
           <w:bCs/>
           <w:lang w:val="es-ES"/>
         </w:rPr>
-        <w:t>(-Co -Cr -</w:t>
-      </w:r>
-      <w:proofErr w:type="spellStart"/>
-      <w:r>
-        <w:rPr>
-          <w:b/>
-          <w:bCs/>
-          <w:lang w:val="es-ES"/>
-        </w:rPr>
-        <w:t>Mobjfpc</w:t>
-      </w:r>
-      <w:proofErr w:type="spellEnd"/>
-      <w:r>
-        <w:rPr>
-          <w:b/>
-          <w:bCs/>
-          <w:lang w:val="es-ES"/>
-        </w:rPr>
-        <w:t>).</w:t>
+        <w:t>(-Co -Cr -Mobjfpc).</w:t>
       </w:r>
       <w:r>
         <w:rPr>
@@ -2497,25 +2062,14 @@
           <w:bCs/>
           <w:lang w:val="es-ES"/>
         </w:rPr>
-        <w:t>-</w:t>
-      </w:r>
-      <w:proofErr w:type="spellStart"/>
-      <w:r>
-        <w:rPr>
-          <w:b/>
-          <w:bCs/>
-          <w:lang w:val="es-ES"/>
-        </w:rPr>
-        <w:t>gh</w:t>
-      </w:r>
-      <w:proofErr w:type="spellEnd"/>
+        <w:t>-gh</w:t>
+      </w:r>
       <w:r>
         <w:rPr>
           <w:lang w:val="es-ES"/>
         </w:rPr>
         <w:t xml:space="preserve"> para verificar ausencia de fugas de memoria mediante </w:t>
       </w:r>
-      <w:proofErr w:type="spellStart"/>
       <w:r>
         <w:rPr>
           <w:b/>
@@ -2524,7 +2078,6 @@
         </w:rPr>
         <w:t>heaptrc</w:t>
       </w:r>
-      <w:proofErr w:type="spellEnd"/>
       <w:r>
         <w:rPr>
           <w:lang w:val="es-ES"/>
@@ -2553,17 +2106,8 @@
           <w:b/>
           <w:bCs/>
         </w:rPr>
-        <w:t xml:space="preserve">Entrega y </w:t>
-      </w:r>
-      <w:proofErr w:type="spellStart"/>
-      <w:r>
-        <w:rPr>
-          <w:b/>
-          <w:bCs/>
-        </w:rPr>
-        <w:t>Evaluación</w:t>
-      </w:r>
-      <w:proofErr w:type="spellEnd"/>
+        <w:t>Entrega y Evaluación</w:t>
+      </w:r>
     </w:p>
     <w:p>
       <w:pPr>
@@ -2574,23 +2118,7 @@
         </w:numPr>
       </w:pPr>
       <w:r>
-        <w:t xml:space="preserve">Entrega </w:t>
-      </w:r>
-      <w:proofErr w:type="spellStart"/>
-      <w:r>
-        <w:t>en</w:t>
-      </w:r>
-      <w:proofErr w:type="spellEnd"/>
-      <w:r>
-        <w:t xml:space="preserve"> </w:t>
-      </w:r>
-      <w:proofErr w:type="spellStart"/>
-      <w:r>
-        <w:t>repositorio</w:t>
-      </w:r>
-      <w:proofErr w:type="spellEnd"/>
-      <w:r>
-        <w:t xml:space="preserve"> Git.</w:t>
+        <w:t>Entrega en repositorio Git.</w:t>
       </w:r>
     </w:p>
     <w:p>
@@ -2675,21 +2203,7 @@
         <w:rPr>
           <w:lang w:val="es-ES"/>
         </w:rPr>
-        <w:t xml:space="preserve">Si un solo punto y coma falta, la gravedad de la nave de entrenamiento se descalibrará y quedarás aplastado contra el suelo. Si no controlas el desbordamiento de memoria, tu propio </w:t>
-      </w:r>
-      <w:proofErr w:type="spellStart"/>
-      <w:r>
-        <w:rPr>
-          <w:lang w:val="es-ES"/>
-        </w:rPr>
-        <w:t>ki</w:t>
-      </w:r>
-      <w:proofErr w:type="spellEnd"/>
-      <w:r>
-        <w:rPr>
-          <w:lang w:val="es-ES"/>
-        </w:rPr>
-        <w:t xml:space="preserve"> destruirá tu cuerpo antes de alcanzar el Super Saiyajin. No tolero excusas, advertencias del compilador ni debilidades. Si tu código no compila al primer intento, tu calificación será un miserable cero. </w:t>
+        <w:t xml:space="preserve">Si un solo punto y coma falta, la gravedad de la nave de entrenamiento se descalibrará y quedarás aplastado contra el suelo. Si no controlas el desbordamiento de memoria, tu propio ki destruirá tu cuerpo antes de alcanzar el Super Saiyajin. No tolero excusas, advertencias del compilador ni debilidades. Si tu código no compila al primer intento, tu calificación será un miserable cero. </w:t>
       </w:r>
       <w:r>
         <w:rPr>
@@ -2701,21 +2215,7 @@
         <w:rPr>
           <w:lang w:val="es-ES"/>
         </w:rPr>
-        <w:t xml:space="preserve">Demuéstrame que llevas la sangre de un verdadero príncipe Saiyajin en tus venas o lárgate de </w:t>
-      </w:r>
-      <w:proofErr w:type="spellStart"/>
-      <w:r>
-        <w:rPr>
-          <w:lang w:val="es-ES"/>
-        </w:rPr>
-        <w:t>mi</w:t>
-      </w:r>
-      <w:proofErr w:type="spellEnd"/>
-      <w:r>
-        <w:rPr>
-          <w:lang w:val="es-ES"/>
-        </w:rPr>
-        <w:t xml:space="preserve"> nave.</w:t>
+        <w:t>Demuéstrame que llevas la sangre de un verdadero príncipe Saiyajin en tus venas o lárgate de mi nave.</w:t>
       </w:r>
     </w:p>
     <w:p>
@@ -2959,7 +2459,6 @@
         </w:rPr>
         <w:t xml:space="preserve">Cada instrucción que escribas dentro de la nave será evaluada por el núcleo de control bajo tres mandamientos inquebrantables: tipado estricto sin conversiones automáticas, delimitación limpia con bloques </w:t>
       </w:r>
-      <w:proofErr w:type="spellStart"/>
       <w:r>
         <w:rPr>
           <w:b/>
@@ -2968,14 +2467,12 @@
         </w:rPr>
         <w:t>begin</w:t>
       </w:r>
-      <w:proofErr w:type="spellEnd"/>
       <w:r>
         <w:rPr>
           <w:lang w:val="es-ES"/>
         </w:rPr>
         <w:t xml:space="preserve"> y </w:t>
       </w:r>
-      <w:proofErr w:type="spellStart"/>
       <w:r>
         <w:rPr>
           <w:b/>
@@ -2984,14 +2481,12 @@
         </w:rPr>
         <w:t>end</w:t>
       </w:r>
-      <w:proofErr w:type="spellEnd"/>
       <w:r>
         <w:rPr>
           <w:lang w:val="es-ES"/>
         </w:rPr>
         <w:t xml:space="preserve">, y cálculo exacto de cada celda de memoria para evitar que tu energía colapse el </w:t>
       </w:r>
-      <w:proofErr w:type="spellStart"/>
       <w:r>
         <w:rPr>
           <w:b/>
@@ -3000,7 +2495,6 @@
         </w:rPr>
         <w:t>scouter</w:t>
       </w:r>
-      <w:proofErr w:type="spellEnd"/>
       <w:r>
         <w:rPr>
           <w:lang w:val="es-ES"/>
@@ -3063,63 +2557,7 @@
         <w:rPr>
           <w:lang w:val="es-ES"/>
         </w:rPr>
-        <w:t xml:space="preserve">: cabecera </w:t>
-      </w:r>
-      <w:proofErr w:type="spellStart"/>
-      <w:r>
-        <w:rPr>
-          <w:lang w:val="es-ES"/>
-        </w:rPr>
-        <w:t>program</w:t>
-      </w:r>
-      <w:proofErr w:type="spellEnd"/>
-      <w:r>
-        <w:rPr>
-          <w:lang w:val="es-ES"/>
-        </w:rPr>
-        <w:t xml:space="preserve">, declaración obligatoria de variables en el bloque </w:t>
-      </w:r>
-      <w:proofErr w:type="spellStart"/>
-      <w:r>
-        <w:rPr>
-          <w:lang w:val="es-ES"/>
-        </w:rPr>
-        <w:t>var</w:t>
-      </w:r>
-      <w:proofErr w:type="spellEnd"/>
-      <w:r>
-        <w:rPr>
-          <w:lang w:val="es-ES"/>
-        </w:rPr>
-        <w:t xml:space="preserve">, y cuerpo delimitado por </w:t>
-      </w:r>
-      <w:proofErr w:type="spellStart"/>
-      <w:r>
-        <w:rPr>
-          <w:lang w:val="es-ES"/>
-        </w:rPr>
-        <w:t>begin</w:t>
-      </w:r>
-      <w:proofErr w:type="spellEnd"/>
-      <w:r>
-        <w:rPr>
-          <w:lang w:val="es-ES"/>
-        </w:rPr>
-        <w:t xml:space="preserve"> y </w:t>
-      </w:r>
-      <w:proofErr w:type="spellStart"/>
-      <w:r>
-        <w:rPr>
-          <w:lang w:val="es-ES"/>
-        </w:rPr>
-        <w:t>end</w:t>
-      </w:r>
-      <w:proofErr w:type="spellEnd"/>
-      <w:r>
-        <w:rPr>
-          <w:lang w:val="es-ES"/>
-        </w:rPr>
-        <w:t>.</w:t>
+        <w:t>: cabecera program, declaración obligatoria de variables en el bloque var, y cuerpo delimitado por begin y end.</w:t>
       </w:r>
     </w:p>
     <w:p>
@@ -3147,77 +2585,7 @@
         <w:rPr>
           <w:lang w:val="es-ES"/>
         </w:rPr>
-        <w:t>: enteros con signo (</w:t>
-      </w:r>
-      <w:proofErr w:type="spellStart"/>
-      <w:r>
-        <w:rPr>
-          <w:lang w:val="es-ES"/>
-        </w:rPr>
-        <w:t>ShortInt</w:t>
-      </w:r>
-      <w:proofErr w:type="spellEnd"/>
-      <w:r>
-        <w:rPr>
-          <w:lang w:val="es-ES"/>
-        </w:rPr>
-        <w:t xml:space="preserve">, </w:t>
-      </w:r>
-      <w:proofErr w:type="spellStart"/>
-      <w:r>
-        <w:rPr>
-          <w:lang w:val="es-ES"/>
-        </w:rPr>
-        <w:t>SmallInt</w:t>
-      </w:r>
-      <w:proofErr w:type="spellEnd"/>
-      <w:r>
-        <w:rPr>
-          <w:lang w:val="es-ES"/>
-        </w:rPr>
-        <w:t xml:space="preserve">, </w:t>
-      </w:r>
-      <w:proofErr w:type="spellStart"/>
-      <w:r>
-        <w:rPr>
-          <w:lang w:val="es-ES"/>
-        </w:rPr>
-        <w:t>Integer</w:t>
-      </w:r>
-      <w:proofErr w:type="spellEnd"/>
-      <w:r>
-        <w:rPr>
-          <w:lang w:val="es-ES"/>
-        </w:rPr>
-        <w:t xml:space="preserve">, </w:t>
-      </w:r>
-      <w:proofErr w:type="spellStart"/>
-      <w:r>
-        <w:rPr>
-          <w:lang w:val="es-ES"/>
-        </w:rPr>
-        <w:t>LongInt</w:t>
-      </w:r>
-      <w:proofErr w:type="spellEnd"/>
-      <w:r>
-        <w:rPr>
-          <w:lang w:val="es-ES"/>
-        </w:rPr>
-        <w:t>), coma flotante (Real), caracteres individuales (Char) y booleanos (</w:t>
-      </w:r>
-      <w:proofErr w:type="spellStart"/>
-      <w:r>
-        <w:rPr>
-          <w:lang w:val="es-ES"/>
-        </w:rPr>
-        <w:t>Boolean</w:t>
-      </w:r>
-      <w:proofErr w:type="spellEnd"/>
-      <w:r>
-        <w:rPr>
-          <w:lang w:val="es-ES"/>
-        </w:rPr>
-        <w:t>).</w:t>
+        <w:t>: enteros con signo (ShortInt, SmallInt, Integer, LongInt), coma flotante (Real), caracteres individuales (Char) y booleanos (Boolean).</w:t>
       </w:r>
     </w:p>
     <w:p>
@@ -3245,21 +2613,7 @@
         <w:rPr>
           <w:lang w:val="es-ES"/>
         </w:rPr>
-        <w:t xml:space="preserve">: operadores </w:t>
-      </w:r>
-      <w:proofErr w:type="spellStart"/>
-      <w:r>
-        <w:rPr>
-          <w:lang w:val="es-ES"/>
-        </w:rPr>
-        <w:t>div</w:t>
-      </w:r>
-      <w:proofErr w:type="spellEnd"/>
-      <w:r>
-        <w:rPr>
-          <w:lang w:val="es-ES"/>
-        </w:rPr>
-        <w:t xml:space="preserve"> (cociente entero) y mod (resto o módulo).</w:t>
+        <w:t>: operadores div (cociente entero) y mod (resto o módulo).</w:t>
       </w:r>
     </w:p>
     <w:p>
@@ -3289,7 +2643,6 @@
         </w:rPr>
         <w:t xml:space="preserve">: activación de comprobaciones en tiempo de ejecución mediante {$Q+} (detección de </w:t>
       </w:r>
-      <w:proofErr w:type="spellStart"/>
       <w:r>
         <w:rPr>
           <w:i/>
@@ -3298,7 +2651,6 @@
         </w:rPr>
         <w:t>overflow</w:t>
       </w:r>
-      <w:proofErr w:type="spellEnd"/>
       <w:r>
         <w:rPr>
           <w:lang w:val="es-ES"/>
@@ -3505,7 +2857,6 @@
           <w:numId w:val="3"/>
         </w:numPr>
       </w:pPr>
-      <w:proofErr w:type="spellStart"/>
       <w:r>
         <w:rPr>
           <w:b/>
@@ -3513,15 +2864,12 @@
         </w:rPr>
         <w:t>Archivo</w:t>
       </w:r>
-      <w:proofErr w:type="spellEnd"/>
       <w:r>
         <w:t xml:space="preserve">: </w:t>
       </w:r>
-      <w:proofErr w:type="spellStart"/>
       <w:r>
         <w:t>saiyan_power.pas</w:t>
       </w:r>
-      <w:proofErr w:type="spellEnd"/>
     </w:p>
     <w:p>
       <w:pPr>
@@ -3550,11 +2898,9 @@
         </w:rPr>
         <w:t xml:space="preserve">: </w:t>
       </w:r>
-      <w:proofErr w:type="spellStart"/>
       <w:r>
         <w:t>writeln</w:t>
       </w:r>
-      <w:proofErr w:type="spellEnd"/>
     </w:p>
     <w:p>
       <w:pPr>
@@ -3590,21 +2936,7 @@
         <w:rPr>
           <w:lang w:val="es-ES"/>
         </w:rPr>
-        <w:t xml:space="preserve">Escribir tu primer programa en Pascal. El príncipe Vegeta ha activado su </w:t>
-      </w:r>
-      <w:proofErr w:type="spellStart"/>
-      <w:r>
-        <w:rPr>
-          <w:lang w:val="es-ES"/>
-        </w:rPr>
-        <w:t>scouter</w:t>
-      </w:r>
-      <w:proofErr w:type="spellEnd"/>
-      <w:r>
-        <w:rPr>
-          <w:lang w:val="es-ES"/>
-        </w:rPr>
-        <w:t xml:space="preserve"> y necesita mostrar el mensaje que anuncia el inicio de su entrenamiento. Tu misión es imprimir exactamente el texto solicitado en la terminal.</w:t>
+        <w:t>Escribir tu primer programa en Pascal. El príncipe Vegeta ha activado su scouter y necesita mostrar el mensaje que anuncia el inicio de su entrenamiento. Tu misión es imprimir exactamente el texto solicitado en la terminal.</w:t>
       </w:r>
     </w:p>
     <w:p>
@@ -3736,60 +3068,14 @@
                               <w:rPr>
                                 <w:rFonts w:ascii="Cascadia Mono SemiBold" w:hAnsi="Cascadia Mono SemiBold" w:cs="Cascadia Mono SemiBold"/>
                               </w:rPr>
-                              <w:t xml:space="preserve">I am the Prince of all </w:t>
-                            </w:r>
-                            <w:proofErr w:type="spellStart"/>
-                            <w:r>
-                              <w:rPr>
-                                <w:rFonts w:ascii="Cascadia Mono SemiBold" w:hAnsi="Cascadia Mono SemiBold" w:cs="Cascadia Mono SemiBold"/>
-                              </w:rPr>
-                              <w:t>Saiyans</w:t>
-                            </w:r>
-                            <w:proofErr w:type="spellEnd"/>
-                            <w:r>
-                              <w:rPr>
-                                <w:rFonts w:ascii="Cascadia Mono SemiBold" w:hAnsi="Cascadia Mono SemiBold" w:cs="Cascadia Mono SemiBold"/>
-                              </w:rPr>
-                              <w:t xml:space="preserve">! </w:t>
+                              <w:t xml:space="preserve">I am the Prince of all Saiyans! </w:t>
                             </w:r>
                             <w:r>
                               <w:rPr>
                                 <w:rFonts w:ascii="Cascadia Mono SemiBold" w:hAnsi="Cascadia Mono SemiBold" w:cs="Cascadia Mono SemiBold"/>
                                 <w:lang w:val="es-ES"/>
                               </w:rPr>
-                              <w:t xml:space="preserve">Training </w:t>
-                            </w:r>
-                            <w:proofErr w:type="spellStart"/>
-                            <w:r>
-                              <w:rPr>
-                                <w:rFonts w:ascii="Cascadia Mono SemiBold" w:hAnsi="Cascadia Mono SemiBold" w:cs="Cascadia Mono SemiBold"/>
-                                <w:lang w:val="es-ES"/>
-                              </w:rPr>
-                              <w:t>starts</w:t>
-                            </w:r>
-                            <w:proofErr w:type="spellEnd"/>
-                            <w:r>
-                              <w:rPr>
-                                <w:rFonts w:ascii="Cascadia Mono SemiBold" w:hAnsi="Cascadia Mono SemiBold" w:cs="Cascadia Mono SemiBold"/>
-                                <w:lang w:val="es-ES"/>
-                              </w:rPr>
-                              <w:t xml:space="preserve"> </w:t>
-                            </w:r>
-                            <w:proofErr w:type="spellStart"/>
-                            <w:r>
-                              <w:rPr>
-                                <w:rFonts w:ascii="Cascadia Mono SemiBold" w:hAnsi="Cascadia Mono SemiBold" w:cs="Cascadia Mono SemiBold"/>
-                                <w:lang w:val="es-ES"/>
-                              </w:rPr>
-                              <w:t>now</w:t>
-                            </w:r>
-                            <w:proofErr w:type="spellEnd"/>
-                            <w:r>
-                              <w:rPr>
-                                <w:rFonts w:ascii="Cascadia Mono SemiBold" w:hAnsi="Cascadia Mono SemiBold" w:cs="Cascadia Mono SemiBold"/>
-                                <w:lang w:val="es-ES"/>
-                              </w:rPr>
-                              <w:t>.</w:t>
+                              <w:t>Training starts now.</w:t>
                             </w:r>
                           </w:p>
                         </w:txbxContent>
@@ -3829,60 +3115,14 @@
                         <w:rPr>
                           <w:rFonts w:ascii="Cascadia Mono SemiBold" w:hAnsi="Cascadia Mono SemiBold" w:cs="Cascadia Mono SemiBold"/>
                         </w:rPr>
-                        <w:t xml:space="preserve">I am the Prince of all </w:t>
-                      </w:r>
-                      <w:proofErr w:type="spellStart"/>
-                      <w:r>
-                        <w:rPr>
-                          <w:rFonts w:ascii="Cascadia Mono SemiBold" w:hAnsi="Cascadia Mono SemiBold" w:cs="Cascadia Mono SemiBold"/>
-                        </w:rPr>
-                        <w:t>Saiyans</w:t>
-                      </w:r>
-                      <w:proofErr w:type="spellEnd"/>
-                      <w:r>
-                        <w:rPr>
-                          <w:rFonts w:ascii="Cascadia Mono SemiBold" w:hAnsi="Cascadia Mono SemiBold" w:cs="Cascadia Mono SemiBold"/>
-                        </w:rPr>
-                        <w:t xml:space="preserve">! </w:t>
+                        <w:t xml:space="preserve">I am the Prince of all Saiyans! </w:t>
                       </w:r>
                       <w:r>
                         <w:rPr>
                           <w:rFonts w:ascii="Cascadia Mono SemiBold" w:hAnsi="Cascadia Mono SemiBold" w:cs="Cascadia Mono SemiBold"/>
                           <w:lang w:val="es-ES"/>
                         </w:rPr>
-                        <w:t xml:space="preserve">Training </w:t>
-                      </w:r>
-                      <w:proofErr w:type="spellStart"/>
-                      <w:r>
-                        <w:rPr>
-                          <w:rFonts w:ascii="Cascadia Mono SemiBold" w:hAnsi="Cascadia Mono SemiBold" w:cs="Cascadia Mono SemiBold"/>
-                          <w:lang w:val="es-ES"/>
-                        </w:rPr>
-                        <w:t>starts</w:t>
-                      </w:r>
-                      <w:proofErr w:type="spellEnd"/>
-                      <w:r>
-                        <w:rPr>
-                          <w:rFonts w:ascii="Cascadia Mono SemiBold" w:hAnsi="Cascadia Mono SemiBold" w:cs="Cascadia Mono SemiBold"/>
-                          <w:lang w:val="es-ES"/>
-                        </w:rPr>
-                        <w:t xml:space="preserve"> </w:t>
-                      </w:r>
-                      <w:proofErr w:type="spellStart"/>
-                      <w:r>
-                        <w:rPr>
-                          <w:rFonts w:ascii="Cascadia Mono SemiBold" w:hAnsi="Cascadia Mono SemiBold" w:cs="Cascadia Mono SemiBold"/>
-                          <w:lang w:val="es-ES"/>
-                        </w:rPr>
-                        <w:t>now</w:t>
-                      </w:r>
-                      <w:proofErr w:type="spellEnd"/>
-                      <w:r>
-                        <w:rPr>
-                          <w:rFonts w:ascii="Cascadia Mono SemiBold" w:hAnsi="Cascadia Mono SemiBold" w:cs="Cascadia Mono SemiBold"/>
-                          <w:lang w:val="es-ES"/>
-                        </w:rPr>
-                        <w:t>.</w:t>
+                        <w:t>Training starts now.</w:t>
                       </w:r>
                     </w:p>
                   </w:txbxContent>
@@ -3929,21 +3169,7 @@
         <w:rPr>
           <w:lang w:val="es-ES"/>
         </w:rPr>
-        <w:t xml:space="preserve">No debes solicitar datos al usuario ni realizar cálculos. Solo necesitas utilizar la instrucción </w:t>
-      </w:r>
-      <w:proofErr w:type="spellStart"/>
-      <w:r>
-        <w:rPr>
-          <w:lang w:val="es-ES"/>
-        </w:rPr>
-        <w:t>writeln</w:t>
-      </w:r>
-      <w:proofErr w:type="spellEnd"/>
-      <w:r>
-        <w:rPr>
-          <w:lang w:val="es-ES"/>
-        </w:rPr>
-        <w:t>.</w:t>
+        <w:t>No debes solicitar datos al usuario ni realizar cálculos. Solo necesitas utilizar la instrucción writeln.</w:t>
       </w:r>
       <w:r>
         <w:rPr>
@@ -3952,60 +3178,7 @@
         <w:t xml:space="preserve"> </w:t>
       </w:r>
       <w:r>
-        <w:t xml:space="preserve">El </w:t>
-      </w:r>
-      <w:proofErr w:type="spellStart"/>
-      <w:r>
-        <w:t>programa</w:t>
-      </w:r>
-      <w:proofErr w:type="spellEnd"/>
-      <w:r>
-        <w:t xml:space="preserve"> </w:t>
-      </w:r>
-      <w:proofErr w:type="spellStart"/>
-      <w:r>
-        <w:t>debe</w:t>
-      </w:r>
-      <w:proofErr w:type="spellEnd"/>
-      <w:r>
-        <w:t xml:space="preserve"> </w:t>
-      </w:r>
-      <w:proofErr w:type="spellStart"/>
-      <w:r>
-        <w:t>compilar</w:t>
-      </w:r>
-      <w:proofErr w:type="spellEnd"/>
-      <w:r>
-        <w:t xml:space="preserve"> </w:t>
-      </w:r>
-      <w:proofErr w:type="spellStart"/>
-      <w:r>
-        <w:t>correctamente</w:t>
-      </w:r>
-      <w:proofErr w:type="spellEnd"/>
-      <w:r>
-        <w:t xml:space="preserve"> </w:t>
-      </w:r>
-      <w:proofErr w:type="spellStart"/>
-      <w:r>
-        <w:t>como</w:t>
-      </w:r>
-      <w:proofErr w:type="spellEnd"/>
-      <w:r>
-        <w:t xml:space="preserve"> un </w:t>
-      </w:r>
-      <w:proofErr w:type="spellStart"/>
-      <w:proofErr w:type="gramStart"/>
-      <w:r>
-        <w:t>archivo</w:t>
-      </w:r>
-      <w:proofErr w:type="spellEnd"/>
-      <w:r>
-        <w:t xml:space="preserve"> .pas</w:t>
-      </w:r>
-      <w:proofErr w:type="gramEnd"/>
-      <w:r>
-        <w:t>.</w:t>
+        <w:t>El programa debe compilar correctamente como un archivo .pas.</w:t>
       </w:r>
     </w:p>
     <w:p>
@@ -4091,28 +3264,12 @@
         <w:t xml:space="preserve">1: </w:t>
       </w:r>
       <w:bookmarkEnd w:id="5"/>
-      <w:proofErr w:type="spellStart"/>
-      <w:r>
-        <w:rPr>
-          <w:bCs/>
-        </w:rPr>
-        <w:t>Calibrador</w:t>
-      </w:r>
-      <w:proofErr w:type="spellEnd"/>
-      <w:r>
-        <w:rPr>
-          <w:bCs/>
-        </w:rPr>
-        <w:t xml:space="preserve"> de </w:t>
-      </w:r>
-      <w:proofErr w:type="spellStart"/>
-      <w:r>
-        <w:rPr>
-          <w:bCs/>
-        </w:rPr>
-        <w:t>Gravedad</w:t>
-      </w:r>
-      <w:proofErr w:type="spellEnd"/>
+      <w:r>
+        <w:rPr>
+          <w:bCs/>
+        </w:rPr>
+        <w:t>Calibrador de Gravedad</w:t>
+      </w:r>
     </w:p>
     <w:p>
       <w:pPr>
@@ -4163,7 +3320,6 @@
           <w:lang w:val="es-ES"/>
         </w:rPr>
       </w:pPr>
-      <w:proofErr w:type="spellStart"/>
       <w:r>
         <w:rPr>
           <w:b/>
@@ -4171,15 +3327,12 @@
         </w:rPr>
         <w:t>Archivo</w:t>
       </w:r>
-      <w:proofErr w:type="spellEnd"/>
       <w:r>
         <w:t xml:space="preserve">: </w:t>
       </w:r>
-      <w:proofErr w:type="spellStart"/>
       <w:r>
         <w:t>gravity_level.pas</w:t>
       </w:r>
-      <w:proofErr w:type="spellEnd"/>
     </w:p>
     <w:p>
       <w:pPr>
@@ -4206,19 +3359,9 @@
         </w:rPr>
         <w:t xml:space="preserve">: </w:t>
       </w:r>
-      <w:proofErr w:type="spellStart"/>
-      <w:r>
-        <w:t>readln</w:t>
-      </w:r>
-      <w:proofErr w:type="spellEnd"/>
-      <w:r>
-        <w:t xml:space="preserve">, </w:t>
-      </w:r>
-      <w:proofErr w:type="spellStart"/>
-      <w:r>
-        <w:t>writeln</w:t>
-      </w:r>
-      <w:proofErr w:type="spellEnd"/>
+      <w:r>
+        <w:t>readln, writeln</w:t>
+      </w:r>
     </w:p>
     <w:p>
       <w:pPr>
@@ -4320,23 +3463,7 @@
         <w:pStyle w:val="Sinespaciado"/>
       </w:pPr>
       <w:r>
-        <w:t xml:space="preserve">El </w:t>
-      </w:r>
-      <w:proofErr w:type="spellStart"/>
-      <w:r>
-        <w:t>programa</w:t>
-      </w:r>
-      <w:proofErr w:type="spellEnd"/>
-      <w:r>
-        <w:t xml:space="preserve"> </w:t>
-      </w:r>
-      <w:proofErr w:type="spellStart"/>
-      <w:r>
-        <w:t>debe</w:t>
-      </w:r>
-      <w:proofErr w:type="spellEnd"/>
-      <w:r>
-        <w:t>:</w:t>
+        <w:t>El programa debe:</w:t>
       </w:r>
     </w:p>
     <w:p>
@@ -4383,21 +3510,8 @@
           <w:numId w:val="17"/>
         </w:numPr>
       </w:pPr>
-      <w:proofErr w:type="spellStart"/>
-      <w:r>
-        <w:t>Mostrar</w:t>
-      </w:r>
-      <w:proofErr w:type="spellEnd"/>
-      <w:r>
-        <w:t xml:space="preserve"> el </w:t>
-      </w:r>
-      <w:proofErr w:type="spellStart"/>
-      <w:r>
-        <w:t>nivel</w:t>
-      </w:r>
-      <w:proofErr w:type="spellEnd"/>
-      <w:r>
-        <w:t xml:space="preserve"> actual. </w:t>
+      <w:r>
+        <w:t xml:space="preserve">Mostrar el nivel actual. </w:t>
       </w:r>
     </w:p>
     <w:p>
@@ -4608,21 +3722,7 @@
                               <w:rPr>
                                 <w:rFonts w:ascii="Cascadia Mono SemiBold" w:hAnsi="Cascadia Mono SemiBold" w:cs="Cascadia Mono SemiBold"/>
                               </w:rPr>
-                              <w:t xml:space="preserve">System: You need </w:t>
-                            </w:r>
-                            <w:proofErr w:type="gramStart"/>
-                            <w:r>
-                              <w:rPr>
-                                <w:rFonts w:ascii="Cascadia Mono SemiBold" w:hAnsi="Cascadia Mono SemiBold" w:cs="Cascadia Mono SemiBold"/>
-                              </w:rPr>
-                              <w:t>0G more</w:t>
-                            </w:r>
-                            <w:proofErr w:type="gramEnd"/>
-                            <w:r>
-                              <w:rPr>
-                                <w:rFonts w:ascii="Cascadia Mono SemiBold" w:hAnsi="Cascadia Mono SemiBold" w:cs="Cascadia Mono SemiBold"/>
-                              </w:rPr>
-                              <w:t xml:space="preserve"> to reach maximum training level!</w:t>
+                              <w:t>System: You need 0G more to reach maximum training level!</w:t>
                             </w:r>
                           </w:p>
                         </w:txbxContent>
@@ -4747,21 +3847,7 @@
                         <w:rPr>
                           <w:rFonts w:ascii="Cascadia Mono SemiBold" w:hAnsi="Cascadia Mono SemiBold" w:cs="Cascadia Mono SemiBold"/>
                         </w:rPr>
-                        <w:t xml:space="preserve">System: You need </w:t>
-                      </w:r>
-                      <w:proofErr w:type="gramStart"/>
-                      <w:r>
-                        <w:rPr>
-                          <w:rFonts w:ascii="Cascadia Mono SemiBold" w:hAnsi="Cascadia Mono SemiBold" w:cs="Cascadia Mono SemiBold"/>
-                        </w:rPr>
-                        <w:t>0G more</w:t>
-                      </w:r>
-                      <w:proofErr w:type="gramEnd"/>
-                      <w:r>
-                        <w:rPr>
-                          <w:rFonts w:ascii="Cascadia Mono SemiBold" w:hAnsi="Cascadia Mono SemiBold" w:cs="Cascadia Mono SemiBold"/>
-                        </w:rPr>
-                        <w:t xml:space="preserve"> to reach maximum training level!</w:t>
+                        <w:t>System: You need 0G more to reach maximum training level!</w:t>
                       </w:r>
                     </w:p>
                   </w:txbxContent>
@@ -4857,17 +3943,8 @@
           <w:bCs/>
           <w:lang w:val="es-ES"/>
         </w:rPr>
-        <w:t xml:space="preserve">Detección de Ki con </w:t>
-      </w:r>
-      <w:proofErr w:type="spellStart"/>
-      <w:r>
-        <w:rPr>
-          <w:bCs/>
-          <w:lang w:val="es-ES"/>
-        </w:rPr>
-        <w:t>Scouter</w:t>
-      </w:r>
-      <w:proofErr w:type="spellEnd"/>
+        <w:t>Detección de Ki con Scouter</w:t>
+      </w:r>
     </w:p>
     <w:p>
       <w:pPr>
@@ -4912,7 +3989,6 @@
           <w:numId w:val="4"/>
         </w:numPr>
       </w:pPr>
-      <w:proofErr w:type="spellStart"/>
       <w:r>
         <w:rPr>
           <w:b/>
@@ -4920,15 +3996,12 @@
         </w:rPr>
         <w:t>Archivo</w:t>
       </w:r>
-      <w:proofErr w:type="spellEnd"/>
       <w:r>
         <w:t xml:space="preserve">: </w:t>
       </w:r>
-      <w:proofErr w:type="spellStart"/>
       <w:r>
         <w:t>scouter_calc.pas</w:t>
       </w:r>
-      <w:proofErr w:type="spellEnd"/>
     </w:p>
     <w:p>
       <w:pPr>
@@ -4955,19 +4028,9 @@
         </w:rPr>
         <w:t xml:space="preserve">: </w:t>
       </w:r>
-      <w:proofErr w:type="spellStart"/>
-      <w:r>
-        <w:t>readln</w:t>
-      </w:r>
-      <w:proofErr w:type="spellEnd"/>
-      <w:r>
-        <w:t xml:space="preserve">, </w:t>
-      </w:r>
-      <w:proofErr w:type="spellStart"/>
-      <w:r>
-        <w:t>writeln</w:t>
-      </w:r>
-      <w:proofErr w:type="spellEnd"/>
+      <w:r>
+        <w:t>readln, writeln</w:t>
+      </w:r>
     </w:p>
     <w:p>
       <w:pPr>
@@ -5003,91 +4066,21 @@
         <w:rPr>
           <w:lang w:val="es-ES"/>
         </w:rPr>
-        <w:t xml:space="preserve">Leer el nivel de </w:t>
-      </w:r>
-      <w:proofErr w:type="spellStart"/>
-      <w:r>
-        <w:rPr>
-          <w:lang w:val="es-ES"/>
-        </w:rPr>
-        <w:t>ki</w:t>
-      </w:r>
-      <w:proofErr w:type="spellEnd"/>
-      <w:r>
-        <w:rPr>
-          <w:lang w:val="es-ES"/>
-        </w:rPr>
-        <w:t xml:space="preserve"> base de un adversario (tipo Real). El </w:t>
-      </w:r>
-      <w:proofErr w:type="spellStart"/>
-      <w:r>
-        <w:rPr>
-          <w:lang w:val="es-ES"/>
-        </w:rPr>
-        <w:t>scouter</w:t>
-      </w:r>
-      <w:proofErr w:type="spellEnd"/>
-      <w:r>
-        <w:rPr>
-          <w:lang w:val="es-ES"/>
-        </w:rPr>
-        <w:t xml:space="preserve"> calcula el multiplicador del </w:t>
-      </w:r>
-      <w:proofErr w:type="spellStart"/>
-      <w:r>
-        <w:rPr>
-          <w:lang w:val="es-ES"/>
-        </w:rPr>
-        <w:t>Ōzaru</w:t>
-      </w:r>
-      <w:proofErr w:type="spellEnd"/>
-      <w:r>
-        <w:rPr>
-          <w:lang w:val="es-ES"/>
-        </w:rPr>
-        <w:t xml:space="preserve"> (mono gigante), que es exactamente 10.0 veces el </w:t>
-      </w:r>
-      <w:proofErr w:type="spellStart"/>
-      <w:r>
-        <w:rPr>
-          <w:lang w:val="es-ES"/>
-        </w:rPr>
-        <w:t>ki</w:t>
-      </w:r>
-      <w:proofErr w:type="spellEnd"/>
-      <w:r>
-        <w:rPr>
-          <w:lang w:val="es-ES"/>
-        </w:rPr>
-        <w:t xml:space="preserve"> base. </w:t>
-      </w:r>
-    </w:p>
-    <w:p>
-      <w:pPr>
-        <w:pStyle w:val="Sinespaciado"/>
-        <w:rPr>
-          <w:lang w:val="es-ES"/>
-        </w:rPr>
-      </w:pPr>
-      <w:r>
-        <w:rPr>
-          <w:lang w:val="es-ES"/>
-        </w:rPr>
-        <w:t xml:space="preserve">La salida debe mostrarse estrictamente formateada con 2 decimales </w:t>
-      </w:r>
-      <w:proofErr w:type="gramStart"/>
-      <w:r>
-        <w:rPr>
-          <w:lang w:val="es-ES"/>
-        </w:rPr>
-        <w:t>(:0:2</w:t>
-      </w:r>
-      <w:proofErr w:type="gramEnd"/>
-      <w:r>
-        <w:rPr>
-          <w:lang w:val="es-ES"/>
-        </w:rPr>
-        <w:t>).</w:t>
+        <w:t xml:space="preserve">Leer el nivel de ki base de un adversario (tipo Real). El scouter calcula el multiplicador del Ōzaru (mono gigante), que es exactamente 10.0 veces el ki base. </w:t>
+      </w:r>
+    </w:p>
+    <w:p>
+      <w:pPr>
+        <w:pStyle w:val="Sinespaciado"/>
+        <w:rPr>
+          <w:lang w:val="es-ES"/>
+        </w:rPr>
+      </w:pPr>
+      <w:r>
+        <w:rPr>
+          <w:lang w:val="es-ES"/>
+        </w:rPr>
+        <w:t>La salida debe mostrarse estrictamente formateada con 2 decimales (:0:2).</w:t>
       </w:r>
     </w:p>
     <w:p>
@@ -5129,21 +4122,7 @@
         <w:rPr>
           <w:lang w:val="es-ES"/>
         </w:rPr>
-        <w:t xml:space="preserve">Declara una variable de tipo Real para el </w:t>
-      </w:r>
-      <w:proofErr w:type="spellStart"/>
-      <w:r>
-        <w:rPr>
-          <w:lang w:val="es-ES"/>
-        </w:rPr>
-        <w:t>ki</w:t>
-      </w:r>
-      <w:proofErr w:type="spellEnd"/>
-      <w:r>
-        <w:rPr>
-          <w:lang w:val="es-ES"/>
-        </w:rPr>
-        <w:t xml:space="preserve"> base. </w:t>
+        <w:t xml:space="preserve">Declara una variable de tipo Real para el ki base. </w:t>
       </w:r>
     </w:p>
     <w:p>
@@ -5161,21 +4140,7 @@
         <w:rPr>
           <w:lang w:val="es-ES"/>
         </w:rPr>
-        <w:t xml:space="preserve">Lee el valor introducido por el usuario con </w:t>
-      </w:r>
-      <w:proofErr w:type="spellStart"/>
-      <w:r>
-        <w:rPr>
-          <w:lang w:val="es-ES"/>
-        </w:rPr>
-        <w:t>ReadLn</w:t>
-      </w:r>
-      <w:proofErr w:type="spellEnd"/>
-      <w:r>
-        <w:rPr>
-          <w:lang w:val="es-ES"/>
-        </w:rPr>
-        <w:t xml:space="preserve">. </w:t>
+        <w:t xml:space="preserve">Lee el valor introducido por el usuario con ReadLn. </w:t>
       </w:r>
     </w:p>
     <w:p>
@@ -5193,35 +4158,7 @@
         <w:rPr>
           <w:lang w:val="es-ES"/>
         </w:rPr>
-        <w:t xml:space="preserve">Calcula el </w:t>
-      </w:r>
-      <w:proofErr w:type="spellStart"/>
-      <w:r>
-        <w:rPr>
-          <w:lang w:val="es-ES"/>
-        </w:rPr>
-        <w:t>ki</w:t>
-      </w:r>
-      <w:proofErr w:type="spellEnd"/>
-      <w:r>
-        <w:rPr>
-          <w:lang w:val="es-ES"/>
-        </w:rPr>
-        <w:t xml:space="preserve"> del </w:t>
-      </w:r>
-      <w:proofErr w:type="spellStart"/>
-      <w:r>
-        <w:rPr>
-          <w:lang w:val="es-ES"/>
-        </w:rPr>
-        <w:t>Ōzaru</w:t>
-      </w:r>
-      <w:proofErr w:type="spellEnd"/>
-      <w:r>
-        <w:rPr>
-          <w:lang w:val="es-ES"/>
-        </w:rPr>
-        <w:t xml:space="preserve"> multiplicando ese valor por 10.0. </w:t>
+        <w:t xml:space="preserve">Calcula el ki del Ōzaru multiplicando ese valor por 10.0. </w:t>
       </w:r>
     </w:p>
     <w:p>
@@ -5366,23 +4303,7 @@
                                 <w:rFonts w:ascii="Cascadia Mono SemiBold" w:hAnsi="Cascadia Mono SemiBold" w:cs="Cascadia Mono SemiBold"/>
                                 <w:lang w:val="es-ES"/>
                               </w:rPr>
-                              <w:t xml:space="preserve">Ozaru Ki </w:t>
-                            </w:r>
-                            <w:proofErr w:type="spellStart"/>
-                            <w:r>
-                              <w:rPr>
-                                <w:rFonts w:ascii="Cascadia Mono SemiBold" w:hAnsi="Cascadia Mono SemiBold" w:cs="Cascadia Mono SemiBold"/>
-                                <w:lang w:val="es-ES"/>
-                              </w:rPr>
-                              <w:t>multiplier</w:t>
-                            </w:r>
-                            <w:proofErr w:type="spellEnd"/>
-                            <w:r>
-                              <w:rPr>
-                                <w:rFonts w:ascii="Cascadia Mono SemiBold" w:hAnsi="Cascadia Mono SemiBold" w:cs="Cascadia Mono SemiBold"/>
-                                <w:lang w:val="es-ES"/>
-                              </w:rPr>
-                              <w:t>: 12004.50</w:t>
+                              <w:t>Ozaru Ki multiplier: 12004.50</w:t>
                             </w:r>
                           </w:p>
                         </w:txbxContent>
@@ -5439,23 +4360,7 @@
                           <w:rFonts w:ascii="Cascadia Mono SemiBold" w:hAnsi="Cascadia Mono SemiBold" w:cs="Cascadia Mono SemiBold"/>
                           <w:lang w:val="es-ES"/>
                         </w:rPr>
-                        <w:t xml:space="preserve">Ozaru Ki </w:t>
-                      </w:r>
-                      <w:proofErr w:type="spellStart"/>
-                      <w:r>
-                        <w:rPr>
-                          <w:rFonts w:ascii="Cascadia Mono SemiBold" w:hAnsi="Cascadia Mono SemiBold" w:cs="Cascadia Mono SemiBold"/>
-                          <w:lang w:val="es-ES"/>
-                        </w:rPr>
-                        <w:t>multiplier</w:t>
-                      </w:r>
-                      <w:proofErr w:type="spellEnd"/>
-                      <w:r>
-                        <w:rPr>
-                          <w:rFonts w:ascii="Cascadia Mono SemiBold" w:hAnsi="Cascadia Mono SemiBold" w:cs="Cascadia Mono SemiBold"/>
-                          <w:lang w:val="es-ES"/>
-                        </w:rPr>
-                        <w:t>: 12004.50</w:t>
+                        <w:t>Ozaru Ki multiplier: 12004.50</w:t>
                       </w:r>
                     </w:p>
                   </w:txbxContent>
@@ -5575,17 +4480,8 @@
           <w:bCs/>
           <w:lang w:val="es-ES"/>
         </w:rPr>
-        <w:t xml:space="preserve">Raciones de Semillas </w:t>
-      </w:r>
-      <w:proofErr w:type="spellStart"/>
-      <w:r>
-        <w:rPr>
-          <w:bCs/>
-          <w:lang w:val="es-ES"/>
-        </w:rPr>
-        <w:t>Senzu</w:t>
-      </w:r>
-      <w:proofErr w:type="spellEnd"/>
+        <w:t>Raciones de Semillas Senzu</w:t>
+      </w:r>
     </w:p>
     <w:p>
       <w:pPr>
@@ -5633,7 +4529,6 @@
           <w:numId w:val="4"/>
         </w:numPr>
       </w:pPr>
-      <w:proofErr w:type="spellStart"/>
       <w:r>
         <w:rPr>
           <w:b/>
@@ -5641,15 +4536,12 @@
         </w:rPr>
         <w:t>Archivo</w:t>
       </w:r>
-      <w:proofErr w:type="spellEnd"/>
       <w:r>
         <w:t xml:space="preserve">: </w:t>
       </w:r>
-      <w:proofErr w:type="spellStart"/>
       <w:r>
         <w:t>senzu_distributor.pas</w:t>
       </w:r>
-      <w:proofErr w:type="spellEnd"/>
     </w:p>
     <w:p>
       <w:pPr>
@@ -5659,47 +4551,19 @@
           <w:numId w:val="4"/>
         </w:numPr>
       </w:pPr>
-      <w:proofErr w:type="spellStart"/>
-      <w:r>
-        <w:rPr>
-          <w:b/>
-          <w:bCs/>
-        </w:rPr>
-        <w:t>Funciones</w:t>
-      </w:r>
-      <w:proofErr w:type="spellEnd"/>
-      <w:r>
-        <w:rPr>
-          <w:b/>
-          <w:bCs/>
-        </w:rPr>
-        <w:t xml:space="preserve"> </w:t>
-      </w:r>
-      <w:proofErr w:type="spellStart"/>
-      <w:r>
-        <w:rPr>
-          <w:b/>
-          <w:bCs/>
-        </w:rPr>
-        <w:t>autorizadas</w:t>
-      </w:r>
-      <w:proofErr w:type="spellEnd"/>
+      <w:r>
+        <w:rPr>
+          <w:b/>
+          <w:bCs/>
+        </w:rPr>
+        <w:t>Funciones autorizadas</w:t>
+      </w:r>
       <w:r>
         <w:t xml:space="preserve">: </w:t>
       </w:r>
-      <w:proofErr w:type="spellStart"/>
-      <w:r>
-        <w:t>readln</w:t>
-      </w:r>
-      <w:proofErr w:type="spellEnd"/>
-      <w:r>
-        <w:t xml:space="preserve">, </w:t>
-      </w:r>
-      <w:proofErr w:type="spellStart"/>
-      <w:r>
-        <w:t>writeln</w:t>
-      </w:r>
-      <w:proofErr w:type="spellEnd"/>
+      <w:r>
+        <w:t>readln, writeln</w:t>
+      </w:r>
     </w:p>
     <w:p>
       <w:pPr>
@@ -5790,21 +4654,7 @@
         <w:rPr>
           <w:lang w:val="es-ES"/>
         </w:rPr>
-        <w:t xml:space="preserve">Declara una variable </w:t>
-      </w:r>
-      <w:proofErr w:type="spellStart"/>
-      <w:r>
-        <w:rPr>
-          <w:lang w:val="es-ES"/>
-        </w:rPr>
-        <w:t>Integer</w:t>
-      </w:r>
-      <w:proofErr w:type="spellEnd"/>
-      <w:r>
-        <w:rPr>
-          <w:lang w:val="es-ES"/>
-        </w:rPr>
-        <w:t xml:space="preserve"> para el total de semillas (N). </w:t>
+        <w:t xml:space="preserve">Declara una variable Integer para el total de semillas (N). </w:t>
       </w:r>
     </w:p>
     <w:p>
@@ -5822,21 +4672,7 @@
         <w:rPr>
           <w:lang w:val="es-ES"/>
         </w:rPr>
-        <w:t xml:space="preserve">Lee el valor introducido por el usuario con </w:t>
-      </w:r>
-      <w:proofErr w:type="spellStart"/>
-      <w:r>
-        <w:rPr>
-          <w:lang w:val="es-ES"/>
-        </w:rPr>
-        <w:t>ReadLn</w:t>
-      </w:r>
-      <w:proofErr w:type="spellEnd"/>
-      <w:r>
-        <w:rPr>
-          <w:lang w:val="es-ES"/>
-        </w:rPr>
-        <w:t xml:space="preserve">. </w:t>
+        <w:t xml:space="preserve">Lee el valor introducido por el usuario con ReadLn. </w:t>
       </w:r>
     </w:p>
     <w:p>
@@ -5854,21 +4690,7 @@
         <w:rPr>
           <w:lang w:val="es-ES"/>
         </w:rPr>
-        <w:t xml:space="preserve">Usa </w:t>
-      </w:r>
-      <w:proofErr w:type="spellStart"/>
-      <w:r>
-        <w:rPr>
-          <w:lang w:val="es-ES"/>
-        </w:rPr>
-        <w:t>div</w:t>
-      </w:r>
-      <w:proofErr w:type="spellEnd"/>
-      <w:r>
-        <w:rPr>
-          <w:lang w:val="es-ES"/>
-        </w:rPr>
-        <w:t xml:space="preserve"> para calcular cuántos guerreros reciben ración completa (grupos de 6). </w:t>
+        <w:t xml:space="preserve">Usa div para calcular cuántos guerreros reciben ración completa (grupos de 6). </w:t>
       </w:r>
     </w:p>
     <w:p>
@@ -6019,21 +4841,7 @@
                               <w:rPr>
                                 <w:rFonts w:ascii="Cascadia Mono SemiBold" w:hAnsi="Cascadia Mono SemiBold" w:cs="Cascadia Mono SemiBold"/>
                               </w:rPr>
-                              <w:t xml:space="preserve">Total </w:t>
-                            </w:r>
-                            <w:proofErr w:type="spellStart"/>
-                            <w:r>
-                              <w:rPr>
-                                <w:rFonts w:ascii="Cascadia Mono SemiBold" w:hAnsi="Cascadia Mono SemiBold" w:cs="Cascadia Mono SemiBold"/>
-                              </w:rPr>
-                              <w:t>Senzu</w:t>
-                            </w:r>
-                            <w:proofErr w:type="spellEnd"/>
-                            <w:r>
-                              <w:rPr>
-                                <w:rFonts w:ascii="Cascadia Mono SemiBold" w:hAnsi="Cascadia Mono SemiBold" w:cs="Cascadia Mono SemiBold"/>
-                              </w:rPr>
-                              <w:t xml:space="preserve"> Beans: 50</w:t>
+                              <w:t>Total Senzu Beans: 50</w:t>
                             </w:r>
                           </w:p>
                           <w:p>
@@ -6101,21 +4909,7 @@
                         <w:rPr>
                           <w:rFonts w:ascii="Cascadia Mono SemiBold" w:hAnsi="Cascadia Mono SemiBold" w:cs="Cascadia Mono SemiBold"/>
                         </w:rPr>
-                        <w:t xml:space="preserve">Total </w:t>
-                      </w:r>
-                      <w:proofErr w:type="spellStart"/>
-                      <w:r>
-                        <w:rPr>
-                          <w:rFonts w:ascii="Cascadia Mono SemiBold" w:hAnsi="Cascadia Mono SemiBold" w:cs="Cascadia Mono SemiBold"/>
-                        </w:rPr>
-                        <w:t>Senzu</w:t>
-                      </w:r>
-                      <w:proofErr w:type="spellEnd"/>
-                      <w:r>
-                        <w:rPr>
-                          <w:rFonts w:ascii="Cascadia Mono SemiBold" w:hAnsi="Cascadia Mono SemiBold" w:cs="Cascadia Mono SemiBold"/>
-                        </w:rPr>
-                        <w:t xml:space="preserve"> Beans: 50</w:t>
+                        <w:t>Total Senzu Beans: 50</w:t>
                       </w:r>
                     </w:p>
                     <w:p>
@@ -6232,23 +5026,7 @@
           <w:bCs/>
           <w:lang w:val="es-ES"/>
         </w:rPr>
-        <w:t xml:space="preserve">Validación de </w:t>
-      </w:r>
-      <w:proofErr w:type="spellStart"/>
-      <w:r>
-        <w:rPr>
-          <w:bCs/>
-          <w:lang w:val="es-ES"/>
-        </w:rPr>
-        <w:t>Scouter</w:t>
-      </w:r>
-      <w:proofErr w:type="spellEnd"/>
-      <w:r>
-        <w:rPr>
-          <w:bCs/>
-          <w:lang w:val="es-ES"/>
-        </w:rPr>
-        <w:t xml:space="preserve"> (Lógica Booleana)</w:t>
+        <w:t>Validación de Scouter (Lógica Booleana)</w:t>
       </w:r>
     </w:p>
     <w:p>
@@ -6297,7 +5075,6 @@
           <w:numId w:val="4"/>
         </w:numPr>
       </w:pPr>
-      <w:proofErr w:type="spellStart"/>
       <w:r>
         <w:rPr>
           <w:b/>
@@ -6305,15 +5082,12 @@
         </w:rPr>
         <w:t>Archivo</w:t>
       </w:r>
-      <w:proofErr w:type="spellEnd"/>
       <w:r>
         <w:t xml:space="preserve">: </w:t>
       </w:r>
-      <w:proofErr w:type="spellStart"/>
       <w:r>
         <w:t>threat_check.pas</w:t>
       </w:r>
-      <w:proofErr w:type="spellEnd"/>
     </w:p>
     <w:p>
       <w:pPr>
@@ -6337,19 +5111,9 @@
         </w:rPr>
         <w:t xml:space="preserve">: </w:t>
       </w:r>
-      <w:proofErr w:type="spellStart"/>
-      <w:r>
-        <w:t>readln</w:t>
-      </w:r>
-      <w:proofErr w:type="spellEnd"/>
-      <w:r>
-        <w:t xml:space="preserve">, </w:t>
-      </w:r>
-      <w:proofErr w:type="spellStart"/>
-      <w:r>
-        <w:t>writeln</w:t>
-      </w:r>
-      <w:proofErr w:type="spellEnd"/>
+      <w:r>
+        <w:t>readln, writeln</w:t>
+      </w:r>
     </w:p>
     <w:p>
       <w:pPr>
@@ -6381,63 +5145,7 @@
         <w:rPr>
           <w:lang w:val="es-ES"/>
         </w:rPr>
-        <w:t xml:space="preserve">Leer el nivel de </w:t>
-      </w:r>
-      <w:proofErr w:type="spellStart"/>
-      <w:r>
-        <w:rPr>
-          <w:lang w:val="es-ES"/>
-        </w:rPr>
-        <w:t>ki</w:t>
-      </w:r>
-      <w:proofErr w:type="spellEnd"/>
-      <w:r>
-        <w:rPr>
-          <w:lang w:val="es-ES"/>
-        </w:rPr>
-        <w:t xml:space="preserve"> de un enemigo (</w:t>
-      </w:r>
-      <w:proofErr w:type="spellStart"/>
-      <w:r>
-        <w:rPr>
-          <w:lang w:val="es-ES"/>
-        </w:rPr>
-        <w:t>Integer</w:t>
-      </w:r>
-      <w:proofErr w:type="spellEnd"/>
-      <w:r>
-        <w:rPr>
-          <w:lang w:val="es-ES"/>
-        </w:rPr>
-        <w:t xml:space="preserve">). Si el </w:t>
-      </w:r>
-      <w:proofErr w:type="spellStart"/>
-      <w:r>
-        <w:rPr>
-          <w:lang w:val="es-ES"/>
-        </w:rPr>
-        <w:t>ki</w:t>
-      </w:r>
-      <w:proofErr w:type="spellEnd"/>
-      <w:r>
-        <w:rPr>
-          <w:lang w:val="es-ES"/>
-        </w:rPr>
-        <w:t xml:space="preserve"> es estrictamente superior a 9000, una variable de tipo </w:t>
-      </w:r>
-      <w:proofErr w:type="spellStart"/>
-      <w:r>
-        <w:rPr>
-          <w:lang w:val="es-ES"/>
-        </w:rPr>
-        <w:t>Boolean</w:t>
-      </w:r>
-      <w:proofErr w:type="spellEnd"/>
-      <w:r>
-        <w:rPr>
-          <w:lang w:val="es-ES"/>
-        </w:rPr>
-        <w:t xml:space="preserve"> debe tomar el valor TRUE, de lo contrario FALSE. </w:t>
+        <w:t xml:space="preserve">Leer el nivel de ki de un enemigo (Integer). Si el ki es estrictamente superior a 9000, una variable de tipo Boolean debe tomar el valor TRUE, de lo contrario FALSE. </w:t>
       </w:r>
       <w:r>
         <w:rPr>
@@ -6487,35 +5195,7 @@
         <w:rPr>
           <w:lang w:val="es-ES"/>
         </w:rPr>
-        <w:t xml:space="preserve">Declara una variable </w:t>
-      </w:r>
-      <w:proofErr w:type="spellStart"/>
-      <w:r>
-        <w:rPr>
-          <w:lang w:val="es-ES"/>
-        </w:rPr>
-        <w:t>Integer</w:t>
-      </w:r>
-      <w:proofErr w:type="spellEnd"/>
-      <w:r>
-        <w:rPr>
-          <w:lang w:val="es-ES"/>
-        </w:rPr>
-        <w:t xml:space="preserve"> para el </w:t>
-      </w:r>
-      <w:proofErr w:type="spellStart"/>
-      <w:r>
-        <w:rPr>
-          <w:lang w:val="es-ES"/>
-        </w:rPr>
-        <w:t>ki</w:t>
-      </w:r>
-      <w:proofErr w:type="spellEnd"/>
-      <w:r>
-        <w:rPr>
-          <w:lang w:val="es-ES"/>
-        </w:rPr>
-        <w:t xml:space="preserve"> del enemigo. </w:t>
+        <w:t xml:space="preserve">Declara una variable Integer para el ki del enemigo. </w:t>
       </w:r>
     </w:p>
     <w:p>
@@ -6533,21 +5213,7 @@
         <w:rPr>
           <w:lang w:val="es-ES"/>
         </w:rPr>
-        <w:t xml:space="preserve">Lee el valor introducido por el usuario con </w:t>
-      </w:r>
-      <w:proofErr w:type="spellStart"/>
-      <w:r>
-        <w:rPr>
-          <w:lang w:val="es-ES"/>
-        </w:rPr>
-        <w:t>ReadLn</w:t>
-      </w:r>
-      <w:proofErr w:type="spellEnd"/>
-      <w:r>
-        <w:rPr>
-          <w:lang w:val="es-ES"/>
-        </w:rPr>
-        <w:t xml:space="preserve">. </w:t>
+        <w:t xml:space="preserve">Lee el valor introducido por el usuario con ReadLn. </w:t>
       </w:r>
     </w:p>
     <w:p>
@@ -6565,35 +5231,7 @@
         <w:rPr>
           <w:lang w:val="es-ES"/>
         </w:rPr>
-        <w:t xml:space="preserve">Declara una variable </w:t>
-      </w:r>
-      <w:proofErr w:type="spellStart"/>
-      <w:r>
-        <w:rPr>
-          <w:lang w:val="es-ES"/>
-        </w:rPr>
-        <w:t>Boolean</w:t>
-      </w:r>
-      <w:proofErr w:type="spellEnd"/>
-      <w:r>
-        <w:rPr>
-          <w:lang w:val="es-ES"/>
-        </w:rPr>
-        <w:t xml:space="preserve"> y asígnale directamente el resultado de la comparación (</w:t>
-      </w:r>
-      <w:proofErr w:type="spellStart"/>
-      <w:r>
-        <w:rPr>
-          <w:lang w:val="es-ES"/>
-        </w:rPr>
-        <w:t>ki</w:t>
-      </w:r>
-      <w:proofErr w:type="spellEnd"/>
-      <w:r>
-        <w:rPr>
-          <w:lang w:val="es-ES"/>
-        </w:rPr>
-        <w:t xml:space="preserve"> &gt; 9000). </w:t>
+        <w:t xml:space="preserve">Declara una variable Boolean y asígnale directamente el resultado de la comparación (ki &gt; 9000). </w:t>
       </w:r>
     </w:p>
     <w:p>
@@ -6611,21 +5249,7 @@
         <w:rPr>
           <w:lang w:val="es-ES"/>
         </w:rPr>
-        <w:t xml:space="preserve">Imprime esa variable booleana con </w:t>
-      </w:r>
-      <w:proofErr w:type="spellStart"/>
-      <w:r>
-        <w:rPr>
-          <w:lang w:val="es-ES"/>
-        </w:rPr>
-        <w:t>WriteLn</w:t>
-      </w:r>
-      <w:proofErr w:type="spellEnd"/>
-      <w:r>
-        <w:rPr>
-          <w:lang w:val="es-ES"/>
-        </w:rPr>
-        <w:t>.</w:t>
+        <w:t>Imprime esa variable booleana con WriteLn.</w:t>
       </w:r>
     </w:p>
     <w:p>
@@ -6995,39 +5619,7 @@
           <w:bCs/>
           <w:lang w:val="es-ES"/>
         </w:rPr>
-        <w:t>Sobrecarga de Ki (</w:t>
-      </w:r>
-      <w:proofErr w:type="spellStart"/>
-      <w:r>
-        <w:rPr>
-          <w:bCs/>
-          <w:lang w:val="es-ES"/>
-        </w:rPr>
-        <w:t>Integer</w:t>
-      </w:r>
-      <w:proofErr w:type="spellEnd"/>
-      <w:r>
-        <w:rPr>
-          <w:bCs/>
-          <w:lang w:val="es-ES"/>
-        </w:rPr>
-        <w:t xml:space="preserve"> </w:t>
-      </w:r>
-      <w:proofErr w:type="spellStart"/>
-      <w:r>
-        <w:rPr>
-          <w:bCs/>
-          <w:lang w:val="es-ES"/>
-        </w:rPr>
-        <w:t>Overflow</w:t>
-      </w:r>
-      <w:proofErr w:type="spellEnd"/>
-      <w:r>
-        <w:rPr>
-          <w:bCs/>
-          <w:lang w:val="es-ES"/>
-        </w:rPr>
-        <w:t>)</w:t>
+        <w:t>Sobrecarga de Ki (Integer Overflow)</w:t>
       </w:r>
     </w:p>
     <w:p>
@@ -7076,7 +5668,6 @@
           <w:numId w:val="4"/>
         </w:numPr>
       </w:pPr>
-      <w:proofErr w:type="spellStart"/>
       <w:r>
         <w:rPr>
           <w:b/>
@@ -7084,15 +5675,12 @@
         </w:rPr>
         <w:t>Archivo</w:t>
       </w:r>
-      <w:proofErr w:type="spellEnd"/>
       <w:r>
         <w:t xml:space="preserve">: </w:t>
       </w:r>
-      <w:proofErr w:type="spellStart"/>
       <w:r>
         <w:t>ki_overflow.pas</w:t>
       </w:r>
-      <w:proofErr w:type="spellEnd"/>
     </w:p>
     <w:p>
       <w:pPr>
@@ -7119,11 +5707,9 @@
         </w:rPr>
         <w:t xml:space="preserve">: </w:t>
       </w:r>
-      <w:proofErr w:type="spellStart"/>
       <w:r>
         <w:t>writeln</w:t>
       </w:r>
-      <w:proofErr w:type="spellEnd"/>
     </w:p>
     <w:p>
       <w:pPr>
@@ -7161,21 +5747,7 @@
         <w:rPr>
           <w:lang w:val="es-ES"/>
         </w:rPr>
-        <w:t xml:space="preserve">Demostrar cómo colapsa la memoria estática por desbordamiento sin directivas de protección. Declara una variable de tipo </w:t>
-      </w:r>
-      <w:proofErr w:type="spellStart"/>
-      <w:r>
-        <w:rPr>
-          <w:lang w:val="es-ES"/>
-        </w:rPr>
-        <w:t>ShortInt</w:t>
-      </w:r>
-      <w:proofErr w:type="spellEnd"/>
-      <w:r>
-        <w:rPr>
-          <w:lang w:val="es-ES"/>
-        </w:rPr>
-        <w:t xml:space="preserve"> (rango -128 a 127). Asigna el valor 127, súmale 1 e imprime el resultado obtenido.</w:t>
+        <w:t>Demostrar cómo colapsa la memoria estática por desbordamiento sin directivas de protección. Declara una variable de tipo ShortInt (rango -128 a 127). Asigna el valor 127, súmale 1 e imprime el resultado obtenido.</w:t>
       </w:r>
     </w:p>
     <w:p>
@@ -7221,7 +5793,6 @@
         </w:rPr>
         <w:t xml:space="preserve">Declara una variable de tipo </w:t>
       </w:r>
-      <w:proofErr w:type="spellStart"/>
       <w:r>
         <w:rPr>
           <w:b/>
@@ -7230,7 +5801,6 @@
         </w:rPr>
         <w:t>ShortInt</w:t>
       </w:r>
-      <w:proofErr w:type="spellEnd"/>
       <w:r>
         <w:rPr>
           <w:lang w:val="es-ES"/>
@@ -7291,7 +5861,6 @@
         </w:rPr>
         <w:t xml:space="preserve">Imprime el resultado con </w:t>
       </w:r>
-      <w:proofErr w:type="spellStart"/>
       <w:r>
         <w:rPr>
           <w:b/>
@@ -7300,7 +5869,6 @@
         </w:rPr>
         <w:t>WriteLn</w:t>
       </w:r>
-      <w:proofErr w:type="spellEnd"/>
       <w:r>
         <w:rPr>
           <w:lang w:val="es-ES"/>
@@ -7337,7 +5905,6 @@
         </w:rPr>
         <w:t xml:space="preserve"> este ejercicio no lee nada del usuario (</w:t>
       </w:r>
-      <w:proofErr w:type="spellStart"/>
       <w:r>
         <w:rPr>
           <w:b/>
@@ -7348,7 +5915,6 @@
         </w:rPr>
         <w:t>readln</w:t>
       </w:r>
-      <w:proofErr w:type="spellEnd"/>
       <w:r>
         <w:rPr>
           <w:sz w:val="22"/>
@@ -7495,53 +6061,12 @@
                                 <w:lang w:val="es-ES"/>
                               </w:rPr>
                             </w:pPr>
-                            <w:proofErr w:type="spellStart"/>
                             <w:r>
                               <w:rPr>
                                 <w:rFonts w:ascii="Cascadia Mono SemiBold" w:hAnsi="Cascadia Mono SemiBold" w:cs="Cascadia Mono SemiBold"/>
                                 <w:lang w:val="es-ES"/>
                               </w:rPr>
-                              <w:t>Scouter</w:t>
-                            </w:r>
-                            <w:proofErr w:type="spellEnd"/>
-                            <w:r>
-                              <w:rPr>
-                                <w:rFonts w:ascii="Cascadia Mono SemiBold" w:hAnsi="Cascadia Mono SemiBold" w:cs="Cascadia Mono SemiBold"/>
-                                <w:lang w:val="es-ES"/>
-                              </w:rPr>
-                              <w:t xml:space="preserve"> </w:t>
-                            </w:r>
-                            <w:proofErr w:type="spellStart"/>
-                            <w:r>
-                              <w:rPr>
-                                <w:rFonts w:ascii="Cascadia Mono SemiBold" w:hAnsi="Cascadia Mono SemiBold" w:cs="Cascadia Mono SemiBold"/>
-                                <w:lang w:val="es-ES"/>
-                              </w:rPr>
-                              <w:t>exploded</w:t>
-                            </w:r>
-                            <w:proofErr w:type="spellEnd"/>
-                            <w:r>
-                              <w:rPr>
-                                <w:rFonts w:ascii="Cascadia Mono SemiBold" w:hAnsi="Cascadia Mono SemiBold" w:cs="Cascadia Mono SemiBold"/>
-                                <w:lang w:val="es-ES"/>
-                              </w:rPr>
-                              <w:t xml:space="preserve">! Current </w:t>
-                            </w:r>
-                            <w:proofErr w:type="spellStart"/>
-                            <w:r>
-                              <w:rPr>
-                                <w:rFonts w:ascii="Cascadia Mono SemiBold" w:hAnsi="Cascadia Mono SemiBold" w:cs="Cascadia Mono SemiBold"/>
-                                <w:lang w:val="es-ES"/>
-                              </w:rPr>
-                              <w:t>value</w:t>
-                            </w:r>
-                            <w:proofErr w:type="spellEnd"/>
-                            <w:r>
-                              <w:rPr>
-                                <w:rFonts w:ascii="Cascadia Mono SemiBold" w:hAnsi="Cascadia Mono SemiBold" w:cs="Cascadia Mono SemiBold"/>
-                                <w:lang w:val="es-ES"/>
-                              </w:rPr>
-                              <w:t>: -128</w:t>
+                              <w:t>Scouter exploded! Current value: -128</w:t>
                             </w:r>
                           </w:p>
                         </w:txbxContent>
@@ -7605,53 +6130,12 @@
                           <w:lang w:val="es-ES"/>
                         </w:rPr>
                       </w:pPr>
-                      <w:proofErr w:type="spellStart"/>
                       <w:r>
                         <w:rPr>
                           <w:rFonts w:ascii="Cascadia Mono SemiBold" w:hAnsi="Cascadia Mono SemiBold" w:cs="Cascadia Mono SemiBold"/>
                           <w:lang w:val="es-ES"/>
                         </w:rPr>
-                        <w:t>Scouter</w:t>
-                      </w:r>
-                      <w:proofErr w:type="spellEnd"/>
-                      <w:r>
-                        <w:rPr>
-                          <w:rFonts w:ascii="Cascadia Mono SemiBold" w:hAnsi="Cascadia Mono SemiBold" w:cs="Cascadia Mono SemiBold"/>
-                          <w:lang w:val="es-ES"/>
-                        </w:rPr>
-                        <w:t xml:space="preserve"> </w:t>
-                      </w:r>
-                      <w:proofErr w:type="spellStart"/>
-                      <w:r>
-                        <w:rPr>
-                          <w:rFonts w:ascii="Cascadia Mono SemiBold" w:hAnsi="Cascadia Mono SemiBold" w:cs="Cascadia Mono SemiBold"/>
-                          <w:lang w:val="es-ES"/>
-                        </w:rPr>
-                        <w:t>exploded</w:t>
-                      </w:r>
-                      <w:proofErr w:type="spellEnd"/>
-                      <w:r>
-                        <w:rPr>
-                          <w:rFonts w:ascii="Cascadia Mono SemiBold" w:hAnsi="Cascadia Mono SemiBold" w:cs="Cascadia Mono SemiBold"/>
-                          <w:lang w:val="es-ES"/>
-                        </w:rPr>
-                        <w:t xml:space="preserve">! Current </w:t>
-                      </w:r>
-                      <w:proofErr w:type="spellStart"/>
-                      <w:r>
-                        <w:rPr>
-                          <w:rFonts w:ascii="Cascadia Mono SemiBold" w:hAnsi="Cascadia Mono SemiBold" w:cs="Cascadia Mono SemiBold"/>
-                          <w:lang w:val="es-ES"/>
-                        </w:rPr>
-                        <w:t>value</w:t>
-                      </w:r>
-                      <w:proofErr w:type="spellEnd"/>
-                      <w:r>
-                        <w:rPr>
-                          <w:rFonts w:ascii="Cascadia Mono SemiBold" w:hAnsi="Cascadia Mono SemiBold" w:cs="Cascadia Mono SemiBold"/>
-                          <w:lang w:val="es-ES"/>
-                        </w:rPr>
-                        <w:t>: -128</w:t>
+                        <w:t>Scouter exploded! Current value: -128</w:t>
                       </w:r>
                     </w:p>
                   </w:txbxContent>
@@ -7729,43 +6213,7 @@
           <w:iCs/>
           <w:lang w:val="es-ES"/>
         </w:rPr>
-        <w:t xml:space="preserve">Este es el gancho hacia el ejercicio 06: una vez veas que </w:t>
-      </w:r>
-      <w:proofErr w:type="spellStart"/>
-      <w:r>
-        <w:rPr>
-          <w:i/>
-          <w:iCs/>
-          <w:lang w:val="es-ES"/>
-        </w:rPr>
-        <w:t>ki_overflow.pas</w:t>
-      </w:r>
-      <w:proofErr w:type="spellEnd"/>
-      <w:r>
-        <w:rPr>
-          <w:i/>
-          <w:iCs/>
-          <w:lang w:val="es-ES"/>
-        </w:rPr>
-        <w:t xml:space="preserve"> imprime un valor incorrecto sin avisar de nada, la pregunta que debes hacerte es ¿cómo le digo al compilador que no permita esto silenciosamente? — la respuesta son esas dos directivas que ya vimos en la teoría ({$Q+} para </w:t>
-      </w:r>
-      <w:proofErr w:type="spellStart"/>
-      <w:r>
-        <w:rPr>
-          <w:i/>
-          <w:iCs/>
-          <w:lang w:val="es-ES"/>
-        </w:rPr>
-        <w:t>overflow</w:t>
-      </w:r>
-      <w:proofErr w:type="spellEnd"/>
-      <w:r>
-        <w:rPr>
-          <w:i/>
-          <w:iCs/>
-          <w:lang w:val="es-ES"/>
-        </w:rPr>
-        <w:t xml:space="preserve"> aritmético, {$R+} para rango), que es justo lo que trabajarás en el ejercicio 06.</w:t>
+        <w:t>Este es el gancho hacia el ejercicio 06: una vez veas que ki_overflow.pas imprime un valor incorrecto sin avisar de nada, la pregunta que debes hacerte es ¿cómo le digo al compilador que no permita esto silenciosamente? — la respuesta son esas dos directivas que ya vimos en la teoría ({$Q+} para overflow aritmético, {$R+} para rango), que es justo lo que trabajarás en el ejercicio 06.</w:t>
       </w:r>
     </w:p>
     <w:p>
@@ -7867,17 +6315,8 @@
           <w:bCs/>
           <w:lang w:val="es-ES"/>
         </w:rPr>
-        <w:t xml:space="preserve">La Trampa de </w:t>
-      </w:r>
-      <w:proofErr w:type="spellStart"/>
-      <w:r>
-        <w:rPr>
-          <w:bCs/>
-          <w:lang w:val="es-ES"/>
-        </w:rPr>
-        <w:t>Babidi</w:t>
-      </w:r>
-      <w:proofErr w:type="spellEnd"/>
+        <w:t>La Trampa de Babidi</w:t>
+      </w:r>
     </w:p>
     <w:p>
       <w:pPr>
@@ -7925,7 +6364,6 @@
           <w:numId w:val="4"/>
         </w:numPr>
       </w:pPr>
-      <w:proofErr w:type="spellStart"/>
       <w:r>
         <w:rPr>
           <w:b/>
@@ -7933,15 +6371,12 @@
         </w:rPr>
         <w:t>Archivo</w:t>
       </w:r>
-      <w:proofErr w:type="spellEnd"/>
       <w:r>
         <w:t xml:space="preserve">: </w:t>
       </w:r>
-      <w:proofErr w:type="spellStart"/>
       <w:r>
         <w:t>divine_shield.pas</w:t>
       </w:r>
-      <w:proofErr w:type="spellEnd"/>
     </w:p>
     <w:p>
       <w:pPr>
@@ -7968,11 +6403,9 @@
         </w:rPr>
         <w:t xml:space="preserve">: </w:t>
       </w:r>
-      <w:proofErr w:type="spellStart"/>
       <w:r>
         <w:t>writeln</w:t>
       </w:r>
-      <w:proofErr w:type="spellEnd"/>
     </w:p>
     <w:p>
       <w:pPr>
@@ -8002,145 +6435,39 @@
         <w:rPr>
           <w:lang w:val="es-ES"/>
         </w:rPr>
-        <w:t>Toma el mismo código del ex05, pero añade en la primera línea del archivo las directivas de compilación {$Q+} (</w:t>
-      </w:r>
-      <w:proofErr w:type="spellStart"/>
-      <w:r>
-        <w:rPr>
-          <w:lang w:val="es-ES"/>
-        </w:rPr>
-        <w:t>Overflow</w:t>
-      </w:r>
-      <w:proofErr w:type="spellEnd"/>
-      <w:r>
-        <w:rPr>
-          <w:lang w:val="es-ES"/>
-        </w:rPr>
-        <w:t xml:space="preserve"> </w:t>
-      </w:r>
-      <w:proofErr w:type="spellStart"/>
-      <w:r>
-        <w:rPr>
-          <w:lang w:val="es-ES"/>
-        </w:rPr>
-        <w:t>Checking</w:t>
-      </w:r>
-      <w:proofErr w:type="spellEnd"/>
-      <w:r>
-        <w:rPr>
-          <w:lang w:val="es-ES"/>
-        </w:rPr>
-        <w:t xml:space="preserve">) y {$R+} (Range </w:t>
-      </w:r>
-      <w:proofErr w:type="spellStart"/>
-      <w:r>
-        <w:rPr>
-          <w:lang w:val="es-ES"/>
-        </w:rPr>
-        <w:t>Checking</w:t>
-      </w:r>
-      <w:proofErr w:type="spellEnd"/>
-      <w:r>
-        <w:rPr>
-          <w:lang w:val="es-ES"/>
-        </w:rPr>
-        <w:t>). Compila y ejecuta el programa.</w:t>
-      </w:r>
-    </w:p>
-    <w:p>
-      <w:pPr>
-        <w:pStyle w:val="Sinespaciado"/>
-        <w:rPr>
-          <w:lang w:val="es-ES"/>
-        </w:rPr>
-      </w:pPr>
-    </w:p>
-    <w:p>
-      <w:pPr>
-        <w:pStyle w:val="Sinespaciado"/>
-        <w:rPr>
-          <w:lang w:val="es-ES"/>
-        </w:rPr>
-      </w:pPr>
-      <w:r>
-        <w:rPr>
+        <w:t xml:space="preserve">Toma el mismo código del ex05, pero añade en la primera línea del archivo las directivas de compilación </w:t>
+      </w:r>
+      <w:r>
+        <w:rPr>
+          <w:b/>
+          <w:bCs/>
           <w:i/>
           <w:iCs/>
           <w:lang w:val="es-ES"/>
         </w:rPr>
-        <w:t xml:space="preserve">(Nota: la parte de "aprender reduce, </w:t>
-      </w:r>
-      <w:proofErr w:type="spellStart"/>
-      <w:r>
-        <w:rPr>
+        <w:t>{$Q+} (Overflow Checking)</w:t>
+      </w:r>
+      <w:r>
+        <w:rPr>
+          <w:lang w:val="es-ES"/>
+        </w:rPr>
+        <w:t xml:space="preserve"> y </w:t>
+      </w:r>
+      <w:r>
+        <w:rPr>
+          <w:b/>
+          <w:bCs/>
           <w:i/>
           <w:iCs/>
           <w:lang w:val="es-ES"/>
         </w:rPr>
-        <w:t>map</w:t>
-      </w:r>
-      <w:proofErr w:type="spellEnd"/>
-      <w:r>
-        <w:rPr>
-          <w:i/>
-          <w:iCs/>
-          <w:lang w:val="es-ES"/>
-        </w:rPr>
-        <w:t xml:space="preserve">, </w:t>
-      </w:r>
-      <w:proofErr w:type="spellStart"/>
-      <w:r>
-        <w:rPr>
-          <w:i/>
-          <w:iCs/>
-          <w:lang w:val="es-ES"/>
-        </w:rPr>
-        <w:t>filter</w:t>
-      </w:r>
-      <w:proofErr w:type="spellEnd"/>
-      <w:r>
-        <w:rPr>
-          <w:i/>
-          <w:iCs/>
-          <w:lang w:val="es-ES"/>
-        </w:rPr>
-        <w:t>" que aparece en el enunciado que pegaste es de JavaScript/</w:t>
-      </w:r>
-      <w:proofErr w:type="spellStart"/>
-      <w:r>
-        <w:rPr>
-          <w:i/>
-          <w:iCs/>
-          <w:lang w:val="es-ES"/>
-        </w:rPr>
-        <w:t>arrays</w:t>
-      </w:r>
-      <w:proofErr w:type="spellEnd"/>
-      <w:r>
-        <w:rPr>
-          <w:i/>
-          <w:iCs/>
-          <w:lang w:val="es-ES"/>
-        </w:rPr>
-        <w:t xml:space="preserve"> funcionales — no tiene nada que ver con este ejercicio de Pascal, ignórala. Aquí no hay </w:t>
-      </w:r>
-      <w:proofErr w:type="spellStart"/>
-      <w:r>
-        <w:rPr>
-          <w:i/>
-          <w:iCs/>
-          <w:lang w:val="es-ES"/>
-        </w:rPr>
-        <w:t>arrays</w:t>
-      </w:r>
-      <w:proofErr w:type="spellEnd"/>
-      <w:r>
-        <w:rPr>
-          <w:i/>
-          <w:iCs/>
-          <w:lang w:val="es-ES"/>
-        </w:rPr>
-        <w:t xml:space="preserve"> ni reduce, es directamente sobre directivas de compilación.)</w:t>
+        <w:t>{$R+} (Range Checking).</w:t>
+      </w:r>
+      <w:r>
+        <w:rPr>
+          <w:lang w:val="es-ES"/>
+        </w:rPr>
+        <w:t xml:space="preserve"> Compila y ejecuta el programa.</w:t>
       </w:r>
     </w:p>
     <w:p>
@@ -8172,29 +6499,7 @@
         <w:rPr>
           <w:lang w:val="es-ES"/>
         </w:rPr>
-        <w:t xml:space="preserve">En el ex05, Pascal permite silenciosamente que el valor salte de 127 a -128 debido a la aritmética modular en complemento a dos. En sistemas críticos (un simulador de vuelo, una base militar), ese tipo de fallo silencioso provoca catástrofes </w:t>
-      </w:r>
-      <w:proofErr w:type="spellStart"/>
-      <w:proofErr w:type="gramStart"/>
-      <w:r>
-        <w:rPr>
-          <w:lang w:val="es-ES"/>
-        </w:rPr>
-        <w:t>reales.</w:t>
-      </w:r>
-      <w:r>
-        <w:rPr>
-          <w:lang w:val="es-ES"/>
-        </w:rPr>
-        <w:t>un</w:t>
-      </w:r>
-      <w:proofErr w:type="spellEnd"/>
-      <w:proofErr w:type="gramEnd"/>
-      <w:r>
-        <w:rPr>
-          <w:lang w:val="es-ES"/>
-        </w:rPr>
-        <w:t xml:space="preserve"> simulador de vuelo o una base militar), esto provoca catástrofes.</w:t>
+        <w:t>En el ex05, Pascal permite silenciosamente que el valor salte de 127 a -128 debido a la aritmética modular en complemento a dos. En sistemas críticos (un simulador de vuelo, una base militar), ese tipo de fallo silencioso provoca catástrofes reales.</w:t>
       </w:r>
     </w:p>
     <w:p>
@@ -8238,21 +6543,7 @@
         <w:rPr>
           <w:lang w:val="es-ES"/>
         </w:rPr>
-        <w:t xml:space="preserve">Copia el código de </w:t>
-      </w:r>
-      <w:proofErr w:type="spellStart"/>
-      <w:r>
-        <w:rPr>
-          <w:lang w:val="es-ES"/>
-        </w:rPr>
-        <w:t>ki_overflow.pas</w:t>
-      </w:r>
-      <w:proofErr w:type="spellEnd"/>
-      <w:r>
-        <w:rPr>
-          <w:lang w:val="es-ES"/>
-        </w:rPr>
-        <w:t xml:space="preserve"> (ex05). </w:t>
+        <w:t xml:space="preserve">Copia el código de ki_overflow.pas (ex05). </w:t>
       </w:r>
     </w:p>
     <w:p>
@@ -8272,33 +6563,17 @@
         </w:rPr>
         <w:t>Añade {$Q</w:t>
       </w:r>
-      <w:proofErr w:type="gramStart"/>
-      <w:r>
-        <w:rPr>
-          <w:lang w:val="es-ES"/>
-        </w:rPr>
-        <w:t>+,R</w:t>
-      </w:r>
-      <w:proofErr w:type="gramEnd"/>
-      <w:r>
-        <w:rPr>
-          <w:lang w:val="es-ES"/>
-        </w:rPr>
-        <w:t xml:space="preserve">+} como primera línea del archivo, antes de </w:t>
-      </w:r>
-      <w:proofErr w:type="spellStart"/>
-      <w:r>
-        <w:rPr>
-          <w:lang w:val="es-ES"/>
-        </w:rPr>
-        <w:t>program</w:t>
-      </w:r>
-      <w:proofErr w:type="spellEnd"/>
-      <w:r>
-        <w:rPr>
-          <w:lang w:val="es-ES"/>
-        </w:rPr>
-        <w:t xml:space="preserve"> .... </w:t>
+      <w:r>
+        <w:rPr>
+          <w:lang w:val="es-ES"/>
+        </w:rPr>
+        <w:t>+, R</w:t>
+      </w:r>
+      <w:r>
+        <w:rPr>
+          <w:lang w:val="es-ES"/>
+        </w:rPr>
+        <w:t xml:space="preserve">+} como primera línea del archivo, antes de program .... </w:t>
       </w:r>
     </w:p>
     <w:p>
@@ -8316,35 +6591,7 @@
         <w:rPr>
           <w:lang w:val="es-ES"/>
         </w:rPr>
-        <w:t xml:space="preserve">El resto del código queda exactamente igual: </w:t>
-      </w:r>
-      <w:proofErr w:type="spellStart"/>
-      <w:r>
-        <w:rPr>
-          <w:lang w:val="es-ES"/>
-        </w:rPr>
-        <w:t>ShortInt</w:t>
-      </w:r>
-      <w:proofErr w:type="spellEnd"/>
-      <w:r>
-        <w:rPr>
-          <w:lang w:val="es-ES"/>
-        </w:rPr>
-        <w:t xml:space="preserve">, asignación de 127, suma de 1, </w:t>
-      </w:r>
-      <w:proofErr w:type="spellStart"/>
-      <w:r>
-        <w:rPr>
-          <w:lang w:val="es-ES"/>
-        </w:rPr>
-        <w:t>WriteLn</w:t>
-      </w:r>
-      <w:proofErr w:type="spellEnd"/>
-      <w:r>
-        <w:rPr>
-          <w:lang w:val="es-ES"/>
-        </w:rPr>
-        <w:t>.</w:t>
+        <w:t>El resto del código queda exactamente igual: ShortInt, asignación de 127, suma de 1, WriteLn.</w:t>
       </w:r>
     </w:p>
     <w:p>
@@ -8404,7 +6651,7 @@
         <mc:AlternateContent>
           <mc:Choice Requires="wps">
             <w:drawing>
-              <wp:anchor distT="0" distB="0" distL="114300" distR="114300" simplePos="0" relativeHeight="251673600" behindDoc="0" locked="0" layoutInCell="1" allowOverlap="1" wp14:anchorId="426EE8B6" wp14:editId="634E3853">
+              <wp:anchor distT="0" distB="0" distL="114300" distR="114300" simplePos="0" relativeHeight="251673600" behindDoc="0" locked="0" layoutInCell="1" allowOverlap="1" wp14:anchorId="426EE8B6" wp14:editId="05F2ADA2">
                 <wp:simplePos x="0" y="0"/>
                 <wp:positionH relativeFrom="margin">
                   <wp:align>left</wp:align>
@@ -8412,8 +6659,8 @@
                 <wp:positionV relativeFrom="paragraph">
                   <wp:posOffset>111125</wp:posOffset>
                 </wp:positionV>
-                <wp:extent cx="6124575" cy="349250"/>
-                <wp:effectExtent l="0" t="0" r="28575" b="12700"/>
+                <wp:extent cx="6124575" cy="1095555"/>
+                <wp:effectExtent l="0" t="0" r="28575" b="28575"/>
                 <wp:wrapNone/>
                 <wp:docPr id="892447048" name="Rectángulo 2"/>
                 <wp:cNvGraphicFramePr/>
@@ -8424,7 +6671,7 @@
                       <wps:spPr>
                         <a:xfrm>
                           <a:off x="0" y="0"/>
-                          <a:ext cx="6124575" cy="349250"/>
+                          <a:ext cx="6124575" cy="1095555"/>
                         </a:xfrm>
                         <a:prstGeom prst="rect">
                           <a:avLst/>
@@ -8461,24 +6708,70 @@
                               <w:pStyle w:val="Sinespaciado"/>
                               <w:rPr>
                                 <w:rFonts w:ascii="Cascadia Mono SemiBold" w:hAnsi="Cascadia Mono SemiBold" w:cs="Cascadia Mono SemiBold"/>
-                                <w:lang w:val="es-ES"/>
                               </w:rPr>
                             </w:pPr>
-                            <w:proofErr w:type="spellStart"/>
                             <w:r>
+                              <w:rPr>
+                                <w:rFonts w:ascii="Cascadia Mono SemiBold" w:hAnsi="Cascadia Mono SemiBold" w:cs="Cascadia Mono SemiBold"/>
+                              </w:rPr>
+                              <w:t>Current Ki capacity: 127</w:t>
+                            </w:r>
+                          </w:p>
+                          <w:p>
+                            <w:pPr>
+                              <w:pStyle w:val="Sinespaciado"/>
+                              <w:rPr>
+                                <w:rFonts w:ascii="Cascadia Mono SemiBold" w:hAnsi="Cascadia Mono SemiBold" w:cs="Cascadia Mono SemiBold"/>
+                              </w:rPr>
+                            </w:pPr>
+                            <w:r>
+                              <w:rPr>
+                                <w:rFonts w:ascii="Cascadia Mono SemiBold" w:hAnsi="Cascadia Mono SemiBold" w:cs="Cascadia Mono SemiBold"/>
+                              </w:rPr>
+                              <w:t>Charging 1 unit of Ki...</w:t>
+                            </w:r>
+                          </w:p>
+                          <w:p>
+                            <w:pPr>
+                              <w:pStyle w:val="Sinespaciado"/>
+                              <w:rPr>
+                                <w:rFonts w:ascii="Cascadia Mono SemiBold" w:hAnsi="Cascadia Mono SemiBold" w:cs="Cascadia Mono SemiBold"/>
+                              </w:rPr>
+                            </w:pPr>
+                            <w:r>
+                              <w:rPr>
+                                <w:rFonts w:ascii="Cascadia Mono SemiBold" w:hAnsi="Cascadia Mono SemiBold" w:cs="Cascadia Mono SemiBold"/>
+                              </w:rPr>
+                              <w:t>Runtime error 201 at $0040162E</w:t>
+                            </w:r>
+                          </w:p>
+                          <w:p>
+                            <w:pPr>
+                              <w:pStyle w:val="Sinespaciado"/>
+                              <w:rPr>
+                                <w:rFonts w:ascii="Cascadia Mono SemiBold" w:hAnsi="Cascadia Mono SemiBold" w:cs="Cascadia Mono SemiBold"/>
+                              </w:rPr>
+                            </w:pPr>
+                            <w:r>
+                              <w:rPr>
+                                <w:rFonts w:ascii="Cascadia Mono SemiBold" w:hAnsi="Cascadia Mono SemiBold" w:cs="Cascadia Mono SemiBold"/>
+                              </w:rPr>
+                              <w:t xml:space="preserve">  $0040162E</w:t>
+                            </w:r>
+                          </w:p>
+                          <w:p>
+                            <w:pPr>
+                              <w:pStyle w:val="Sinespaciado"/>
                               <w:rPr>
                                 <w:rFonts w:ascii="Cascadia Mono SemiBold" w:hAnsi="Cascadia Mono SemiBold" w:cs="Cascadia Mono SemiBold"/>
                                 <w:lang w:val="es-ES"/>
                               </w:rPr>
-                              <w:t>Runtime</w:t>
-                            </w:r>
-                            <w:proofErr w:type="spellEnd"/>
+                            </w:pPr>
                             <w:r>
                               <w:rPr>
                                 <w:rFonts w:ascii="Cascadia Mono SemiBold" w:hAnsi="Cascadia Mono SemiBold" w:cs="Cascadia Mono SemiBold"/>
-                                <w:lang w:val="es-ES"/>
                               </w:rPr>
-                              <w:t xml:space="preserve"> error 215 at $00401234</w:t>
+                              <w:t xml:space="preserve">  $00407797</w:t>
                             </w:r>
                           </w:p>
                         </w:txbxContent>
@@ -8503,9 +6796,65 @@
           </mc:Choice>
           <mc:Fallback>
             <w:pict>
-              <v:rect w14:anchorId="426EE8B6" id="_x0000_s1032" style="position:absolute;margin-left:0;margin-top:8.75pt;width:482.25pt;height:27.5pt;z-index:251673600;visibility:visible;mso-wrap-style:square;mso-width-percent:0;mso-height-percent:0;mso-wrap-distance-left:9pt;mso-wrap-distance-top:0;mso-wrap-distance-right:9pt;mso-wrap-distance-bottom:0;mso-position-horizontal:left;mso-position-horizontal-relative:margin;mso-position-vertical:absolute;mso-position-vertical-relative:text;mso-width-percent:0;mso-height-percent:0;mso-width-relative:margin;mso-height-relative:margin;v-text-anchor:middle" o:gfxdata="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" fillcolor="black [3213]" strokecolor="black [3213]" strokeweight="1pt">
+              <v:rect w14:anchorId="426EE8B6" id="_x0000_s1032" style="position:absolute;margin-left:0;margin-top:8.75pt;width:482.25pt;height:86.25pt;z-index:251673600;visibility:visible;mso-wrap-style:square;mso-width-percent:0;mso-height-percent:0;mso-wrap-distance-left:9pt;mso-wrap-distance-top:0;mso-wrap-distance-right:9pt;mso-wrap-distance-bottom:0;mso-position-horizontal:left;mso-position-horizontal-relative:margin;mso-position-vertical:absolute;mso-position-vertical-relative:text;mso-width-percent:0;mso-height-percent:0;mso-width-relative:margin;mso-height-relative:margin;v-text-anchor:middle" o:gfxdata="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" fillcolor="black [3213]" strokecolor="black [3213]" strokeweight="1pt">
                 <v:textbox>
                   <w:txbxContent>
+                    <w:p>
+                      <w:pPr>
+                        <w:pStyle w:val="Sinespaciado"/>
+                        <w:rPr>
+                          <w:rFonts w:ascii="Cascadia Mono SemiBold" w:hAnsi="Cascadia Mono SemiBold" w:cs="Cascadia Mono SemiBold"/>
+                        </w:rPr>
+                      </w:pPr>
+                      <w:r>
+                        <w:rPr>
+                          <w:rFonts w:ascii="Cascadia Mono SemiBold" w:hAnsi="Cascadia Mono SemiBold" w:cs="Cascadia Mono SemiBold"/>
+                        </w:rPr>
+                        <w:t>Current Ki capacity: 127</w:t>
+                      </w:r>
+                    </w:p>
+                    <w:p>
+                      <w:pPr>
+                        <w:pStyle w:val="Sinespaciado"/>
+                        <w:rPr>
+                          <w:rFonts w:ascii="Cascadia Mono SemiBold" w:hAnsi="Cascadia Mono SemiBold" w:cs="Cascadia Mono SemiBold"/>
+                        </w:rPr>
+                      </w:pPr>
+                      <w:r>
+                        <w:rPr>
+                          <w:rFonts w:ascii="Cascadia Mono SemiBold" w:hAnsi="Cascadia Mono SemiBold" w:cs="Cascadia Mono SemiBold"/>
+                        </w:rPr>
+                        <w:t>Charging 1 unit of Ki...</w:t>
+                      </w:r>
+                    </w:p>
+                    <w:p>
+                      <w:pPr>
+                        <w:pStyle w:val="Sinespaciado"/>
+                        <w:rPr>
+                          <w:rFonts w:ascii="Cascadia Mono SemiBold" w:hAnsi="Cascadia Mono SemiBold" w:cs="Cascadia Mono SemiBold"/>
+                        </w:rPr>
+                      </w:pPr>
+                      <w:r>
+                        <w:rPr>
+                          <w:rFonts w:ascii="Cascadia Mono SemiBold" w:hAnsi="Cascadia Mono SemiBold" w:cs="Cascadia Mono SemiBold"/>
+                        </w:rPr>
+                        <w:t>Runtime error 201 at $0040162E</w:t>
+                      </w:r>
+                    </w:p>
+                    <w:p>
+                      <w:pPr>
+                        <w:pStyle w:val="Sinespaciado"/>
+                        <w:rPr>
+                          <w:rFonts w:ascii="Cascadia Mono SemiBold" w:hAnsi="Cascadia Mono SemiBold" w:cs="Cascadia Mono SemiBold"/>
+                        </w:rPr>
+                      </w:pPr>
+                      <w:r>
+                        <w:rPr>
+                          <w:rFonts w:ascii="Cascadia Mono SemiBold" w:hAnsi="Cascadia Mono SemiBold" w:cs="Cascadia Mono SemiBold"/>
+                        </w:rPr>
+                        <w:t xml:space="preserve">  $0040162E</w:t>
+                      </w:r>
+                    </w:p>
                     <w:p>
                       <w:pPr>
                         <w:pStyle w:val="Sinespaciado"/>
@@ -8514,21 +6863,11 @@
                           <w:lang w:val="es-ES"/>
                         </w:rPr>
                       </w:pPr>
-                      <w:proofErr w:type="spellStart"/>
                       <w:r>
                         <w:rPr>
                           <w:rFonts w:ascii="Cascadia Mono SemiBold" w:hAnsi="Cascadia Mono SemiBold" w:cs="Cascadia Mono SemiBold"/>
-                          <w:lang w:val="es-ES"/>
                         </w:rPr>
-                        <w:t>Runtime</w:t>
-                      </w:r>
-                      <w:proofErr w:type="spellEnd"/>
-                      <w:r>
-                        <w:rPr>
-                          <w:rFonts w:ascii="Cascadia Mono SemiBold" w:hAnsi="Cascadia Mono SemiBold" w:cs="Cascadia Mono SemiBold"/>
-                          <w:lang w:val="es-ES"/>
-                        </w:rPr>
-                        <w:t xml:space="preserve"> error 215 at $00401234</w:t>
+                        <w:t xml:space="preserve">  $00407797</w:t>
                       </w:r>
                     </w:p>
                   </w:txbxContent>
@@ -8559,6 +6898,32 @@
     <w:p>
       <w:pPr>
         <w:rPr>
+          <w:b/>
+          <w:bCs/>
+          <w:lang w:val="es-ES"/>
+        </w:rPr>
+      </w:pPr>
+    </w:p>
+    <w:p>
+      <w:pPr>
+        <w:rPr>
+          <w:b/>
+          <w:bCs/>
+          <w:lang w:val="es-ES"/>
+        </w:rPr>
+      </w:pPr>
+    </w:p>
+    <w:p>
+      <w:pPr>
+        <w:pStyle w:val="Sinespaciado"/>
+        <w:rPr>
+          <w:lang w:val="es-ES"/>
+        </w:rPr>
+      </w:pPr>
+    </w:p>
+    <w:p>
+      <w:pPr>
+        <w:rPr>
           <w:lang w:val="es-ES"/>
         </w:rPr>
       </w:pPr>
@@ -8602,49 +6967,23 @@
         <w:rPr>
           <w:lang w:val="es-ES"/>
         </w:rPr>
-        <w:t xml:space="preserve"> la línea problemática (</w:t>
-      </w:r>
-      <w:proofErr w:type="gramStart"/>
-      <w:r>
-        <w:rPr>
-          <w:lang w:val="es-ES"/>
-        </w:rPr>
-        <w:t>x :</w:t>
-      </w:r>
-      <w:proofErr w:type="gramEnd"/>
-      <w:r>
-        <w:rPr>
-          <w:lang w:val="es-ES"/>
-        </w:rPr>
-        <w:t xml:space="preserve">= x + 1). Es un error de </w:t>
-      </w:r>
-      <w:proofErr w:type="spellStart"/>
-      <w:r>
-        <w:rPr>
+        <w:t xml:space="preserve"> la línea problemática (x := x + 1). Es un error de </w:t>
+      </w:r>
+      <w:r>
+        <w:rPr>
+          <w:b/>
+          <w:bCs/>
+          <w:i/>
+          <w:iCs/>
           <w:lang w:val="es-ES"/>
         </w:rPr>
         <w:t>runtime</w:t>
       </w:r>
-      <w:proofErr w:type="spellEnd"/>
-      <w:r>
-        <w:rPr>
-          <w:lang w:val="es-ES"/>
-        </w:rPr>
-        <w:t xml:space="preserve">, no de compilación. Esa es la diferencia que debes poder explicar si te preguntan en la </w:t>
-      </w:r>
-      <w:proofErr w:type="spellStart"/>
-      <w:r>
-        <w:rPr>
-          <w:lang w:val="es-ES"/>
-        </w:rPr>
-        <w:t>uni</w:t>
-      </w:r>
-      <w:proofErr w:type="spellEnd"/>
-      <w:r>
-        <w:rPr>
-          <w:lang w:val="es-ES"/>
-        </w:rPr>
-        <w:t>.</w:t>
+      <w:r>
+        <w:rPr>
+          <w:lang w:val="es-ES"/>
+        </w:rPr>
+        <w:t>, no de compilación. Esa es la diferencia que debes poder explicar si te preguntan en la uni.</w:t>
       </w:r>
     </w:p>
     <w:p>
@@ -8709,13 +7048,6 @@
           <w:bCs/>
           <w:lang w:val="es-ES"/>
         </w:rPr>
-        <w:t>0</w:t>
-      </w:r>
-      <w:r>
-        <w:rPr>
-          <w:bCs/>
-          <w:lang w:val="es-ES"/>
-        </w:rPr>
         <w:t>7</w:t>
       </w:r>
       <w:r>
@@ -8730,23 +7062,7 @@
           <w:bCs/>
           <w:lang w:val="es-ES"/>
         </w:rPr>
-        <w:t xml:space="preserve">Rango de Detección del </w:t>
-      </w:r>
-      <w:proofErr w:type="spellStart"/>
-      <w:r>
-        <w:rPr>
-          <w:bCs/>
-          <w:lang w:val="es-ES"/>
-        </w:rPr>
-        <w:t>Scouter</w:t>
-      </w:r>
-      <w:proofErr w:type="spellEnd"/>
-      <w:r>
-        <w:rPr>
-          <w:bCs/>
-          <w:lang w:val="es-ES"/>
-        </w:rPr>
-        <w:t xml:space="preserve"> (Constantes y Precedencia)</w:t>
+        <w:t>Rango de Detección del Scouter (Constantes y Precedencia)</w:t>
       </w:r>
     </w:p>
     <w:p>
@@ -8775,7 +7091,7 @@
         <w:t xml:space="preserve">: </w:t>
       </w:r>
       <w:r>
-        <w:t>ex0</w:t>
+        <w:t>ex</w:t>
       </w:r>
       <w:r>
         <w:t>7</w:t>
@@ -8795,7 +7111,6 @@
           <w:numId w:val="4"/>
         </w:numPr>
       </w:pPr>
-      <w:proofErr w:type="spellStart"/>
       <w:r>
         <w:rPr>
           <w:b/>
@@ -8803,15 +7118,12 @@
         </w:rPr>
         <w:t>Archivo</w:t>
       </w:r>
-      <w:proofErr w:type="spellEnd"/>
       <w:r>
         <w:t xml:space="preserve">: </w:t>
       </w:r>
-      <w:proofErr w:type="spellStart"/>
       <w:r>
         <w:t>scouter_range.pas</w:t>
       </w:r>
-      <w:proofErr w:type="spellEnd"/>
     </w:p>
     <w:p>
       <w:pPr>
@@ -8838,19 +7150,9 @@
         </w:rPr>
         <w:t xml:space="preserve">: </w:t>
       </w:r>
-      <w:proofErr w:type="spellStart"/>
-      <w:r>
-        <w:t>readln</w:t>
-      </w:r>
-      <w:proofErr w:type="spellEnd"/>
-      <w:r>
-        <w:t xml:space="preserve">, </w:t>
-      </w:r>
-      <w:proofErr w:type="spellStart"/>
-      <w:r>
-        <w:t>writeln</w:t>
-      </w:r>
-      <w:proofErr w:type="spellEnd"/>
+      <w:r>
+        <w:t>readln, writeln</w:t>
+      </w:r>
     </w:p>
     <w:p>
       <w:pPr>
@@ -8891,21 +7193,7 @@
         <w:rPr>
           <w:lang w:val="es-ES"/>
         </w:rPr>
-        <w:t xml:space="preserve">Declaración obligatoria de constantes en la sección </w:t>
-      </w:r>
-      <w:proofErr w:type="spellStart"/>
-      <w:r>
-        <w:rPr>
-          <w:lang w:val="es-ES"/>
-        </w:rPr>
-        <w:t>const</w:t>
-      </w:r>
-      <w:proofErr w:type="spellEnd"/>
-      <w:r>
-        <w:rPr>
-          <w:lang w:val="es-ES"/>
-        </w:rPr>
-        <w:t xml:space="preserve"> y uso estricto de paréntesis en expresiones booleanas compuestas.</w:t>
+        <w:t>Declaración obligatoria de constantes en la sección const y uso estricto de paréntesis en expresiones booleanas compuestas.</w:t>
       </w:r>
     </w:p>
     <w:p>
@@ -8937,35 +7225,7 @@
         <w:rPr>
           <w:lang w:val="es-ES"/>
         </w:rPr>
-        <w:t xml:space="preserve">Declarar dos constantes: MIN_KI = 500 y MAX_KI = 8500. El programa solicita el </w:t>
-      </w:r>
-      <w:proofErr w:type="spellStart"/>
-      <w:r>
-        <w:rPr>
-          <w:lang w:val="es-ES"/>
-        </w:rPr>
-        <w:t>ki</w:t>
-      </w:r>
-      <w:proofErr w:type="spellEnd"/>
-      <w:r>
-        <w:rPr>
-          <w:lang w:val="es-ES"/>
-        </w:rPr>
-        <w:t xml:space="preserve"> de un guerrero (</w:t>
-      </w:r>
-      <w:proofErr w:type="spellStart"/>
-      <w:r>
-        <w:rPr>
-          <w:lang w:val="es-ES"/>
-        </w:rPr>
-        <w:t>Integer</w:t>
-      </w:r>
-      <w:proofErr w:type="spellEnd"/>
-      <w:r>
-        <w:rPr>
-          <w:lang w:val="es-ES"/>
-        </w:rPr>
-        <w:t xml:space="preserve">) y debe evaluar en una variable booleana si el valor se encuentra </w:t>
+        <w:t xml:space="preserve">Declarar dos constantes: MIN_KI = 500 y MAX_KI = 8500. El programa solicita el ki de un guerrero (Integer) y debe evaluar en una variable booleana si el valor se encuentra </w:t>
       </w:r>
       <w:r>
         <w:rPr>
@@ -9023,35 +7283,7 @@
         <w:rPr>
           <w:lang w:val="es-ES"/>
         </w:rPr>
-        <w:t xml:space="preserve">Declara MIN_KI y MAX_KI en la sección </w:t>
-      </w:r>
-      <w:proofErr w:type="spellStart"/>
-      <w:r>
-        <w:rPr>
-          <w:lang w:val="es-ES"/>
-        </w:rPr>
-        <w:t>const</w:t>
-      </w:r>
-      <w:proofErr w:type="spellEnd"/>
-      <w:r>
-        <w:rPr>
-          <w:lang w:val="es-ES"/>
-        </w:rPr>
-        <w:t xml:space="preserve">, antes del </w:t>
-      </w:r>
-      <w:proofErr w:type="spellStart"/>
-      <w:r>
-        <w:rPr>
-          <w:lang w:val="es-ES"/>
-        </w:rPr>
-        <w:t>var</w:t>
-      </w:r>
-      <w:proofErr w:type="spellEnd"/>
-      <w:r>
-        <w:rPr>
-          <w:lang w:val="es-ES"/>
-        </w:rPr>
-        <w:t>.</w:t>
+        <w:t>Declara MIN_KI y MAX_KI en la sección const, antes del var.</w:t>
       </w:r>
     </w:p>
     <w:p>
@@ -9069,35 +7301,7 @@
         <w:rPr>
           <w:lang w:val="es-ES"/>
         </w:rPr>
-        <w:t xml:space="preserve">Declara una variable </w:t>
-      </w:r>
-      <w:proofErr w:type="spellStart"/>
-      <w:r>
-        <w:rPr>
-          <w:lang w:val="es-ES"/>
-        </w:rPr>
-        <w:t>Integer</w:t>
-      </w:r>
-      <w:proofErr w:type="spellEnd"/>
-      <w:r>
-        <w:rPr>
-          <w:lang w:val="es-ES"/>
-        </w:rPr>
-        <w:t xml:space="preserve"> para el </w:t>
-      </w:r>
-      <w:proofErr w:type="spellStart"/>
-      <w:r>
-        <w:rPr>
-          <w:lang w:val="es-ES"/>
-        </w:rPr>
-        <w:t>ki</w:t>
-      </w:r>
-      <w:proofErr w:type="spellEnd"/>
-      <w:r>
-        <w:rPr>
-          <w:lang w:val="es-ES"/>
-        </w:rPr>
-        <w:t xml:space="preserve"> del guerrero.</w:t>
+        <w:t>Declara una variable Integer para el ki del guerrero.</w:t>
       </w:r>
     </w:p>
     <w:p>
@@ -9115,21 +7319,7 @@
         <w:rPr>
           <w:lang w:val="es-ES"/>
         </w:rPr>
-        <w:t xml:space="preserve">Lee el valor con </w:t>
-      </w:r>
-      <w:proofErr w:type="spellStart"/>
-      <w:r>
-        <w:rPr>
-          <w:lang w:val="es-ES"/>
-        </w:rPr>
-        <w:t>ReadLn</w:t>
-      </w:r>
-      <w:proofErr w:type="spellEnd"/>
-      <w:r>
-        <w:rPr>
-          <w:lang w:val="es-ES"/>
-        </w:rPr>
-        <w:t>.</w:t>
+        <w:t>Lee el valor con ReadLn.</w:t>
       </w:r>
     </w:p>
     <w:p>
@@ -9147,35 +7337,7 @@
         <w:rPr>
           <w:lang w:val="es-ES"/>
         </w:rPr>
-        <w:t xml:space="preserve">Declara una variable </w:t>
-      </w:r>
-      <w:proofErr w:type="spellStart"/>
-      <w:r>
-        <w:rPr>
-          <w:lang w:val="es-ES"/>
-        </w:rPr>
-        <w:t>Boolean</w:t>
-      </w:r>
-      <w:proofErr w:type="spellEnd"/>
-      <w:r>
-        <w:rPr>
-          <w:lang w:val="es-ES"/>
-        </w:rPr>
-        <w:t xml:space="preserve"> y asígnale el resultado de comprobar que el </w:t>
-      </w:r>
-      <w:proofErr w:type="spellStart"/>
-      <w:r>
-        <w:rPr>
-          <w:lang w:val="es-ES"/>
-        </w:rPr>
-        <w:t>ki</w:t>
-      </w:r>
-      <w:proofErr w:type="spellEnd"/>
-      <w:r>
-        <w:rPr>
-          <w:lang w:val="es-ES"/>
-        </w:rPr>
-        <w:t xml:space="preserve"> está entre MIN_KI y MAX_KI (ambos inclusive), combinando dos comparaciones con and.</w:t>
+        <w:t>Declara una variable Boolean y asígnale el resultado de comprobar que el ki está entre MIN_KI y MAX_KI (ambos inclusive), combinando dos comparaciones con and.</w:t>
       </w:r>
     </w:p>
     <w:p>
@@ -13947,7 +12109,6 @@
   <w:style w:type="character" w:default="1" w:styleId="Fuentedeprrafopredeter">
     <w:name w:val="Default Paragraph Font"/>
     <w:uiPriority w:val="1"/>
-    <w:semiHidden/>
     <w:unhideWhenUsed/>
   </w:style>
   <w:style w:type="table" w:default="1" w:styleId="Tablanormal">

</xml_diff>